<commit_message>
Zał. 5 – zmiany śledzone naniesione na najnowszą wersję pliku, poprawione odwołania do załączników
Co-Authored-By: Claude Sonnet 5.5 <noreply@anthropic.com>
Claude-Session: https://claude.ai/code/session_014oD5P5yiRwT6Zb7b7udEcr
</commit_message>
<xml_diff>
--- a/zalaczniki_zapytanie_nr1/Zalacznik_5_Wzor_umowy_zmiany_sledzone.docx
+++ b/zalaczniki_zapytanie_nr1/Zalacznik_5_Wzor_umowy_zmiany_sledzone.docx
@@ -416,12 +416,12 @@
       <w:r>
         <w:t xml:space="preserve"> (Załącznik nr </w:t>
       </w:r>
-      <w:del w:id="5001" w:author="Ewa Retajczyk" w:date="2026-10-20T14:00:09Z">
+      <w:del w:id="5001" w:author="Ewa Retajczyk" w:date="2026-10-20T14:00:54Z">
         <w:r>
           <w:delText xml:space="preserve">7</w:delText>
         </w:r>
       </w:del>
-      <w:ins w:id="5002" w:author="Ewa Retajczyk" w:date="2026-10-20T14:00:54Z">
+      <w:ins w:id="5002" w:author="Ewa Retajczyk" w:date="2026-10-20T14:01:29Z">
         <w:r>
           <w:t xml:space="preserve">1</w:t>
         </w:r>
@@ -579,12 +579,12 @@
       <w:r>
         <w:t xml:space="preserve">1. Wykonawca zobowiązuje się, za wynagrodzeniem ryczałtowym określonym w § 7, do wykonania </w:t>
       </w:r>
-      <w:del w:id="5003" w:author="Ewa Retajczyk" w:date="2026-10-20T14:01:29Z">
+      <w:del w:id="5003" w:author="Ewa Retajczyk" w:date="2026-10-20T14:01:34Z">
         <w:r>
           <w:delText xml:space="preserve">następującego</w:delText>
         </w:r>
       </w:del>
-      <w:ins w:id="5004" w:author="Ewa Retajczyk" w:date="2026-10-20T14:01:34Z">
+      <w:ins w:id="5004" w:author="Ewa Retajczyk" w:date="2026-10-20T14:01:51Z">
         <w:r>
           <w:t xml:space="preserve">dostawy</w:t>
         </w:r>
@@ -592,12 +592,12 @@
       <w:r>
         <w:t xml:space="preserve"> </w:t>
       </w:r>
-      <w:del w:id="5005" w:author="Ewa Retajczyk" w:date="2026-10-20T14:01:51Z">
+      <w:del w:id="5005" w:author="Ewa Retajczyk" w:date="2026-10-20T14:02:19Z">
         <w:r>
           <w:delText xml:space="preserve">zakresu</w:delText>
         </w:r>
       </w:del>
-      <w:ins w:id="5006" w:author="Ewa Retajczyk" w:date="2026-10-20T14:02:19Z">
+      <w:ins w:id="5006" w:author="Ewa Retajczyk" w:date="2026-10-20T14:02:21Z">
         <w:r>
           <w:t xml:space="preserve">na miejsce realizacji 6 Stacji ładowania wraz z jednostkami przekształtnikowymi, systemem OCPP, billingiem i płatnościami oraz Systemem monitorowania i zarządzania danymi dla obwodów zasilających punkty ładowania, ich montażu, konfiguracji, uruchomienia i integracji, przeprowadzenia testów, przekazania dokumentacji, przeszkolenia personelu Zamawiającego, wsparcia przy odbiorach i badaniach UDT oraz udzielenia gwarancji</w:t>
         </w:r>
@@ -605,12 +605,12 @@
       <w:r>
         <w:t xml:space="preserve"> (Przedmiot Umowy)</w:t>
       </w:r>
-      <w:del w:id="5007" w:author="Ewa Retajczyk" w:date="2026-10-20T14:02:21Z">
+      <w:del w:id="5007" w:author="Ewa Retajczyk" w:date="2026-10-20T14:02:23Z">
         <w:r>
           <w:delText xml:space="preserve">:</w:delText>
         </w:r>
       </w:del>
-      <w:ins w:id="5008" w:author="Ewa Retajczyk" w:date="2026-10-20T14:02:23Z">
+      <w:ins w:id="5008" w:author="Ewa Retajczyk" w:date="2026-10-20T14:02:25Z">
         <w:r>
           <w:t xml:space="preserve">, zgodnie z Zapytaniem ofertowym (w szczególności pkt 2–10) i Ofertą.</w:t>
         </w:r>
@@ -622,10 +622,10 @@
         <w:ind w:left="840" w:hanging="420"/>
         <w:jc w:val="both"/>
         <w:rPr>
-          <w:del w:id="5010" w:author="Ewa Retajczyk" w:date="2026-10-20T14:02:25Z"/>
-        </w:rPr>
-      </w:pPr>
-      <w:del w:id="5009" w:author="Ewa Retajczyk" w:date="2026-10-20T14:02:30Z">
+          <w:del w:id="5010" w:author="Ewa Retajczyk" w:date="2026-10-20T14:02:30Z"/>
+        </w:rPr>
+      </w:pPr>
+      <w:del w:id="5009" w:author="Ewa Retajczyk" w:date="2026-10-20T14:02:47Z">
         <w:r>
           <w:delText xml:space="preserve">a) dostawy na miejsce realizacji 6 Stacji ładowania wraz z jednostkami przekształtnikowymi (w liczbie i konfiguracji wskazanej w Ofercie), przewodami i złączami CCS2 (Combo 2) oraz niezbędnym osprzętem;</w:delText>
         </w:r>
@@ -637,10 +637,10 @@
         <w:ind w:left="840" w:hanging="420"/>
         <w:jc w:val="both"/>
         <w:rPr>
-          <w:del w:id="5012" w:author="Ewa Retajczyk" w:date="2026-10-20T14:02:47Z"/>
-        </w:rPr>
-      </w:pPr>
-      <w:del w:id="5011" w:author="Ewa Retajczyk" w:date="2026-10-20T14:02:53Z">
+          <w:del w:id="5012" w:author="Ewa Retajczyk" w:date="2026-10-20T14:02:53Z"/>
+        </w:rPr>
+      </w:pPr>
+      <w:del w:id="5011" w:author="Ewa Retajczyk" w:date="2026-10-20T14:03:13Z">
         <w:r>
           <w:delText xml:space="preserve">b) transportu, rozładunku, ustawienia urządzeń na przygotowanych podstawach, montażu, połączeń wewnętrznych, konfiguracji i uruchomienia;</w:delText>
         </w:r>
@@ -652,10 +652,10 @@
         <w:ind w:left="840" w:hanging="420"/>
         <w:jc w:val="both"/>
         <w:rPr>
-          <w:del w:id="5014" w:author="Ewa Retajczyk" w:date="2026-10-20T14:03:13Z"/>
-        </w:rPr>
-      </w:pPr>
-      <w:del w:id="5013" w:author="Ewa Retajczyk" w:date="2026-10-20T14:03:37Z">
+          <w:del w:id="5014" w:author="Ewa Retajczyk" w:date="2026-10-20T14:03:37Z"/>
+        </w:rPr>
+      </w:pPr>
+      <w:del w:id="5013" w:author="Ewa Retajczyk" w:date="2026-10-20T14:04:41Z">
         <w:r>
           <w:delText xml:space="preserve">c) dostawy, konfiguracji i uruchomienia systemu komunikacji OCPP, systemu rozliczania usług ładowania (billing), systemu płatności (płatność kartą debetową lub kredytową bez rejestracji, prezentacja ceny za kWh przed rozpoczęciem sesji) oraz osprzętu aktywnego (przełączniki, routery) i otwartych interfejsów (w szczególności OCPP i API);</w:delText>
         </w:r>
@@ -667,10 +667,10 @@
         <w:ind w:left="840" w:hanging="420"/>
         <w:jc w:val="both"/>
         <w:rPr>
-          <w:del w:id="5016" w:author="Ewa Retajczyk" w:date="2026-10-20T14:04:41Z"/>
-        </w:rPr>
-      </w:pPr>
-      <w:del w:id="5015" w:author="Ewa Retajczyk" w:date="2026-10-20T14:04:42Z">
+          <w:del w:id="5016" w:author="Ewa Retajczyk" w:date="2026-10-20T14:04:42Z"/>
+        </w:rPr>
+      </w:pPr>
+      <w:del w:id="5015" w:author="Ewa Retajczyk" w:date="2026-10-20T14:04:43Z">
         <w:r>
           <w:delText xml:space="preserve">d) dostawy, konfiguracji, uruchomienia i integracji Systemu monitorowania i zarządzania danymi dla obwodów zasilających punkty ładowania zgodnie ze Specyfikacją (Załącznik nr 1);</w:delText>
         </w:r>
@@ -682,10 +682,10 @@
         <w:ind w:left="840" w:hanging="420"/>
         <w:jc w:val="both"/>
         <w:rPr>
-          <w:del w:id="5018" w:author="Ewa Retajczyk" w:date="2026-10-20T14:04:43Z"/>
-        </w:rPr>
-      </w:pPr>
-      <w:del w:id="5017" w:author="Ewa Retajczyk" w:date="2026-10-20T14:04:57Z">
+          <w:del w:id="5018" w:author="Ewa Retajczyk" w:date="2026-10-20T14:04:57Z"/>
+        </w:rPr>
+      </w:pPr>
+      <w:del w:id="5017" w:author="Ewa Retajczyk" w:date="2026-10-20T14:05:10Z">
         <w:r>
           <w:delText xml:space="preserve">e) nadzoru nad wykonaniem podłączeń oraz kontroli przed podaniem napięcia;</w:delText>
         </w:r>
@@ -697,10 +697,10 @@
         <w:ind w:left="840" w:hanging="420"/>
         <w:jc w:val="both"/>
         <w:rPr>
-          <w:del w:id="5020" w:author="Ewa Retajczyk" w:date="2026-10-20T14:05:10Z"/>
-        </w:rPr>
-      </w:pPr>
-      <w:del w:id="5019" w:author="Ewa Retajczyk" w:date="2026-10-20T14:05:46Z">
+          <w:del w:id="5020" w:author="Ewa Retajczyk" w:date="2026-10-20T14:05:46Z"/>
+        </w:rPr>
+      </w:pPr>
+      <w:del w:id="5019" w:author="Ewa Retajczyk" w:date="2026-10-20T14:06:02Z">
         <w:r>
           <w:delText xml:space="preserve">f) przeprowadzenia testów (w tym FAT – testów odbiorczych w siedzibie producenta przed dostawą – oraz testów na miejscu), udziału w testach wspólnych i w odbiorach całej stacji;</w:delText>
         </w:r>
@@ -715,7 +715,7 @@
           <w:del w:id="5022" w:author="Ewa Retajczyk" w:date="2026-10-20T14:06:02Z"/>
         </w:rPr>
       </w:pPr>
-      <w:del w:id="5021" w:author="Ewa Retajczyk" w:date="2026-10-20T14:06:02Z">
+      <w:del w:id="5021" w:author="Ewa Retajczyk" w:date="2026-10-20T14:06:04Z">
         <w:r>
           <w:delText xml:space="preserve">g) przekazania dokumentacji wymienionej w Załączniku nr 5, w tym dokumentacji potrzebnej wykonawcom Zamówienia nr 2 i nr 3 oraz dokumentacji do badań UDT (3 komplety + wersja elektroniczna);</w:delText>
         </w:r>
@@ -727,10 +727,10 @@
         <w:ind w:left="840" w:hanging="420"/>
         <w:jc w:val="both"/>
         <w:rPr>
-          <w:del w:id="5024" w:author="Ewa Retajczyk" w:date="2026-10-20T14:06:04Z"/>
-        </w:rPr>
-      </w:pPr>
-      <w:del w:id="5023" w:author="Ewa Retajczyk" w:date="2026-10-20T14:06:43Z">
+          <w:del w:id="5024" w:author="Ewa Retajczyk" w:date="2026-10-20T14:06:43Z"/>
+        </w:rPr>
+      </w:pPr>
+      <w:del w:id="5023" w:author="Ewa Retajczyk" w:date="2026-10-20T14:07:02Z">
         <w:r>
           <w:delText xml:space="preserve">h) szkolenia personelu Zamawiającego;</w:delText>
         </w:r>
@@ -742,10 +742,10 @@
         <w:ind w:left="840" w:hanging="420"/>
         <w:jc w:val="both"/>
         <w:rPr>
-          <w:del w:id="5026" w:author="Ewa Retajczyk" w:date="2026-10-20T14:07:02Z"/>
-        </w:rPr>
-      </w:pPr>
-      <w:del w:id="5025" w:author="Ewa Retajczyk" w:date="2026-10-20T14:07:13Z">
+          <w:del w:id="5026" w:author="Ewa Retajczyk" w:date="2026-10-20T14:07:13Z"/>
+        </w:rPr>
+      </w:pPr>
+      <w:del w:id="5025" w:author="Ewa Retajczyk" w:date="2026-10-20T14:08:14Z">
         <w:r>
           <w:delText xml:space="preserve">i) wsparcia technicznego podczas odbiorów oraz badań UDT, usunięcia usterek własnego zakresu oraz udzielenia gwarancji i świadczenia serwisu gwarancyjnego.</w:delText>
         </w:r>
@@ -760,7 +760,7 @@
       <w:r>
         <w:t xml:space="preserve">2. Szczegółowy opis Przedmiotu Umowy zawierają</w:t>
       </w:r>
-      <w:del w:id="5027" w:author="Ewa Retajczyk" w:date="2026-10-20T14:08:14Z">
+      <w:del w:id="5027" w:author="Ewa Retajczyk" w:date="2026-10-20T14:08:55Z">
         <w:r>
           <w:delText xml:space="preserve">: Specyfikacja i miejsce realizacji (Załącznik nr 1), Szczegółowy zakres obowiązków Wykonawcy i granice odpowiedzialności (Załącznik nr 2),</w:delText>
         </w:r>
@@ -768,12 +768,12 @@
       <w:r>
         <w:t xml:space="preserve"> Zapytanie ofertowe oraz Oferta. W razie rozbieżności stosuje się kolejno: Umowę wraz z załącznikami nr 1–</w:t>
       </w:r>
-      <w:del w:id="5028" w:author="Ewa Retajczyk" w:date="2026-10-20T14:08:55Z">
+      <w:del w:id="5028" w:author="Ewa Retajczyk" w:date="2026-10-20T14:09:16Z">
         <w:r>
           <w:delText xml:space="preserve">6</w:delText>
         </w:r>
       </w:del>
-      <w:ins w:id="5029" w:author="Ewa Retajczyk" w:date="2026-10-20T14:09:16Z">
+      <w:ins w:id="5029" w:author="Ewa Retajczyk" w:date="2026-10-20T14:09:20Z">
         <w:r>
           <w:t xml:space="preserve">4</w:t>
         </w:r>
@@ -791,12 +791,12 @@
       <w:r>
         <w:t xml:space="preserve">3. Przedmiot Umowy nie obejmuje: </w:t>
       </w:r>
-      <w:del w:id="5030" w:author="Ewa Retajczyk" w:date="2026-10-20T14:09:20Z">
+      <w:del w:id="5030" w:author="Ewa Retajczyk" w:date="2026-10-20T14:09:45Z">
         <w:r>
           <w:delText xml:space="preserve">roboty</w:delText>
         </w:r>
       </w:del>
-      <w:ins w:id="5031" w:author="Ewa Retajczyk" w:date="2026-10-20T14:09:45Z">
+      <w:ins w:id="5031" w:author="Ewa Retajczyk" w:date="2026-10-20T14:09:54Z">
         <w:r>
           <w:t xml:space="preserve">robót</w:t>
         </w:r>
@@ -893,12 +893,12 @@
       <w:r>
         <w:t xml:space="preserve">e) </w:t>
       </w:r>
-      <w:del w:id="5032" w:author="Ewa Retajczyk" w:date="2026-10-20T14:09:54Z">
+      <w:del w:id="5032" w:author="Ewa Retajczyk" w:date="2026-10-20T14:10:30Z">
         <w:r>
           <w:delText xml:space="preserve">oferowane</w:delText>
         </w:r>
       </w:del>
-      <w:ins w:id="5033" w:author="Ewa Retajczyk" w:date="2026-10-20T14:10:30Z">
+      <w:ins w:id="5033" w:author="Ewa Retajczyk" w:date="2026-10-20T14:11:08Z">
         <w:r>
           <w:t xml:space="preserve">przedsięwzięcie</w:t>
         </w:r>
@@ -906,12 +906,12 @@
       <w:r>
         <w:t xml:space="preserve"> </w:t>
       </w:r>
-      <w:del w:id="5034" w:author="Ewa Retajczyk" w:date="2026-10-20T14:11:08Z">
+      <w:del w:id="5034" w:author="Ewa Retajczyk" w:date="2026-10-20T14:11:23Z">
         <w:r>
           <w:delText xml:space="preserve">rozwiązanie</w:delText>
         </w:r>
       </w:del>
-      <w:ins w:id="5035" w:author="Ewa Retajczyk" w:date="2026-10-20T14:11:23Z">
+      <w:ins w:id="5035" w:author="Ewa Retajczyk" w:date="2026-10-20T14:11:31Z">
         <w:r>
           <w:t xml:space="preserve">zostanie</w:t>
         </w:r>
@@ -919,12 +919,12 @@
       <w:r>
         <w:t xml:space="preserve"> </w:t>
       </w:r>
-      <w:del w:id="5036" w:author="Ewa Retajczyk" w:date="2026-10-20T14:11:31Z">
+      <w:del w:id="5036" w:author="Ewa Retajczyk" w:date="2026-10-20T14:11:35Z">
         <w:r>
           <w:delText xml:space="preserve">jest</w:delText>
         </w:r>
       </w:del>
-      <w:ins w:id="5037" w:author="Ewa Retajczyk" w:date="2026-10-20T14:11:35Z">
+      <w:ins w:id="5037" w:author="Ewa Retajczyk" w:date="2026-10-20T14:11:59Z">
         <w:r>
           <w:t xml:space="preserve">zrealizowane</w:t>
         </w:r>
@@ -932,12 +932,12 @@
       <w:r>
         <w:t xml:space="preserve"> </w:t>
       </w:r>
-      <w:del w:id="5038" w:author="Ewa Retajczyk" w:date="2026-10-20T14:11:59Z">
+      <w:del w:id="5038" w:author="Ewa Retajczyk" w:date="2026-10-20T14:12:20Z">
         <w:r>
           <w:delText xml:space="preserve">zgodne</w:delText>
         </w:r>
       </w:del>
-      <w:ins w:id="5039" w:author="Ewa Retajczyk" w:date="2026-10-20T14:12:20Z">
+      <w:ins w:id="5039" w:author="Ewa Retajczyk" w:date="2026-10-20T14:12:32Z">
         <w:r>
           <w:t xml:space="preserve">zgodnie</w:t>
         </w:r>
@@ -1037,7 +1037,7 @@
       <w:r>
         <w:t xml:space="preserve">a) wykonania Przedmiotu Umowy zgodnie z Umową, </w:t>
       </w:r>
-      <w:ins w:id="5040" w:author="Ewa Retajczyk" w:date="2026-10-20T14:12:32Z">
+      <w:ins w:id="5040" w:author="Ewa Retajczyk" w:date="2026-10-20T14:12:33Z">
         <w:r>
           <w:t xml:space="preserve">Zapytaniem ofertowym (w tym </w:t>
         </w:r>
@@ -1045,7 +1045,7 @@
       <w:r>
         <w:t xml:space="preserve">Specyfikacją</w:t>
       </w:r>
-      <w:ins w:id="5041" w:author="Ewa Retajczyk" w:date="2026-10-20T14:12:33Z">
+      <w:ins w:id="5041" w:author="Ewa Retajczyk" w:date="2026-10-20T14:12:57Z">
         <w:r>
           <w:t xml:space="preserve"> – załącznik nr 2 do Zapytania ofertowego)</w:t>
         </w:r>
@@ -1364,7 +1364,7 @@
       <w:r>
         <w:t xml:space="preserve">3. Strony przyjmują, że termin zakończenia całej Inwestycji wynika z Umowy o dofinansowanie (31.12.2026 r.)</w:t>
       </w:r>
-      <w:ins w:id="5042" w:author="Ewa Retajczyk" w:date="2026-10-20T14:12:57Z">
+      <w:ins w:id="5042" w:author="Ewa Retajczyk" w:date="2026-10-20T14:14:21Z">
         <w:r>
           <w:t xml:space="preserve">,</w:t>
         </w:r>
@@ -1372,12 +1372,12 @@
       <w:r>
         <w:t xml:space="preserve"> </w:t>
       </w:r>
-      <w:del w:id="5043" w:author="Ewa Retajczyk" w:date="2026-10-20T14:14:21Z">
+      <w:del w:id="5043" w:author="Ewa Retajczyk" w:date="2026-10-20T14:14:37Z">
         <w:r>
           <w:delText xml:space="preserve">oraz</w:delText>
         </w:r>
       </w:del>
-      <w:ins w:id="5044" w:author="Ewa Retajczyk" w:date="2026-10-20T14:14:37Z">
+      <w:ins w:id="5044" w:author="Ewa Retajczyk" w:date="2026-10-20T14:14:53Z">
         <w:r>
           <w:t xml:space="preserve">a</w:t>
         </w:r>
@@ -1385,12 +1385,12 @@
       <w:r>
         <w:t xml:space="preserve"> </w:t>
       </w:r>
-      <w:del w:id="5045" w:author="Ewa Retajczyk" w:date="2026-10-20T14:14:53Z">
+      <w:del w:id="5045" w:author="Ewa Retajczyk" w:date="2026-10-20T14:15:25Z">
         <w:r>
           <w:delText xml:space="preserve">że</w:delText>
         </w:r>
       </w:del>
-      <w:ins w:id="5046" w:author="Ewa Retajczyk" w:date="2026-10-20T14:15:25Z">
+      <w:ins w:id="5046" w:author="Ewa Retajczyk" w:date="2026-10-20T14:15:38Z">
         <w:r>
           <w:t xml:space="preserve">datą</w:t>
         </w:r>
@@ -1398,12 +1398,12 @@
       <w:r>
         <w:t xml:space="preserve"> </w:t>
       </w:r>
-      <w:del w:id="5047" w:author="Ewa Retajczyk" w:date="2026-10-20T14:15:38Z">
+      <w:del w:id="5047" w:author="Ewa Retajczyk" w:date="2026-10-20T14:15:52Z">
         <w:r>
           <w:delText xml:space="preserve">badania</w:delText>
         </w:r>
       </w:del>
-      <w:ins w:id="5048" w:author="Ewa Retajczyk" w:date="2026-10-20T14:15:52Z">
+      <w:ins w:id="5048" w:author="Ewa Retajczyk" w:date="2026-10-20T14:16:36Z">
         <w:r>
           <w:t xml:space="preserve">zakończenia realizacji Inwestycji jest – zgodnie z Umową o dofinansowanie – data ostatniego protokołu</w:t>
         </w:r>
@@ -1411,12 +1411,12 @@
       <w:r>
         <w:t xml:space="preserve"> UDT </w:t>
       </w:r>
-      <w:del w:id="5049" w:author="Ewa Retajczyk" w:date="2026-10-20T14:16:36Z">
+      <w:del w:id="5049" w:author="Ewa Retajczyk" w:date="2026-10-20T14:16:43Z">
         <w:r>
           <w:delText xml:space="preserve">i</w:delText>
         </w:r>
       </w:del>
-      <w:ins w:id="5050" w:author="Ewa Retajczyk" w:date="2026-10-20T14:16:43Z">
+      <w:ins w:id="5050" w:author="Ewa Retajczyk" w:date="2026-10-20T14:16:58Z">
         <w:r>
           <w:t xml:space="preserve">dopuszczającego</w:t>
         </w:r>
@@ -1424,12 +1424,12 @@
       <w:r>
         <w:t xml:space="preserve"> </w:t>
       </w:r>
-      <w:del w:id="5051" w:author="Ewa Retajczyk" w:date="2026-10-20T14:16:58Z">
+      <w:del w:id="5051" w:author="Ewa Retajczyk" w:date="2026-10-20T14:17:06Z">
         <w:r>
           <w:delText xml:space="preserve">uzyskanie dopuszczenia Stacji</w:delText>
         </w:r>
       </w:del>
-      <w:ins w:id="5052" w:author="Ewa Retajczyk" w:date="2026-10-20T14:17:06Z">
+      <w:ins w:id="5052" w:author="Ewa Retajczyk" w:date="2026-10-20T14:17:20Z">
         <w:r>
           <w:t xml:space="preserve">Stację</w:t>
         </w:r>
@@ -1437,7 +1437,7 @@
       <w:r>
         <w:t xml:space="preserve"> ładowania do eksploatacji</w:t>
       </w:r>
-      <w:del w:id="5053" w:author="Ewa Retajczyk" w:date="2026-10-20T14:17:20Z">
+      <w:del w:id="5053" w:author="Ewa Retajczyk" w:date="2026-10-20T14:17:58Z">
         <w:r>
           <w:delText xml:space="preserve"> mogą nastąpić w terminie do 60 dni od zakończenia realizacji Inwestycji</w:delText>
         </w:r>
@@ -1448,7 +1448,7 @@
       <w:r>
         <w:t xml:space="preserve">Wykonawca zapewnia swój udział w badaniach UDT i usuwanie usterek </w:t>
       </w:r>
-      <w:del w:id="5054" w:author="Ewa Retajczyk" w:date="2026-10-20T14:17:58Z">
+      <w:del w:id="5054" w:author="Ewa Retajczyk" w:date="2026-10-20T14:18:07Z">
         <w:r>
           <w:delText xml:space="preserve">również </w:delText>
         </w:r>
@@ -1456,12 +1456,12 @@
       <w:r>
         <w:t xml:space="preserve">w </w:t>
       </w:r>
-      <w:del w:id="5055" w:author="Ewa Retajczyk" w:date="2026-10-20T14:18:07Z">
+      <w:del w:id="5055" w:author="Ewa Retajczyk" w:date="2026-10-20T14:18:14Z">
         <w:r>
           <w:delText xml:space="preserve">tym</w:delText>
         </w:r>
       </w:del>
-      <w:ins w:id="5056" w:author="Ewa Retajczyk" w:date="2026-10-20T14:18:14Z">
+      <w:ins w:id="5056" w:author="Ewa Retajczyk" w:date="2026-10-20T14:18:28Z">
         <w:r>
           <w:t xml:space="preserve">terminie</w:t>
         </w:r>
@@ -1469,12 +1469,12 @@
       <w:r>
         <w:t xml:space="preserve"> </w:t>
       </w:r>
-      <w:del w:id="5057" w:author="Ewa Retajczyk" w:date="2026-10-20T14:18:28Z">
+      <w:del w:id="5057" w:author="Ewa Retajczyk" w:date="2026-10-20T14:18:57Z">
         <w:r>
           <w:delText xml:space="preserve">okresie</w:delText>
         </w:r>
       </w:del>
-      <w:ins w:id="5058" w:author="Ewa Retajczyk" w:date="2026-10-20T14:18:57Z">
+      <w:ins w:id="5058" w:author="Ewa Retajczyk" w:date="2026-10-20T14:19:23Z">
         <w:r>
           <w:t xml:space="preserve">umożliwiającym uzyskanie dopuszczenia wszystkich Stacji ładowania do eksploatacji nie później niż do dnia 31</w:t>
         </w:r>
@@ -1482,7 +1482,7 @@
       <w:r>
         <w:t xml:space="preserve">.</w:t>
       </w:r>
-      <w:ins w:id="5059" w:author="Ewa Retajczyk" w:date="2026-10-20T14:19:23Z">
+      <w:ins w:id="5059" w:author="Ewa Retajczyk" w:date="2026-10-20T14:19:33Z">
         <w:r>
           <w:t xml:space="preserve">12.2026 r. (albo do terminu wynikającego z aneksu do Umowy o dofinansowanie). Termin 60 dni od zakończenia realizacji Inwestycji dotyczy przedłożenia dokumentów rozliczeniowych do NFOŚiGW i nie przedłuża terminu badań UDT.</w:t>
         </w:r>
@@ -1578,16 +1578,13 @@
         <w:t>[……]</w:t>
       </w:r>
       <w:r>
-        <w:t xml:space="preserve">), powiększone o podatek VAT w stawce </w:t>
-      </w:r>
-      <w:r>
-        <w:rPr>
-          <w:highlight w:val="yellow"/>
-        </w:rPr>
-        <w:t>[23]</w:t>
-      </w:r>
-      <w:r>
-        <w:t xml:space="preserve">%, tj. </w:t>
+        <w:t>), powiększone o podatek VAT</w:t>
+      </w:r>
+      <w:r>
+        <w:t>,</w:t>
+      </w:r>
+      <w:r>
+        <w:t xml:space="preserve"> tj. </w:t>
       </w:r>
       <w:r>
         <w:rPr>
@@ -1704,12 +1701,12 @@
       <w:r>
         <w:t xml:space="preserve"> dni od </w:t>
       </w:r>
-      <w:del w:id="5060" w:author="Ewa Retajczyk" w:date="2026-10-20T14:19:33Z">
+      <w:del w:id="5060" w:author="Ewa Retajczyk" w:date="2026-10-20T14:20:17Z">
         <w:r>
           <w:delText xml:space="preserve">doręczenia</w:delText>
         </w:r>
       </w:del>
-      <w:ins w:id="5061" w:author="Ewa Retajczyk" w:date="2026-10-20T14:20:17Z">
+      <w:ins w:id="5061" w:author="Ewa Retajczyk" w:date="2026-10-20T14:21:00Z">
         <w:r>
           <w:t xml:space="preserve">dnia dostawy, na podstawie</w:t>
         </w:r>
@@ -1717,21 +1714,13 @@
       <w:r>
         <w:t xml:space="preserve"> faktury</w:t>
       </w:r>
-      <w:ins w:id="5062" w:author="Ewa Retajczyk" w:date="2026-10-20T14:21:00Z">
+      <w:ins w:id="5062" w:author="Ewa Retajczyk" w:date="2026-10-20T14:21:26Z">
         <w:r>
           <w:t xml:space="preserve"> VAT</w:t>
         </w:r>
       </w:ins>
       <w:r>
-        <w:t xml:space="preserve"> wystawionej po podpisaniu protokołu odbioru dostawy, </w:t>
-      </w:r>
-      <w:del w:id="5063" w:author="Ewa Retajczyk" w:date="2026-10-20T14:21:26Z">
-        <w:r>
-          <w:delText xml:space="preserve">nie później niż w terminie dostawy określonym w § 6 ust. 1, </w:delText>
-        </w:r>
-      </w:del>
-      <w:r>
-        <w:t xml:space="preserve">z zaliczeniem zaliczki;</w:t>
+        <w:t xml:space="preserve"> wystawionej po podpisaniu protokołu odbioru dostawy;</w:t>
       </w:r>
     </w:p>
     <w:p>
@@ -1807,12 +1796,12 @@
       <w:r>
         <w:t xml:space="preserve"> dni od podpisania protokołu odbioru końcowego (§ 8 ust. </w:t>
       </w:r>
-      <w:del w:id="5064" w:author="Ewa Retajczyk" w:date="2026-10-20T14:21:54Z">
+      <w:del w:id="5063" w:author="Ewa Retajczyk" w:date="2026-10-20T14:21:54Z">
         <w:r>
           <w:delText xml:space="preserve">7</w:delText>
         </w:r>
       </w:del>
-      <w:ins w:id="5065" w:author="Ewa Retajczyk" w:date="2026-10-20T14:21:58Z">
+      <w:ins w:id="5064" w:author="Ewa Retajczyk" w:date="2026-10-20T14:21:58Z">
         <w:r>
           <w:t xml:space="preserve">5</w:t>
         </w:r>
@@ -1959,12 +1948,12 @@
       <w:r>
         <w:t xml:space="preserve">Załącznika nr </w:t>
       </w:r>
-      <w:del w:id="5066" w:author="Ewa Retajczyk" w:date="2026-10-20T14:22:55Z">
+      <w:del w:id="5065" w:author="Ewa Retajczyk" w:date="2026-10-20T14:22:55Z">
         <w:r>
           <w:delText xml:space="preserve">5</w:delText>
         </w:r>
       </w:del>
-      <w:ins w:id="5067" w:author="Ewa Retajczyk" w:date="2026-10-20T14:22:58Z">
+      <w:ins w:id="5066" w:author="Ewa Retajczyk" w:date="2026-10-20T14:22:58Z">
         <w:r>
           <w:t xml:space="preserve">3</w:t>
         </w:r>
@@ -1980,12 +1969,12 @@
       <w:r>
         <w:t xml:space="preserve">). Z odbioru sporządza się protokół odbioru dostawy (Załącznik nr </w:t>
       </w:r>
-      <w:del w:id="5068" w:author="Ewa Retajczyk" w:date="2026-10-20T14:23:05Z">
+      <w:del w:id="5067" w:author="Ewa Retajczyk" w:date="2026-10-20T14:23:05Z">
         <w:r>
           <w:delText xml:space="preserve">4</w:delText>
         </w:r>
       </w:del>
-      <w:ins w:id="5069" w:author="Ewa Retajczyk" w:date="2026-10-20T14:23:11Z">
+      <w:ins w:id="5068" w:author="Ewa Retajczyk" w:date="2026-10-20T14:23:11Z">
         <w:r>
           <w:t xml:space="preserve">2</w:t>
         </w:r>
@@ -2009,29 +1998,26 @@
         <w:t>stacji</w:t>
       </w:r>
       <w:r>
-        <w:t xml:space="preserve">: po zakończeniu montażu, konfiguracji i uruchomienia Wykonawca zgłasza gotowość do odbioru. Odbiór obejmuje m.in.: kompletność dostawy, numery seryjne, dokumentację, testy bezpieczeństwa, wyłączenia awaryjnego, ładowania każdego punktu, komunikacji i OCPP, zdalnego monitoringu, systemu zarządzania, płatności, prezentacji ceny, przekazywania danych, funkcjonalności przewodów rezerwowych (jeśli zaoferowano), pracy równoczesnej punktów, współpracy z systemem ograniczania mocy AC, Systemu monitorowania, udział w teście wspólnym. Wykonawca przedstawia </w:t>
-      </w:r>
+        <w:t xml:space="preserve">: po zakończeniu montażu, konfiguracji i uruchomienia Wykonawca zgłasza gotowość do odbioru. Odbiór obejmuje m.in.: kompletność dostawy, numery seryjne, dokumentację, testy bezpieczeństwa, wyłączenia awaryjnego, ładowania każdego punktu, komunikacji i OCPP, zdalnego monitoringu, systemu zarządzania, płatności, prezentacji ceny, przekazywania danych, funkcjonalności przewodów rezerwowych (jeśli zaoferowano), pracy równoczesnej punktów, współpracy z systemem ograniczania mocy AC, Systemu monitorowania, udział w teście wspólnym. Wykonawca przedstawia wyniki testów. Zamawiający dokonuje odbioru w ciągu </w:t>
+      </w:r>
+      <w:r>
+        <w:rPr>
+          <w:highlight w:val="yellow"/>
+        </w:rPr>
+        <w:t>5 dni roboczych</w:t>
+      </w:r>
+      <w:r>
+        <w:t xml:space="preserve"> od zgłoszenia i sporządza protokół odbioru technologii (Załącznik nr 4).</w:t>
+      </w:r>
+    </w:p>
+    <w:p>
+      <w:pPr>
+        <w:spacing w:after="100" w:line="268" w:lineRule="auto"/>
+        <w:ind w:left="420" w:hanging="420"/>
+        <w:jc w:val="both"/>
+      </w:pPr>
       <w:r>
         <w:lastRenderedPageBreak/>
-        <w:t xml:space="preserve">wyniki testów. Zamawiający dokonuje odbioru w ciągu </w:t>
-      </w:r>
-      <w:r>
-        <w:rPr>
-          <w:highlight w:val="yellow"/>
-        </w:rPr>
-        <w:t>5 dni roboczych</w:t>
-      </w:r>
-      <w:r>
-        <w:t xml:space="preserve"> od zgłoszenia i sporządza protokół odbioru technologii (Załącznik nr 4).</w:t>
-      </w:r>
-    </w:p>
-    <w:p>
-      <w:pPr>
-        <w:spacing w:after="100" w:line="268" w:lineRule="auto"/>
-        <w:ind w:left="420" w:hanging="420"/>
-        <w:jc w:val="both"/>
-      </w:pPr>
-      <w:r>
         <w:t>3. W przypadku wad istotnych (uniemożliwiających użytkowanie, badania UDT lub osiągnięcie efektu rzeczowego) Zamawiający odmawia odbioru i wyznacza termin usunięcia wad; przy wadach nieistotnych odbiór następuje z wyznaczeniem terminu ich usunięcia. Wykonawca usuwa wady na własny koszt i zgłasza gotowość do ponownego odbioru. Wykonawca nie jest uprawniony do jednostronnego podpisania protokołu.</w:t>
       </w:r>
     </w:p>
@@ -2054,12 +2040,12 @@
       <w:r>
         <w:t xml:space="preserve">5. Odbiór końcowy następuje po zakończeniu testów wspólnych, usunięciu wad i przekazaniu kompletu dokumentów z Załącznika nr </w:t>
       </w:r>
-      <w:del w:id="5070" w:author="Ewa Retajczyk" w:date="2026-10-20T14:23:15Z">
+      <w:del w:id="5069" w:author="Ewa Retajczyk" w:date="2026-10-20T14:23:15Z">
         <w:r>
           <w:delText xml:space="preserve">5</w:delText>
         </w:r>
       </w:del>
-      <w:ins w:id="5071" w:author="Ewa Retajczyk" w:date="2026-10-20T14:23:25Z">
+      <w:ins w:id="5070" w:author="Ewa Retajczyk" w:date="2026-10-20T14:23:25Z">
         <w:r>
           <w:t xml:space="preserve">3</w:t>
         </w:r>
@@ -2067,12 +2053,12 @@
       <w:r>
         <w:t xml:space="preserve">. Zamawiający sporządza protokół odbioru końcowego (Załącznik nr </w:t>
       </w:r>
-      <w:del w:id="5072" w:author="Ewa Retajczyk" w:date="2026-10-20T14:23:33Z">
+      <w:del w:id="5071" w:author="Ewa Retajczyk" w:date="2026-10-20T14:23:33Z">
         <w:r>
           <w:delText xml:space="preserve">4</w:delText>
         </w:r>
       </w:del>
-      <w:ins w:id="5073" w:author="Ewa Retajczyk" w:date="2026-10-20T14:23:46Z">
+      <w:ins w:id="5072" w:author="Ewa Retajczyk" w:date="2026-10-20T14:23:46Z">
         <w:r>
           <w:t xml:space="preserve">2</w:t>
         </w:r>
@@ -2126,12 +2112,12 @@
       <w:r>
         <w:t xml:space="preserve">1. Wykonawca przekaże dokumentację w zakresie i terminach wymienionych w Załączniku nr </w:t>
       </w:r>
-      <w:del w:id="5074" w:author="Ewa Retajczyk" w:date="2026-10-20T14:25:05Z">
+      <w:del w:id="5073" w:author="Ewa Retajczyk" w:date="2026-10-20T14:25:05Z">
         <w:r>
           <w:delText xml:space="preserve">5</w:delText>
         </w:r>
       </w:del>
-      <w:ins w:id="5075" w:author="Ewa Retajczyk" w:date="2026-10-20T14:25:33Z">
+      <w:ins w:id="5074" w:author="Ewa Retajczyk" w:date="2026-10-20T14:25:33Z">
         <w:r>
           <w:t xml:space="preserve">3</w:t>
         </w:r>
@@ -2246,11 +2232,11 @@
         <w:t>Prawa autorskie.</w:t>
       </w:r>
       <w:r>
-        <w:t xml:space="preserve"> Wykonawca przenosi na Zamawiającego, z chwilą ich powstania, autorskie prawa majątkowe do utworów powstałych w wykonaniu Umowy (w szczególności dokumentacji, schematów, konfiguracji i opracowań wykonanych na zamówienie) na wszystkich polach eksploatacji niezbędnych do </w:t>
+        <w:t xml:space="preserve"> Wykonawca przenosi na Zamawiającego, z chwilą ich powstania, autorskie prawa majątkowe do utworów powstałych w wykonaniu Umowy (w szczególności dokumentacji, schematów, konfiguracji i opracowań wykonanych na zamówienie) na wszystkich polach eksploatacji niezbędnych do korzystania z nich przez Zamawiającego, w tym utrwalania, zwielokrotniania, wprowadzania do pamięci komputera i sieci, modyfikowania i sporządzania opracowań, bez dodatkowego wynagrodzenia. </w:t>
       </w:r>
       <w:r>
         <w:lastRenderedPageBreak/>
-        <w:t>korzystania z nich przez Zamawiającego, w tym utrwalania, zwielokrotniania, wprowadzania do pamięci komputera i sieci, modyfikowania i sporządzania opracowań, bez dodatkowego wynagrodzenia. Wykonawca zapewnia, że prawa te nie będą obciążone prawami osób trzecich, a osoby uprawnione z osobistych praw autorskich nie będą ich wykonywać wobec Zamawiającego i jego następców prawnych. W odniesieniu do oprogramowania standardowego Wykonawca udziela Zamawiającemu niewyłącznej licencji na okres co najmniej okresu gwarancji, a w razie wymogów programu – trwałości inwestycji (5 lat), z prawem do aktualizacji; zapewnia również możliwość zmiany platformy operatorskiej bez wymiany urządzeń.</w:t>
+        <w:t>Wykonawca zapewnia, że prawa te nie będą obciążone prawami osób trzecich, a osoby uprawnione z osobistych praw autorskich nie będą ich wykonywać wobec Zamawiającego i jego następców prawnych. W odniesieniu do oprogramowania standardowego Wykonawca udziela Zamawiającemu niewyłącznej licencji na okres co najmniej okresu gwarancji, a w razie wymogów programu – trwałości inwestycji (5 lat), z prawem do aktualizacji; zapewnia również możliwość zmiany platformy operatorskiej bez wymiany urządzeń.</w:t>
       </w:r>
     </w:p>
     <w:p>
@@ -2272,12 +2258,12 @@
       <w:r>
         <w:t xml:space="preserve"> Wykonawca dostarczy dokumenty niezbędne do rozliczenia dotacji i potwierdzenia efektu rzeczowego (w tym dokumenty z Załącznika nr </w:t>
       </w:r>
-      <w:del w:id="5076" w:author="Ewa Retajczyk" w:date="2026-10-20T14:25:53Z">
+      <w:del w:id="5075" w:author="Ewa Retajczyk" w:date="2026-10-20T14:25:53Z">
         <w:r>
           <w:delText xml:space="preserve">5</w:delText>
         </w:r>
       </w:del>
-      <w:ins w:id="5077" w:author="Ewa Retajczyk" w:date="2026-10-20T14:26:02Z">
+      <w:ins w:id="5076" w:author="Ewa Retajczyk" w:date="2026-10-20T14:26:02Z">
         <w:r>
           <w:t xml:space="preserve">3</w:t>
         </w:r>
@@ -2458,20 +2444,17 @@
         <w:t>[…]</w:t>
       </w:r>
       <w:r>
-        <w:t xml:space="preserve"> lat, przeglądy okresowe zgodnie z zaleceniami </w:t>
-      </w:r>
+        <w:t xml:space="preserve"> lat, przeglądy okresowe zgodnie z zaleceniami producenta, aktualizacje oprogramowania i warunki utrzymania systemu po zakończeniu gwarancji. W razie niezgodności z Ofertą stosuje się wartości korzystniejsze dla Zamawiającego.</w:t>
+      </w:r>
+    </w:p>
+    <w:p>
+      <w:pPr>
+        <w:spacing w:after="100" w:line="268" w:lineRule="auto"/>
+        <w:ind w:left="420" w:hanging="420"/>
+        <w:jc w:val="both"/>
+      </w:pPr>
       <w:r>
         <w:lastRenderedPageBreak/>
-        <w:t>producenta, aktualizacje oprogramowania i warunki utrzymania systemu po zakończeniu gwarancji. W razie niezgodności z Ofertą stosuje się wartości korzystniejsze dla Zamawiającego.</w:t>
-      </w:r>
-    </w:p>
-    <w:p>
-      <w:pPr>
-        <w:spacing w:after="100" w:line="268" w:lineRule="auto"/>
-        <w:ind w:left="420" w:hanging="420"/>
-        <w:jc w:val="both"/>
-      </w:pPr>
-      <w:r>
         <w:t xml:space="preserve">4. Zgłoszenia wad Zamawiający przekazuje e-mailem na adres </w:t>
       </w:r>
       <w:r>
@@ -2617,12 +2600,12 @@
       <w:r>
         <w:t xml:space="preserve">d) za zwłokę w przekazaniu danych interfejsowych, harmonogramu lub dokumentów z Załącznika nr </w:t>
       </w:r>
-      <w:del w:id="5078" w:author="Ewa Retajczyk" w:date="2026-10-20T14:26:33Z">
+      <w:del w:id="5077" w:author="Ewa Retajczyk" w:date="2026-10-20T14:26:33Z">
         <w:r>
           <w:delText xml:space="preserve">5</w:delText>
         </w:r>
       </w:del>
-      <w:ins w:id="5079" w:author="Ewa Retajczyk" w:date="2026-10-20T14:26:43Z">
+      <w:ins w:id="5078" w:author="Ewa Retajczyk" w:date="2026-10-20T14:26:43Z">
         <w:r>
           <w:t xml:space="preserve">3</w:t>
         </w:r>
@@ -2750,7 +2733,6 @@
         <w:jc w:val="both"/>
       </w:pPr>
       <w:r>
-        <w:lastRenderedPageBreak/>
         <w:t xml:space="preserve">a) Wykonawca opóźnia się z dostawą lub wykonaniem Przedmiotu Umowy o więcej niż </w:t>
       </w:r>
       <w:r>
@@ -2770,6 +2752,7 @@
         <w:jc w:val="both"/>
       </w:pPr>
       <w:r>
+        <w:lastRenderedPageBreak/>
         <w:t>b) Wykonawca wykonuje Umowę w sposób niezgodny z Umową lub Umową o dofinansowanie i nie usuwa naruszeń w terminie wyznaczonym przez Zamawiającego, nie krótszym niż 5 dni;</w:t>
       </w:r>
     </w:p>
@@ -2942,7 +2925,6 @@
         <w:jc w:val="both"/>
       </w:pPr>
       <w:r>
-        <w:lastRenderedPageBreak/>
         <w:t>b) przedłużenia terminów wskutek opóźnień niezależnych od Wykonawcy, w szczególności wynikających z realizacji Zamówienia nr 2 lub nr 3, działań operatora sieci dystrybucyjnej, organów administracji lub UDT, oraz siły wyższej – o czas trwania tych okoliczności;</w:t>
       </w:r>
     </w:p>
@@ -2953,6 +2935,7 @@
         <w:jc w:val="both"/>
       </w:pPr>
       <w:r>
+        <w:lastRenderedPageBreak/>
         <w:t>c) zmiany oferowanych urządzeń na urządzenia o parametrach nie gorszych (w szczególności w razie wycofania modelu z produkcji), bez zwiększenia wynagrodzenia, za uprzednią pisemną zgodą Zamawiającego, przy zachowaniu warunku z pkt 12 ppkt 2 Zapytania ofertowego;</w:t>
       </w:r>
     </w:p>
@@ -3151,12 +3134,6 @@
         <w:gridCol w:w="4819"/>
       </w:tblGrid>
       <w:tr>
-        <w:tblPrEx>
-          <w:tblCellMar>
-            <w:top w:w="0" w:type="dxa"/>
-            <w:bottom w:w="0" w:type="dxa"/>
-          </w:tblCellMar>
-        </w:tblPrEx>
         <w:tc>
           <w:tcPr>
             <w:tcW w:w="4819" w:type="dxa"/>
@@ -3186,6 +3163,7 @@
                 <w:sz w:val="20"/>
                 <w:szCs w:val="20"/>
               </w:rPr>
+              <w:lastRenderedPageBreak/>
               <w:t>Wykonawca</w:t>
             </w:r>
           </w:p>
@@ -3219,6 +3197,7 @@
                 <w:sz w:val="20"/>
                 <w:szCs w:val="20"/>
               </w:rPr>
+              <w:lastRenderedPageBreak/>
               <w:t>Zamawiający</w:t>
             </w:r>
           </w:p>
@@ -3235,6 +3214,7 @@
           <w:b/>
           <w:bCs/>
         </w:rPr>
+        <w:lastRenderedPageBreak/>
         <w:t>Załączniki:</w:t>
       </w:r>
     </w:p>
@@ -3259,10 +3239,7 @@
         <w:jc w:val="both"/>
       </w:pPr>
       <w:r>
-        <w:t>2</w:t>
-      </w:r>
-      <w:r>
-        <w:t>. Wzór protokołu odbioru,</w:t>
+        <w:t>2. Wzór protokołu odbioru,</w:t>
       </w:r>
     </w:p>
     <w:p>
@@ -3272,10 +3249,7 @@
         <w:jc w:val="both"/>
       </w:pPr>
       <w:r>
-        <w:t>3</w:t>
-      </w:r>
-      <w:r>
-        <w:t>. Wykaz dokumentów przekazywanych przez Wykonawcę,</w:t>
+        <w:t>3. Wykaz dokumentów przekazywanych przez Wykonawcę,</w:t>
       </w:r>
     </w:p>
     <w:p>
@@ -3285,10 +3259,7 @@
         <w:jc w:val="both"/>
       </w:pPr>
       <w:r>
-        <w:t>4</w:t>
-      </w:r>
-      <w:r>
-        <w:t>. Informacja o przetwarzaniu danych osobowych,</w:t>
+        <w:t>4. Informacja o przetwarzaniu danych osobowych,</w:t>
       </w:r>
     </w:p>
     <w:p>
@@ -3303,10 +3274,10 @@
         <w:spacing w:after="100" w:line="268" w:lineRule="auto"/>
         <w:jc w:val="right"/>
         <w:rPr>
-          <w:ins w:id="5090" w:author="Ewa Retajczyk" w:date="2026-10-20T14:26:44Z"/>
-        </w:rPr>
-      </w:pPr>
-      <w:ins w:id="5091" w:author="Ewa Retajczyk" w:date="2026-10-20T14:27:12Z">
+          <w:ins w:id="5089" w:author="Ewa Retajczyk" w:date="2026-10-20T14:26:44Z"/>
+        </w:rPr>
+      </w:pPr>
+      <w:ins w:id="5090" w:author="Ewa Retajczyk" w:date="2026-10-20T14:27:12Z">
         <w:r>
           <w:rPr>
             <w:b/>
@@ -3325,10 +3296,10 @@
         <w:spacing w:before="120" w:after="160" w:line="268" w:lineRule="auto"/>
         <w:jc w:val="center"/>
         <w:rPr>
-          <w:ins w:id="5092" w:author="Ewa Retajczyk" w:date="2026-10-20T14:27:48Z"/>
-        </w:rPr>
-      </w:pPr>
-      <w:ins w:id="5093" w:author="Ewa Retajczyk" w:date="2026-10-20T14:27:57Z">
+          <w:ins w:id="5091" w:author="Ewa Retajczyk" w:date="2026-10-20T14:27:48Z"/>
+        </w:rPr>
+      </w:pPr>
+      <w:ins w:id="5092" w:author="Ewa Retajczyk" w:date="2026-10-20T14:27:57Z">
         <w:r>
           <w:rPr>
             <w:b/>
@@ -3345,10 +3316,10 @@
         <w:spacing w:after="100" w:line="268" w:lineRule="auto"/>
         <w:jc w:val="both"/>
         <w:rPr>
-          <w:ins w:id="5094" w:author="Ewa Retajczyk" w:date="2026-10-20T14:28:03Z"/>
-        </w:rPr>
-      </w:pPr>
-      <w:ins w:id="5095" w:author="Ewa Retajczyk" w:date="2026-10-20T14:29:10Z">
+          <w:ins w:id="5093" w:author="Ewa Retajczyk" w:date="2026-10-20T14:28:03Z"/>
+        </w:rPr>
+      </w:pPr>
+      <w:ins w:id="5094" w:author="Ewa Retajczyk" w:date="2026-10-20T14:29:10Z">
         <w:r>
           <w:t xml:space="preserve">Oferta Wykonawcy z dnia […… 2026 r.] w postępowaniu – Zapytanie ofertowe – Zamówienie nr 1, obejmująca: Formularz ofertowy (załącznik nr 1 do Zapytania ofertowego), Specyfikację (załącznik nr 2), Oświadczenie Wykonawcy (załącznik nr 3), Oświadczenie o braku powiązań (załącznik nr 4), dokumenty potwierdzające warunki udziału oraz pozostałe dokumenty złożone wraz z ofertą – do dołączenia w dniu zawarcia Umowy.</w:t>
         </w:r>
@@ -3371,7 +3342,7 @@
         </w:rPr>
         <w:t xml:space="preserve">Załącznik nr </w:t>
       </w:r>
-      <w:del w:id="5080" w:author="Ewa Retajczyk" w:date="2026-10-20T14:30:17Z">
+      <w:del w:id="5079" w:author="Ewa Retajczyk" w:date="2026-10-20T14:30:17Z">
         <w:r>
           <w:rPr>
             <w:b/>
@@ -3384,7 +3355,7 @@
           <w:delText xml:space="preserve">4</w:delText>
         </w:r>
       </w:del>
-      <w:ins w:id="5081" w:author="Ewa Retajczyk" w:date="2026-10-20T14:30:34Z">
+      <w:ins w:id="5080" w:author="Ewa Retajczyk" w:date="2026-10-20T14:30:34Z">
         <w:r>
           <w:rPr>
             <w:b/>
@@ -3581,12 +3552,12 @@
       <w:r>
         <w:t xml:space="preserve">2. Zakres sprawdzenia: ☐ kompletność i numery seryjne ☐ dokumentacja (wg Załącznika nr </w:t>
       </w:r>
-      <w:del w:id="5086" w:author="Ewa Retajczyk" w:date="2026-10-20T14:30:43Z">
+      <w:del w:id="5085" w:author="Ewa Retajczyk" w:date="2026-10-20T14:30:43Z">
         <w:r>
           <w:delText xml:space="preserve">5</w:delText>
         </w:r>
       </w:del>
-      <w:ins w:id="5087" w:author="Ewa Retajczyk" w:date="2026-10-20T14:31:46Z">
+      <w:ins w:id="5086" w:author="Ewa Retajczyk" w:date="2026-10-20T14:31:46Z">
         <w:r>
           <w:t xml:space="preserve">3</w:t>
         </w:r>
@@ -3661,12 +3632,12 @@
       <w:r>
         <w:t xml:space="preserve">4. Protokół odbioru końcowego stanowi podstawę płatności końcowej (</w:t>
       </w:r>
-      <w:del w:id="5088" w:author="Ewa Retajczyk" w:date="2026-10-20T14:32:38Z">
+      <w:del w:id="5087" w:author="Ewa Retajczyk" w:date="2026-10-20T14:32:38Z">
         <w:r>
           <w:delText xml:space="preserve">5</w:delText>
         </w:r>
       </w:del>
-      <w:ins w:id="5089" w:author="Ewa Retajczyk" w:date="2026-10-20T14:32:46Z">
+      <w:ins w:id="5088" w:author="Ewa Retajczyk" w:date="2026-10-20T14:32:46Z">
         <w:r>
           <w:t xml:space="preserve">3</w:t>
         </w:r>
@@ -3710,7 +3681,7 @@
         </w:rPr>
         <w:t xml:space="preserve">Załącznik nr </w:t>
       </w:r>
-      <w:del w:id="5082" w:author="Ewa Retajczyk" w:date="2026-10-20T14:32:52Z">
+      <w:del w:id="5081" w:author="Ewa Retajczyk" w:date="2026-10-20T14:32:52Z">
         <w:r>
           <w:rPr>
             <w:b/>
@@ -3723,7 +3694,7 @@
           <w:delText xml:space="preserve">5</w:delText>
         </w:r>
       </w:del>
-      <w:ins w:id="5083" w:author="Ewa Retajczyk" w:date="2026-10-20T14:33:04Z">
+      <w:ins w:id="5082" w:author="Ewa Retajczyk" w:date="2026-10-20T14:33:04Z">
         <w:r>
           <w:rPr>
             <w:b/>
@@ -3796,12 +3767,6 @@
         <w:gridCol w:w="3700"/>
       </w:tblGrid>
       <w:tr>
-        <w:tblPrEx>
-          <w:tblCellMar>
-            <w:top w:w="0" w:type="dxa"/>
-            <w:bottom w:w="0" w:type="dxa"/>
-          </w:tblCellMar>
-        </w:tblPrEx>
         <w:trPr>
           <w:tblHeader/>
         </w:trPr>
@@ -3909,12 +3874,6 @@
         </w:tc>
       </w:tr>
       <w:tr>
-        <w:tblPrEx>
-          <w:tblCellMar>
-            <w:top w:w="0" w:type="dxa"/>
-            <w:bottom w:w="0" w:type="dxa"/>
-          </w:tblCellMar>
-        </w:tblPrEx>
         <w:tc>
           <w:tcPr>
             <w:tcW w:w="600" w:type="dxa"/>
@@ -4008,12 +3967,6 @@
         </w:tc>
       </w:tr>
       <w:tr>
-        <w:tblPrEx>
-          <w:tblCellMar>
-            <w:top w:w="0" w:type="dxa"/>
-            <w:bottom w:w="0" w:type="dxa"/>
-          </w:tblCellMar>
-        </w:tblPrEx>
         <w:tc>
           <w:tcPr>
             <w:tcW w:w="600" w:type="dxa"/>
@@ -4107,12 +4060,6 @@
         </w:tc>
       </w:tr>
       <w:tr>
-        <w:tblPrEx>
-          <w:tblCellMar>
-            <w:top w:w="0" w:type="dxa"/>
-            <w:bottom w:w="0" w:type="dxa"/>
-          </w:tblCellMar>
-        </w:tblPrEx>
         <w:tc>
           <w:tcPr>
             <w:tcW w:w="600" w:type="dxa"/>
@@ -4206,12 +4153,6 @@
         </w:tc>
       </w:tr>
       <w:tr>
-        <w:tblPrEx>
-          <w:tblCellMar>
-            <w:top w:w="0" w:type="dxa"/>
-            <w:bottom w:w="0" w:type="dxa"/>
-          </w:tblCellMar>
-        </w:tblPrEx>
         <w:tc>
           <w:tcPr>
             <w:tcW w:w="600" w:type="dxa"/>
@@ -4305,12 +4246,6 @@
         </w:tc>
       </w:tr>
       <w:tr>
-        <w:tblPrEx>
-          <w:tblCellMar>
-            <w:top w:w="0" w:type="dxa"/>
-            <w:bottom w:w="0" w:type="dxa"/>
-          </w:tblCellMar>
-        </w:tblPrEx>
         <w:tc>
           <w:tcPr>
             <w:tcW w:w="600" w:type="dxa"/>
@@ -4404,12 +4339,6 @@
         </w:tc>
       </w:tr>
       <w:tr>
-        <w:tblPrEx>
-          <w:tblCellMar>
-            <w:top w:w="0" w:type="dxa"/>
-            <w:bottom w:w="0" w:type="dxa"/>
-          </w:tblCellMar>
-        </w:tblPrEx>
         <w:tc>
           <w:tcPr>
             <w:tcW w:w="600" w:type="dxa"/>
@@ -4503,12 +4432,6 @@
         </w:tc>
       </w:tr>
       <w:tr>
-        <w:tblPrEx>
-          <w:tblCellMar>
-            <w:top w:w="0" w:type="dxa"/>
-            <w:bottom w:w="0" w:type="dxa"/>
-          </w:tblCellMar>
-        </w:tblPrEx>
         <w:tc>
           <w:tcPr>
             <w:tcW w:w="600" w:type="dxa"/>
@@ -4602,12 +4525,6 @@
         </w:tc>
       </w:tr>
       <w:tr>
-        <w:tblPrEx>
-          <w:tblCellMar>
-            <w:top w:w="0" w:type="dxa"/>
-            <w:bottom w:w="0" w:type="dxa"/>
-          </w:tblCellMar>
-        </w:tblPrEx>
         <w:tc>
           <w:tcPr>
             <w:tcW w:w="600" w:type="dxa"/>
@@ -4701,12 +4618,6 @@
         </w:tc>
       </w:tr>
       <w:tr>
-        <w:tblPrEx>
-          <w:tblCellMar>
-            <w:top w:w="0" w:type="dxa"/>
-            <w:bottom w:w="0" w:type="dxa"/>
-          </w:tblCellMar>
-        </w:tblPrEx>
         <w:tc>
           <w:tcPr>
             <w:tcW w:w="600" w:type="dxa"/>
@@ -4800,12 +4711,6 @@
         </w:tc>
       </w:tr>
       <w:tr>
-        <w:tblPrEx>
-          <w:tblCellMar>
-            <w:top w:w="0" w:type="dxa"/>
-            <w:bottom w:w="0" w:type="dxa"/>
-          </w:tblCellMar>
-        </w:tblPrEx>
         <w:tc>
           <w:tcPr>
             <w:tcW w:w="600" w:type="dxa"/>
@@ -4899,12 +4804,6 @@
         </w:tc>
       </w:tr>
       <w:tr>
-        <w:tblPrEx>
-          <w:tblCellMar>
-            <w:top w:w="0" w:type="dxa"/>
-            <w:bottom w:w="0" w:type="dxa"/>
-          </w:tblCellMar>
-        </w:tblPrEx>
         <w:tc>
           <w:tcPr>
             <w:tcW w:w="600" w:type="dxa"/>
@@ -4998,12 +4897,6 @@
         </w:tc>
       </w:tr>
       <w:tr>
-        <w:tblPrEx>
-          <w:tblCellMar>
-            <w:top w:w="0" w:type="dxa"/>
-            <w:bottom w:w="0" w:type="dxa"/>
-          </w:tblCellMar>
-        </w:tblPrEx>
         <w:tc>
           <w:tcPr>
             <w:tcW w:w="600" w:type="dxa"/>
@@ -5097,12 +4990,6 @@
         </w:tc>
       </w:tr>
       <w:tr>
-        <w:tblPrEx>
-          <w:tblCellMar>
-            <w:top w:w="0" w:type="dxa"/>
-            <w:bottom w:w="0" w:type="dxa"/>
-          </w:tblCellMar>
-        </w:tblPrEx>
         <w:tc>
           <w:tcPr>
             <w:tcW w:w="600" w:type="dxa"/>
@@ -5196,12 +5083,6 @@
         </w:tc>
       </w:tr>
       <w:tr>
-        <w:tblPrEx>
-          <w:tblCellMar>
-            <w:top w:w="0" w:type="dxa"/>
-            <w:bottom w:w="0" w:type="dxa"/>
-          </w:tblCellMar>
-        </w:tblPrEx>
         <w:tc>
           <w:tcPr>
             <w:tcW w:w="600" w:type="dxa"/>
@@ -5323,12 +5204,6 @@
         <w:gridCol w:w="4819"/>
       </w:tblGrid>
       <w:tr>
-        <w:tblPrEx>
-          <w:tblCellMar>
-            <w:top w:w="0" w:type="dxa"/>
-            <w:bottom w:w="0" w:type="dxa"/>
-          </w:tblCellMar>
-        </w:tblPrEx>
         <w:tc>
           <w:tcPr>
             <w:tcW w:w="4819" w:type="dxa"/>
@@ -5416,7 +5291,7 @@
         </w:rPr>
         <w:t xml:space="preserve">Załącznik nr </w:t>
       </w:r>
-      <w:del w:id="5084" w:author="Ewa Retajczyk" w:date="2026-10-20T14:33:35Z">
+      <w:del w:id="5083" w:author="Ewa Retajczyk" w:date="2026-10-20T14:33:35Z">
         <w:r>
           <w:rPr>
             <w:b/>
@@ -5429,7 +5304,7 @@
           <w:delText xml:space="preserve">6</w:delText>
         </w:r>
       </w:del>
-      <w:ins w:id="5085" w:author="Ewa Retajczyk" w:date="2026-10-20T14:34:20Z">
+      <w:ins w:id="5084" w:author="Ewa Retajczyk" w:date="2026-10-20T14:34:20Z">
         <w:r>
           <w:rPr>
             <w:b/>
@@ -5603,12 +5478,6 @@
         <w:gridCol w:w="4819"/>
       </w:tblGrid>
       <w:tr>
-        <w:tblPrEx>
-          <w:tblCellMar>
-            <w:top w:w="0" w:type="dxa"/>
-            <w:bottom w:w="0" w:type="dxa"/>
-          </w:tblCellMar>
-        </w:tblPrEx>
         <w:tc>
           <w:tcPr>
             <w:tcW w:w="4819" w:type="dxa"/>
@@ -5683,10 +5552,10 @@
         <w:spacing w:after="100" w:line="268" w:lineRule="auto"/>
         <w:jc w:val="right"/>
         <w:rPr>
-          <w:del w:id="5100" w:author="Ewa Retajczyk" w:date="2026-10-20T14:34:33Z"/>
-        </w:rPr>
-      </w:pPr>
-      <w:del w:id="5096" w:author="Ewa Retajczyk" w:date="2026-10-20T14:34:51Z">
+          <w:del w:id="5099" w:author="Ewa Retajczyk" w:date="2026-10-20T14:34:33Z"/>
+        </w:rPr>
+      </w:pPr>
+      <w:del w:id="5095" w:author="Ewa Retajczyk" w:date="2026-10-20T14:34:51Z">
         <w:r>
           <w:rPr>
             <w:b/>
@@ -5700,7 +5569,7 @@
           <w:delText xml:space="preserve">Załącznik nr </w:delText>
         </w:r>
       </w:del>
-      <w:del w:id="5097" w:author="Ewa Retajczyk" w:date="2026-10-20T14:35:00Z">
+      <w:del w:id="5096" w:author="Ewa Retajczyk" w:date="2026-10-20T14:35:00Z">
         <w:r>
           <w:rPr>
             <w:b/>
@@ -5713,7 +5582,7 @@
           <w:delText xml:space="preserve">1</w:delText>
         </w:r>
       </w:del>
-      <w:del w:id="5098" w:author="Ewa Retajczyk" w:date="2026-10-20T14:35:01Z">
+      <w:del w:id="5097" w:author="Ewa Retajczyk" w:date="2026-10-20T14:35:01Z">
         <w:r>
           <w:rPr>
             <w:b/>
@@ -5726,7 +5595,7 @@
           <w:delText xml:space="preserve"> do Umowy nr </w:delText>
         </w:r>
       </w:del>
-      <w:del w:id="5099" w:author="Ewa Retajczyk" w:date="2026-10-20T14:35:20Z">
+      <w:del w:id="5098" w:author="Ewa Retajczyk" w:date="2026-10-20T14:35:20Z">
         <w:r>
           <w:rPr>
             <w:i/>
@@ -5744,10 +5613,10 @@
         <w:spacing w:before="120" w:after="160" w:line="268" w:lineRule="auto"/>
         <w:jc w:val="center"/>
         <w:rPr>
-          <w:del w:id="5102" w:author="Ewa Retajczyk" w:date="2026-10-20T14:35:22Z"/>
-        </w:rPr>
-      </w:pPr>
-      <w:del w:id="5101" w:author="Ewa Retajczyk" w:date="2026-10-20T14:37:47Z">
+          <w:del w:id="5101" w:author="Ewa Retajczyk" w:date="2026-10-20T14:35:22Z"/>
+        </w:rPr>
+      </w:pPr>
+      <w:del w:id="5100" w:author="Ewa Retajczyk" w:date="2026-10-20T14:37:47Z">
         <w:r>
           <w:rPr>
             <w:b/>
@@ -5764,12 +5633,12 @@
         <w:spacing w:after="100" w:line="268" w:lineRule="auto"/>
         <w:jc w:val="both"/>
       </w:pPr>
-      <w:del w:id="5103" w:author="Ewa Retajczyk" w:date="2026-10-20T14:37:54Z">
+      <w:del w:id="5102" w:author="Ewa Retajczyk" w:date="2026-10-20T14:37:54Z">
         <w:r>
           <w:delText xml:space="preserve">Oferta Wykonawcy z dnia </w:delText>
         </w:r>
       </w:del>
-      <w:del w:id="5104" w:author="Ewa Retajczyk" w:date="2026-10-20T14:38:18Z">
+      <w:del w:id="5103" w:author="Ewa Retajczyk" w:date="2026-10-20T14:38:18Z">
         <w:r>
           <w:rPr>
             <w:highlight w:val="yellow"/>
@@ -5777,12 +5646,12 @@
           <w:delText xml:space="preserve">[…… 2026 r.]</w:delText>
         </w:r>
       </w:del>
-      <w:del w:id="5105" w:author="Ewa Retajczyk" w:date="2026-10-20T14:39:03Z">
+      <w:del w:id="5104" w:author="Ewa Retajczyk" w:date="2026-10-20T14:39:03Z">
         <w:r>
           <w:delText xml:space="preserve"> w postępowaniu – Zapytanie ofertowe – Zamówienie nr 1, obejmująca: Formularz ofertowy (załącznik nr 1 do Zapytania ofertowego), Specyfikację (załącznik nr 2), Oświadczenie Wykonawcy (załącznik nr 3), Oświadczenie o braku powiązań (załącznik nr 4), dokumenty potwierdzające warunki udziału oraz pozostałe dokumenty złożone wraz z ofertą – </w:delText>
         </w:r>
       </w:del>
-      <w:del w:id="5106" w:author="Ewa Retajczyk" w:date="2026-10-20T14:39:12Z">
+      <w:del w:id="5105" w:author="Ewa Retajczyk" w:date="2026-10-20T14:39:12Z">
         <w:r>
           <w:rPr>
             <w:b/>
@@ -5791,7 +5660,7 @@
           <w:delText xml:space="preserve">do dołączenia w dniu zawarcia Umowy</w:delText>
         </w:r>
       </w:del>
-      <w:del w:id="5107" w:author="Ewa Retajczyk" w:date="2026-10-20T14:39:43Z">
+      <w:del w:id="5106" w:author="Ewa Retajczyk" w:date="2026-10-20T14:39:43Z">
         <w:r>
           <w:delText xml:space="preserve">.</w:delText>
         </w:r>

</xml_diff>

<commit_message>
Zał. 1, 3, 5 – poprawki spójności naniesione w trybie śledzenia zmian
Co-Authored-By: Claude Sonnet 5.5 <noreply@anthropic.com>
Claude-Session: https://claude.ai/code/session_014oD5P5yiRwT6Zb7b7udEcr
</commit_message>
<xml_diff>
--- a/zalaczniki_zapytanie_nr1/Zalacznik_5_Wzor_umowy_zmiany_sledzone.docx
+++ b/zalaczniki_zapytanie_nr1/Zalacznik_5_Wzor_umowy_zmiany_sledzone.docx
@@ -54,7 +54,27 @@
           <w:sz w:val="24"/>
           <w:szCs w:val="24"/>
         </w:rPr>
-        <w:t>na dostawę, montaż i uruchomienie ogólnodostępnych stacji ładowania DC dla pojazdów ciężarowych wraz z oprogramowaniem i systemem monitorowania (Zamówienie nr 1)</w:t>
+        <w:t xml:space="preserve">na dostawę</w:t>
+      </w:r>
+      <w:del w:id="5032" w:author="Ewa Retajczyk" w:date="2026-10-20T15:00:40Z">
+        <w:r>
+          <w:rPr>
+            <w:b/>
+            <w:bCs/>
+            <w:sz w:val="24"/>
+            <w:szCs w:val="24"/>
+          </w:rPr>
+          <w:delText xml:space="preserve">, montaż</w:delText>
+        </w:r>
+      </w:del>
+      <w:r>
+        <w:rPr>
+          <w:b/>
+          <w:bCs/>
+          <w:sz w:val="24"/>
+          <w:szCs w:val="24"/>
+        </w:rPr>
+        <w:t xml:space="preserve"> i uruchomienie ogólnodostępnych stacji ładowania DC dla pojazdów ciężarowych wraz z oprogramowaniem i systemem monitorowania (Zamówienie nr 1)</w:t>
       </w:r>
     </w:p>
     <w:p>
@@ -69,7 +89,21 @@
         <w:rPr>
           <w:highlight w:val="yellow"/>
         </w:rPr>
-        <w:t>[……………….]</w:t>
+        <w:t>[…………</w:t>
+      </w:r>
+      <w:proofErr w:type="gramStart"/>
+      <w:r>
+        <w:rPr>
+          <w:highlight w:val="yellow"/>
+        </w:rPr>
+        <w:t>…….</w:t>
+      </w:r>
+      <w:proofErr w:type="gramEnd"/>
+      <w:r>
+        <w:rPr>
+          <w:highlight w:val="yellow"/>
+        </w:rPr>
+        <w:t>]</w:t>
       </w:r>
       <w:r>
         <w:t xml:space="preserve"> 2026 r. w </w:t>
@@ -174,7 +208,21 @@
         <w:rPr>
           <w:highlight w:val="yellow"/>
         </w:rPr>
-        <w:t>[rejestru przedsiębiorców KRS prowadzonego przez ………… / CEiDG]</w:t>
+        <w:t xml:space="preserve">[rejestru przedsiębiorców KRS prowadzonego przez ………… / </w:t>
+      </w:r>
+      <w:proofErr w:type="spellStart"/>
+      <w:r>
+        <w:rPr>
+          <w:highlight w:val="yellow"/>
+        </w:rPr>
+        <w:t>CEiDG</w:t>
+      </w:r>
+      <w:proofErr w:type="spellEnd"/>
+      <w:r>
+        <w:rPr>
+          <w:highlight w:val="yellow"/>
+        </w:rPr>
+        <w:t>]</w:t>
       </w:r>
       <w:r>
         <w:t xml:space="preserve"> pod numerem </w:t>
@@ -375,7 +423,23 @@
         <w:t>Zamówienie nr 3</w:t>
       </w:r>
       <w:r>
-        <w:t xml:space="preserve"> – odrębne zamówienia w ramach Inwestycji obejmujące: nr 2 – roboty budowlane (projekt całej instalacji, infrastruktura nN i DC, trasy kablowe i teletechniczne, fundamenty, roboty terenowe, stanowiska, oświetlenie, niezależny nadzór inwestorski), nr 3 – dostawę stacji transformatorowej SN/nN wraz z przyłączeniem SN;</w:t>
+        <w:t xml:space="preserve"> – odrębne zamówienia w ramach Inwestycji obejmujące: nr 2 – roboty budowlane (projekt całej instalacji, infrastruktura </w:t>
+      </w:r>
+      <w:proofErr w:type="spellStart"/>
+      <w:r>
+        <w:t>nN</w:t>
+      </w:r>
+      <w:proofErr w:type="spellEnd"/>
+      <w:r>
+        <w:t xml:space="preserve"> i DC, trasy kablowe i teletechniczne, fundamenty, roboty terenowe, stanowiska, oświetlenie, niezależny nadzór inwestorski), nr 3 – dostawę stacji transformatorowej SN/</w:t>
+      </w:r>
+      <w:proofErr w:type="spellStart"/>
+      <w:r>
+        <w:t>nN</w:t>
+      </w:r>
+      <w:proofErr w:type="spellEnd"/>
+      <w:r>
+        <w:t xml:space="preserve"> wraz z przyłączeniem SN;</w:t>
       </w:r>
     </w:p>
     <w:p>
@@ -392,7 +456,7 @@
           <w:b/>
           <w:bCs/>
         </w:rPr>
-        <w:t xml:space="preserve">Zapytanie ofertowe</w:t>
+        <w:t>Zapytanie ofertowe</w:t>
       </w:r>
       <w:r>
         <w:t xml:space="preserve"> i </w:t>
@@ -402,7 +466,7 @@
           <w:b/>
           <w:bCs/>
         </w:rPr>
-        <w:t xml:space="preserve">Oferta</w:t>
+        <w:t>Oferta</w:t>
       </w:r>
       <w:r>
         <w:t xml:space="preserve"> – odpowiednio Zapytanie ofertowe – Zamówienie nr 1 wraz z załącznikami oraz oferta Wykonawcy z dnia </w:t>
@@ -411,23 +475,10 @@
         <w:rPr>
           <w:highlight w:val="yellow"/>
         </w:rPr>
-        <w:t xml:space="preserve">[…… 2026 r.]</w:t>
-      </w:r>
-      <w:r>
-        <w:t xml:space="preserve"> (Załącznik nr </w:t>
-      </w:r>
-      <w:del w:id="5001" w:author="Ewa Retajczyk" w:date="2026-10-20T14:00:54Z">
-        <w:r>
-          <w:delText xml:space="preserve">7</w:delText>
-        </w:r>
-      </w:del>
-      <w:ins w:id="5002" w:author="Ewa Retajczyk" w:date="2026-10-20T14:01:29Z">
-        <w:r>
-          <w:t xml:space="preserve">1</w:t>
-        </w:r>
-      </w:ins>
-      <w:r>
-        <w:t xml:space="preserve">);</w:t>
+        <w:t>[…… 2026 r.]</w:t>
+      </w:r>
+      <w:r>
+        <w:t xml:space="preserve"> (Załącznik nr 1);</w:t>
       </w:r>
     </w:p>
     <w:p>
@@ -577,235 +628,54 @@
         <w:jc w:val="both"/>
       </w:pPr>
       <w:r>
-        <w:t xml:space="preserve">1. Wykonawca zobowiązuje się, za wynagrodzeniem ryczałtowym określonym w § 7, do wykonania </w:t>
-      </w:r>
-      <w:del w:id="5003" w:author="Ewa Retajczyk" w:date="2026-10-20T14:01:34Z">
-        <w:r>
-          <w:delText xml:space="preserve">następującego</w:delText>
+        <w:t xml:space="preserve">1. Wykonawca zobowiązuje się, za wynagrodzeniem ryczałtowym określonym w § 7, do wykonania dostawy na miejsce realizacji </w:t>
+      </w:r>
+      <w:r>
+        <w:t xml:space="preserve">inwestycji </w:t>
+      </w:r>
+      <w:r>
+        <w:t>6 Stacji ładowania wraz z jednostkami przekształtnikowymi, systemem OCPP, billingiem i płatnościami oraz Systemem monitorowania i zarządzania danymi dla obwodów zasilających punkty ładowania, ich montażu, konfiguracji, uruchomienia i integracji, przeprowadzenia testów, przekazania dokumentacji, przeszkolenia personelu Zamawiającego, wsparcia przy odbiorach i badaniach UDT oraz udzielenia gwarancji (Przedmiot Umowy), zgodnie z Zapytaniem ofertowym i Ofertą.</w:t>
+      </w:r>
+    </w:p>
+    <w:p>
+      <w:pPr>
+        <w:spacing w:after="100" w:line="268" w:lineRule="auto"/>
+        <w:ind w:left="420" w:hanging="420"/>
+        <w:jc w:val="both"/>
+      </w:pPr>
+      <w:r>
+        <w:t xml:space="preserve">2. Szczegółowy opis Przedmiotu Umowy zawierają Zapytanie ofertowe oraz Oferta. W razie rozbieżności stosuje się kolejno: Umowę wraz z załącznikami nr </w:t>
+      </w:r>
+      <w:del w:id="5033" w:author="Ewa Retajczyk" w:date="2026-10-20T15:01:07Z">
+        <w:r>
+          <w:delText xml:space="preserve">1</w:delText>
         </w:r>
       </w:del>
-      <w:ins w:id="5004" w:author="Ewa Retajczyk" w:date="2026-10-20T14:01:51Z">
-        <w:r>
-          <w:t xml:space="preserve">dostawy</w:t>
+      <w:ins w:id="5034" w:author="Ewa Retajczyk" w:date="2026-10-20T15:01:10Z">
+        <w:r>
+          <w:t xml:space="preserve">2</w:t>
         </w:r>
       </w:ins>
       <w:r>
-        <w:t xml:space="preserve"> </w:t>
-      </w:r>
-      <w:del w:id="5005" w:author="Ewa Retajczyk" w:date="2026-10-20T14:02:19Z">
-        <w:r>
-          <w:delText xml:space="preserve">zakresu</w:delText>
-        </w:r>
-      </w:del>
-      <w:ins w:id="5006" w:author="Ewa Retajczyk" w:date="2026-10-20T14:02:21Z">
-        <w:r>
-          <w:t xml:space="preserve">na miejsce realizacji 6 Stacji ładowania wraz z jednostkami przekształtnikowymi, systemem OCPP, billingiem i płatnościami oraz Systemem monitorowania i zarządzania danymi dla obwodów zasilających punkty ładowania, ich montażu, konfiguracji, uruchomienia i integracji, przeprowadzenia testów, przekazania dokumentacji, przeszkolenia personelu Zamawiającego, wsparcia przy odbiorach i badaniach UDT oraz udzielenia gwarancji</w:t>
-        </w:r>
-      </w:ins>
-      <w:r>
-        <w:t xml:space="preserve"> (Przedmiot Umowy)</w:t>
-      </w:r>
-      <w:del w:id="5007" w:author="Ewa Retajczyk" w:date="2026-10-20T14:02:23Z">
-        <w:r>
-          <w:delText xml:space="preserve">:</w:delText>
-        </w:r>
-      </w:del>
-      <w:ins w:id="5008" w:author="Ewa Retajczyk" w:date="2026-10-20T14:02:25Z">
-        <w:r>
-          <w:t xml:space="preserve">, zgodnie z Zapytaniem ofertowym (w szczególności pkt 2–10) i Ofertą.</w:t>
-        </w:r>
-      </w:ins>
-    </w:p>
-    <w:p>
-      <w:pPr>
-        <w:spacing w:after="60" w:line="268" w:lineRule="auto"/>
-        <w:ind w:left="840" w:hanging="420"/>
-        <w:jc w:val="both"/>
-        <w:rPr>
-          <w:del w:id="5010" w:author="Ewa Retajczyk" w:date="2026-10-20T14:02:30Z"/>
-        </w:rPr>
-      </w:pPr>
-      <w:del w:id="5009" w:author="Ewa Retajczyk" w:date="2026-10-20T14:02:47Z">
-        <w:r>
-          <w:delText xml:space="preserve">a) dostawy na miejsce realizacji 6 Stacji ładowania wraz z jednostkami przekształtnikowymi (w liczbie i konfiguracji wskazanej w Ofercie), przewodami i złączami CCS2 (Combo 2) oraz niezbędnym osprzętem;</w:delText>
-        </w:r>
-      </w:del>
-    </w:p>
-    <w:p>
-      <w:pPr>
-        <w:spacing w:after="60" w:line="268" w:lineRule="auto"/>
-        <w:ind w:left="840" w:hanging="420"/>
-        <w:jc w:val="both"/>
-        <w:rPr>
-          <w:del w:id="5012" w:author="Ewa Retajczyk" w:date="2026-10-20T14:02:53Z"/>
-        </w:rPr>
-      </w:pPr>
-      <w:del w:id="5011" w:author="Ewa Retajczyk" w:date="2026-10-20T14:03:13Z">
-        <w:r>
-          <w:delText xml:space="preserve">b) transportu, rozładunku, ustawienia urządzeń na przygotowanych podstawach, montażu, połączeń wewnętrznych, konfiguracji i uruchomienia;</w:delText>
-        </w:r>
-      </w:del>
-    </w:p>
-    <w:p>
-      <w:pPr>
-        <w:spacing w:after="60" w:line="268" w:lineRule="auto"/>
-        <w:ind w:left="840" w:hanging="420"/>
-        <w:jc w:val="both"/>
-        <w:rPr>
-          <w:del w:id="5014" w:author="Ewa Retajczyk" w:date="2026-10-20T14:03:37Z"/>
-        </w:rPr>
-      </w:pPr>
-      <w:del w:id="5013" w:author="Ewa Retajczyk" w:date="2026-10-20T14:04:41Z">
-        <w:r>
-          <w:delText xml:space="preserve">c) dostawy, konfiguracji i uruchomienia systemu komunikacji OCPP, systemu rozliczania usług ładowania (billing), systemu płatności (płatność kartą debetową lub kredytową bez rejestracji, prezentacja ceny za kWh przed rozpoczęciem sesji) oraz osprzętu aktywnego (przełączniki, routery) i otwartych interfejsów (w szczególności OCPP i API);</w:delText>
-        </w:r>
-      </w:del>
-    </w:p>
-    <w:p>
-      <w:pPr>
-        <w:spacing w:after="60" w:line="268" w:lineRule="auto"/>
-        <w:ind w:left="840" w:hanging="420"/>
-        <w:jc w:val="both"/>
-        <w:rPr>
-          <w:del w:id="5016" w:author="Ewa Retajczyk" w:date="2026-10-20T14:04:42Z"/>
-        </w:rPr>
-      </w:pPr>
-      <w:del w:id="5015" w:author="Ewa Retajczyk" w:date="2026-10-20T14:04:43Z">
-        <w:r>
-          <w:delText xml:space="preserve">d) dostawy, konfiguracji, uruchomienia i integracji Systemu monitorowania i zarządzania danymi dla obwodów zasilających punkty ładowania zgodnie ze Specyfikacją (Załącznik nr 1);</w:delText>
-        </w:r>
-      </w:del>
-    </w:p>
-    <w:p>
-      <w:pPr>
-        <w:spacing w:after="60" w:line="268" w:lineRule="auto"/>
-        <w:ind w:left="840" w:hanging="420"/>
-        <w:jc w:val="both"/>
-        <w:rPr>
-          <w:del w:id="5018" w:author="Ewa Retajczyk" w:date="2026-10-20T14:04:57Z"/>
-        </w:rPr>
-      </w:pPr>
-      <w:del w:id="5017" w:author="Ewa Retajczyk" w:date="2026-10-20T14:05:10Z">
-        <w:r>
-          <w:delText xml:space="preserve">e) nadzoru nad wykonaniem podłączeń oraz kontroli przed podaniem napięcia;</w:delText>
-        </w:r>
-      </w:del>
-    </w:p>
-    <w:p>
-      <w:pPr>
-        <w:spacing w:after="60" w:line="268" w:lineRule="auto"/>
-        <w:ind w:left="840" w:hanging="420"/>
-        <w:jc w:val="both"/>
-        <w:rPr>
-          <w:del w:id="5020" w:author="Ewa Retajczyk" w:date="2026-10-20T14:05:46Z"/>
-        </w:rPr>
-      </w:pPr>
-      <w:del w:id="5019" w:author="Ewa Retajczyk" w:date="2026-10-20T14:06:02Z">
-        <w:r>
-          <w:delText xml:space="preserve">f) przeprowadzenia testów (w tym FAT – testów odbiorczych w siedzibie producenta przed dostawą – oraz testów na miejscu), udziału w testach wspólnych i w odbiorach całej stacji;</w:delText>
-        </w:r>
-      </w:del>
-    </w:p>
-    <w:p>
-      <w:pPr>
-        <w:spacing w:after="60" w:line="268" w:lineRule="auto"/>
-        <w:ind w:left="840" w:hanging="420"/>
-        <w:jc w:val="both"/>
-        <w:rPr>
-          <w:del w:id="5022" w:author="Ewa Retajczyk" w:date="2026-10-20T14:06:02Z"/>
-        </w:rPr>
-      </w:pPr>
-      <w:del w:id="5021" w:author="Ewa Retajczyk" w:date="2026-10-20T14:06:04Z">
-        <w:r>
-          <w:delText xml:space="preserve">g) przekazania dokumentacji wymienionej w Załączniku nr 5, w tym dokumentacji potrzebnej wykonawcom Zamówienia nr 2 i nr 3 oraz dokumentacji do badań UDT (3 komplety + wersja elektroniczna);</w:delText>
-        </w:r>
-      </w:del>
-    </w:p>
-    <w:p>
-      <w:pPr>
-        <w:spacing w:after="60" w:line="268" w:lineRule="auto"/>
-        <w:ind w:left="840" w:hanging="420"/>
-        <w:jc w:val="both"/>
-        <w:rPr>
-          <w:del w:id="5024" w:author="Ewa Retajczyk" w:date="2026-10-20T14:06:43Z"/>
-        </w:rPr>
-      </w:pPr>
-      <w:del w:id="5023" w:author="Ewa Retajczyk" w:date="2026-10-20T14:07:02Z">
-        <w:r>
-          <w:delText xml:space="preserve">h) szkolenia personelu Zamawiającego;</w:delText>
-        </w:r>
-      </w:del>
-    </w:p>
-    <w:p>
-      <w:pPr>
-        <w:spacing w:after="60" w:line="268" w:lineRule="auto"/>
-        <w:ind w:left="840" w:hanging="420"/>
-        <w:jc w:val="both"/>
-        <w:rPr>
-          <w:del w:id="5026" w:author="Ewa Retajczyk" w:date="2026-10-20T14:07:13Z"/>
-        </w:rPr>
-      </w:pPr>
-      <w:del w:id="5025" w:author="Ewa Retajczyk" w:date="2026-10-20T14:08:14Z">
-        <w:r>
-          <w:delText xml:space="preserve">i) wsparcia technicznego podczas odbiorów oraz badań UDT, usunięcia usterek własnego zakresu oraz udzielenia gwarancji i świadczenia serwisu gwarancyjnego.</w:delText>
-        </w:r>
-      </w:del>
-    </w:p>
-    <w:p>
-      <w:pPr>
-        <w:spacing w:after="100" w:line="268" w:lineRule="auto"/>
-        <w:ind w:left="420" w:hanging="420"/>
-        <w:jc w:val="both"/>
-      </w:pPr>
-      <w:r>
-        <w:t xml:space="preserve">2. Szczegółowy opis Przedmiotu Umowy zawierają</w:t>
-      </w:r>
-      <w:del w:id="5027" w:author="Ewa Retajczyk" w:date="2026-10-20T14:08:55Z">
-        <w:r>
-          <w:delText xml:space="preserve">: Specyfikacja i miejsce realizacji (Załącznik nr 1), Szczegółowy zakres obowiązków Wykonawcy i granice odpowiedzialności (Załącznik nr 2),</w:delText>
-        </w:r>
-      </w:del>
-      <w:r>
-        <w:t xml:space="preserve"> Zapytanie ofertowe oraz Oferta. W razie rozbieżności stosuje się kolejno: Umowę wraz z załącznikami nr 1–</w:t>
-      </w:r>
-      <w:del w:id="5028" w:author="Ewa Retajczyk" w:date="2026-10-20T14:09:16Z">
-        <w:r>
-          <w:delText xml:space="preserve">6</w:delText>
-        </w:r>
-      </w:del>
-      <w:ins w:id="5029" w:author="Ewa Retajczyk" w:date="2026-10-20T14:09:20Z">
-        <w:r>
-          <w:t xml:space="preserve">4</w:t>
-        </w:r>
-      </w:ins>
-      <w:r>
-        <w:t xml:space="preserve">, Zapytanie ofertowe, Ofertę; postanowienia Oferty korzystniejsze dla Zamawiającego mają pierwszeństwo.</w:t>
-      </w:r>
-    </w:p>
-    <w:p>
-      <w:pPr>
-        <w:spacing w:after="100" w:line="268" w:lineRule="auto"/>
-        <w:ind w:left="420" w:hanging="420"/>
-        <w:jc w:val="both"/>
-      </w:pPr>
-      <w:r>
-        <w:t xml:space="preserve">3. Przedmiot Umowy nie obejmuje: </w:t>
-      </w:r>
-      <w:del w:id="5030" w:author="Ewa Retajczyk" w:date="2026-10-20T14:09:45Z">
-        <w:r>
-          <w:delText xml:space="preserve">roboty</w:delText>
-        </w:r>
-      </w:del>
-      <w:ins w:id="5031" w:author="Ewa Retajczyk" w:date="2026-10-20T14:09:54Z">
-        <w:r>
-          <w:t xml:space="preserve">robót</w:t>
-        </w:r>
-      </w:ins>
-      <w:r>
-        <w:t xml:space="preserve"> budowlanych, fundamentów, tras kablowych, zewnętrznych instalacji nN i DC, infrastruktury SN i stacji transformatorowej, stanowisk postojowych, oświetlenia oraz infrastruktury teletechnicznej i światłowodowej (Zamówienia nr 2 i nr 3), uzgodnień z operatorem systemu dystrybucyjnego (OSD), a także wykonania integracji z nadrzędnym systemem zarządzania </w:t>
-      </w:r>
-      <w:r>
-        <w:t xml:space="preserve">energią Zamawiającego (Wykonawca zapewnia wyłącznie otwarte interfejsy umożliwiające taką integrację).</w:t>
+        <w:t xml:space="preserve">–4, Zapytanie ofertowe, Ofertę; postanowienia Oferty korzystniejsze dla Zamawiającego mają pierwszeństwo.</w:t>
+      </w:r>
+    </w:p>
+    <w:p>
+      <w:pPr>
+        <w:spacing w:after="100" w:line="268" w:lineRule="auto"/>
+        <w:ind w:left="420" w:hanging="420"/>
+        <w:jc w:val="both"/>
+      </w:pPr>
+      <w:r>
+        <w:t xml:space="preserve">3. Przedmiot Umowy nie obejmuje: robót budowlanych, fundamentów, tras kablowych, zewnętrznych instalacji </w:t>
+      </w:r>
+      <w:proofErr w:type="spellStart"/>
+      <w:r>
+        <w:t>nN</w:t>
+      </w:r>
+      <w:proofErr w:type="spellEnd"/>
+      <w:r>
+        <w:t xml:space="preserve"> i DC, infrastruktury SN i stacji transformatorowej, stanowisk postojowych, oświetlenia oraz infrastruktury teletechnicznej i światłowodowej (Zamówienia nr 2 i nr 3), uzgodnień z operatorem systemu dystrybucyjnego (OSD), a także wykonania integracji z nadrzędnym systemem zarządzania energią Zamawiającego (Wykonawca zapewnia wyłącznie otwarte interfejsy umożliwiające taką integrację).</w:t>
       </w:r>
     </w:p>
     <w:p>
@@ -871,7 +741,15 @@
         <w:jc w:val="both"/>
       </w:pPr>
       <w:r>
-        <w:t>c) dostarczy urządzenia fabrycznie nowe, nieużywane, wolne od wad, wyprodukowane nie wcześniej niż 24 miesiące przed montażem, posiadające oznakowanie CE, deklaracje zgodności UE oraz wymagane certyfikaty i dopuszczenia do stosowania na terytorium RP i UE;</w:t>
+        <w:t xml:space="preserve">c) dostarczy urządzenia fabrycznie nowe, nieużywane, wolne od wad, wyprodukowane </w:t>
+      </w:r>
+      <w:proofErr w:type="gramStart"/>
+      <w:r>
+        <w:t>nie wcześniej</w:t>
+      </w:r>
+      <w:proofErr w:type="gramEnd"/>
+      <w:r>
+        <w:t xml:space="preserve"> niż 24 miesiące przed montażem, posiadające oznakowanie CE, deklaracje zgodności UE oraz wymagane certyfikaty i dopuszczenia do stosowania na terytorium RP i UE;</w:t>
       </w:r>
     </w:p>
     <w:p>
@@ -881,7 +759,16 @@
         <w:jc w:val="both"/>
       </w:pPr>
       <w:r>
-        <w:t>d) oferowane ładowarki pochodzą od producenta spełniającego warunek określony w pkt 12 ppkt 2 Zapytania ofertowego, co potwierdza oświadczenie i dokumenty złożone w Ofercie, a w razie zmiany producenta lub modelu zapewni zachowanie tego warunku;</w:t>
+        <w:lastRenderedPageBreak/>
+        <w:t xml:space="preserve">d) oferowane ładowarki pochodzą od producenta spełniającego warunek określony w pkt 12 </w:t>
+      </w:r>
+      <w:proofErr w:type="spellStart"/>
+      <w:r>
+        <w:t>ppkt</w:t>
+      </w:r>
+      <w:proofErr w:type="spellEnd"/>
+      <w:r>
+        <w:t xml:space="preserve"> 2 Zapytania ofertowego, co potwierdza oświadczenie i dokumenty złożone w Ofercie, a w razie zmiany producenta lub modelu zapewni zachowanie tego warunku;</w:t>
       </w:r>
     </w:p>
     <w:p>
@@ -891,59 +778,7 @@
         <w:jc w:val="both"/>
       </w:pPr>
       <w:r>
-        <w:t xml:space="preserve">e) </w:t>
-      </w:r>
-      <w:del w:id="5032" w:author="Ewa Retajczyk" w:date="2026-10-20T14:10:30Z">
-        <w:r>
-          <w:delText xml:space="preserve">oferowane</w:delText>
-        </w:r>
-      </w:del>
-      <w:ins w:id="5033" w:author="Ewa Retajczyk" w:date="2026-10-20T14:11:08Z">
-        <w:r>
-          <w:t xml:space="preserve">przedsięwzięcie</w:t>
-        </w:r>
-      </w:ins>
-      <w:r>
-        <w:t xml:space="preserve"> </w:t>
-      </w:r>
-      <w:del w:id="5034" w:author="Ewa Retajczyk" w:date="2026-10-20T14:11:23Z">
-        <w:r>
-          <w:delText xml:space="preserve">rozwiązanie</w:delText>
-        </w:r>
-      </w:del>
-      <w:ins w:id="5035" w:author="Ewa Retajczyk" w:date="2026-10-20T14:11:31Z">
-        <w:r>
-          <w:t xml:space="preserve">zostanie</w:t>
-        </w:r>
-      </w:ins>
-      <w:r>
-        <w:t xml:space="preserve"> </w:t>
-      </w:r>
-      <w:del w:id="5036" w:author="Ewa Retajczyk" w:date="2026-10-20T14:11:35Z">
-        <w:r>
-          <w:delText xml:space="preserve">jest</w:delText>
-        </w:r>
-      </w:del>
-      <w:ins w:id="5037" w:author="Ewa Retajczyk" w:date="2026-10-20T14:11:59Z">
-        <w:r>
-          <w:t xml:space="preserve">zrealizowane</w:t>
-        </w:r>
-      </w:ins>
-      <w:r>
-        <w:t xml:space="preserve"> </w:t>
-      </w:r>
-      <w:del w:id="5038" w:author="Ewa Retajczyk" w:date="2026-10-20T14:12:20Z">
-        <w:r>
-          <w:delText xml:space="preserve">zgodne</w:delText>
-        </w:r>
-      </w:del>
-      <w:ins w:id="5039" w:author="Ewa Retajczyk" w:date="2026-10-20T14:12:32Z">
-        <w:r>
-          <w:t xml:space="preserve">zgodnie</w:t>
-        </w:r>
-      </w:ins>
-      <w:r>
-        <w:t xml:space="preserve"> z zasadą DNSH („nie wyrządzaj poważnych szkód");</w:t>
+        <w:t>e) przedsięwzięcie zostanie zrealizowane zgodnie z zasadą DNSH („nie wyrządzaj poważnych szkód");</w:t>
       </w:r>
     </w:p>
     <w:p>
@@ -959,7 +794,21 @@
         <w:rPr>
           <w:highlight w:val="yellow"/>
         </w:rPr>
-        <w:t>posiada aktualne ubezpieczenie odpowiedzialności cywilnej w zakresie prowadzonej działalności z sumą gwarancyjną nie niższą niż […… zł] oraz ubezpieczenie ryzyk montażowych na czas realizacji Przedmiotu Umowy i dostarczy Zamawiającemu kopie polis w terminie 7 dni od zawarcia Umowy;</w:t>
+        <w:t xml:space="preserve">posiada aktualne ubezpieczenie odpowiedzialności cywilnej w zakresie prowadzonej działalności z sumą gwarancyjną nie niższą niż […… zł] oraz ubezpieczenie </w:t>
+      </w:r>
+      <w:proofErr w:type="spellStart"/>
+      <w:r>
+        <w:rPr>
+          <w:highlight w:val="yellow"/>
+        </w:rPr>
+        <w:t>ryzyk</w:t>
+      </w:r>
+      <w:proofErr w:type="spellEnd"/>
+      <w:r>
+        <w:rPr>
+          <w:highlight w:val="yellow"/>
+        </w:rPr>
+        <w:t xml:space="preserve"> montażowych na czas realizacji Przedmiotu Umowy i dostarczy Zamawiającemu kopie polis w terminie 7 dni od zawarcia Umowy;</w:t>
       </w:r>
     </w:p>
     <w:p>
@@ -1035,23 +884,15 @@
         <w:jc w:val="both"/>
       </w:pPr>
       <w:r>
-        <w:t xml:space="preserve">a) wykonania Przedmiotu Umowy zgodnie z Umową, </w:t>
-      </w:r>
-      <w:ins w:id="5040" w:author="Ewa Retajczyk" w:date="2026-10-20T14:12:33Z">
-        <w:r>
-          <w:t xml:space="preserve">Zapytaniem ofertowym (w tym </w:t>
-        </w:r>
-      </w:ins>
-      <w:r>
-        <w:t xml:space="preserve">Specyfikacją</w:t>
-      </w:r>
-      <w:ins w:id="5041" w:author="Ewa Retajczyk" w:date="2026-10-20T14:12:57Z">
-        <w:r>
-          <w:t xml:space="preserve"> – załącznik nr 2 do Zapytania ofertowego)</w:t>
-        </w:r>
-      </w:ins>
-      <w:r>
-        <w:t xml:space="preserve">, Ofertą, obowiązującymi przepisami (w tym przepisami o elektromobilności i paliwach alternatywnych, prawem budowlanym i przepisami UDT), normami EN 62196-3:2014, IEC 61851-1, -23, -24 oraz zaleceniami producenta;</w:t>
+        <w:t xml:space="preserve">a) wykonania Przedmiotu Umowy zgodnie z Umową, Zapytaniem ofertowym (w tym Specyfikacją – załącznik nr 2 do Zapytania ofertowego), Ofertą, obowiązującymi przepisami (w tym przepisami o </w:t>
+      </w:r>
+      <w:proofErr w:type="spellStart"/>
+      <w:r>
+        <w:t>elektromobilności</w:t>
+      </w:r>
+      <w:proofErr w:type="spellEnd"/>
+      <w:r>
+        <w:t xml:space="preserve"> i paliwach alternatywnych, prawem budowlanym i przepisami UDT), normami EN 62196-3:2014, IEC 61851-1, -23, -24 oraz zaleceniami producenta;</w:t>
       </w:r>
     </w:p>
     <w:p>
@@ -1071,20 +912,51 @@
         <w:jc w:val="both"/>
       </w:pPr>
       <w:r>
-        <w:t xml:space="preserve">c) przekazania w terminie wskazanym w Ofercie (nie później niż </w:t>
-      </w:r>
-      <w:r>
-        <w:rPr>
-          <w:highlight w:val="yellow"/>
-        </w:rPr>
-        <w:t>[…]</w:t>
-      </w:r>
-      <w:r>
-        <w:t xml:space="preserve"> dni od zawarcia Umowy) danych interfejsowych i technicznych niezbędnych do zaprojektowania i wykonania infrastruktury </w:t>
-      </w:r>
-      <w:r>
-        <w:lastRenderedPageBreak/>
-        <w:t>Zamówień nr 2 i nr 3 (m.in. gabaryty, masy, wymagania posadowienia, schematy, listy zaciskowe, wymagania dotyczące kabli i zabezpieczeń, bilans mocy, wymagania komunikacyjne, strefy serwisowe, dane do dokumentacji UDT, wymagania torów pomiarowych Systemu monitorowania), a po zatwierdzeniu parametrów – niedokonywania ich zmian bez zgody Zamawiającego i oceny wpływu na pozostałe zamówienia;</w:t>
+        <w:t xml:space="preserve">c) przekazania w terminie </w:t>
+      </w:r>
+      <w:del w:id="5035" w:author="Ewa Retajczyk" w:date="2026-10-20T15:01:23Z">
+        <w:r>
+          <w:delText xml:space="preserve">wskazanym w Ofercie (nie później niż </w:delText>
+        </w:r>
+      </w:del>
+      <w:r>
+        <w:rPr>
+          <w:highlight w:val="yellow"/>
+        </w:rPr>
+        <w:t xml:space="preserve">[</w:t>
+      </w:r>
+      <w:del w:id="5036" w:author="Ewa Retajczyk" w:date="2026-10-20T15:01:44Z">
+        <w:r>
+          <w:rPr>
+            <w:highlight w:val="yellow"/>
+          </w:rPr>
+          <w:delText xml:space="preserve">…</w:delText>
+        </w:r>
+      </w:del>
+      <w:ins w:id="5037" w:author="Ewa Retajczyk" w:date="2026-10-20T15:01:46Z">
+        <w:r>
+          <w:rPr>
+            <w:highlight w:val="yellow"/>
+          </w:rPr>
+          <w:t xml:space="preserve">10</w:t>
+        </w:r>
+      </w:ins>
+      <w:r>
+        <w:rPr>
+          <w:highlight w:val="yellow"/>
+        </w:rPr>
+        <w:t xml:space="preserve">]</w:t>
+      </w:r>
+      <w:r>
+        <w:t xml:space="preserve"> dni od zawarcia Umowy</w:t>
+      </w:r>
+      <w:del w:id="5038" w:author="Ewa Retajczyk" w:date="2026-10-20T15:01:47Z">
+        <w:r>
+          <w:delText xml:space="preserve">)</w:delText>
+        </w:r>
+      </w:del>
+      <w:r>
+        <w:t xml:space="preserve"> danych interfejsowych i technicznych niezbędnych do zaprojektowania i wykonania infrastruktury Zamówień nr 2 i nr 3 (m.in. gabaryty, masy, wymagania posadowienia, schematy, listy zaciskowe, wymagania dotyczące kabli i zabezpieczeń, bilans mocy, wymagania komunikacyjne, strefy serwisowe, dane do dokumentacji UDT, wymagania torów pomiarowych Systemu monitorowania), a po zatwierdzeniu parametrów – niedokonywania ich zmian bez zgody Zamawiającego i oceny wpływu na pozostałe zamówienia;</w:t>
       </w:r>
     </w:p>
     <w:p>
@@ -1104,7 +976,15 @@
         <w:jc w:val="both"/>
       </w:pPr>
       <w:r>
-        <w:t>e) niezwłocznego (nie później niż w ciągu 7 dni od powzięcia wiadomości) informowania Zamawiającego o okolicznościach, które mogą skutkować opóźnieniem, niezgodnością z Umową lub z Umową o dofinansowanie lub zagrożeniem osiągnięcia efektu rzeczowego, oraz o kolizjach i niezgodnościach w dokumentacji lub zakresach;</w:t>
+        <w:t>e) niezwłocznego (</w:t>
+      </w:r>
+      <w:proofErr w:type="gramStart"/>
+      <w:r>
+        <w:t>nie później</w:t>
+      </w:r>
+      <w:proofErr w:type="gramEnd"/>
+      <w:r>
+        <w:t xml:space="preserve"> niż w ciągu 7 dni od powzięcia wiadomości) informowania Zamawiającego o okolicznościach, które mogą skutkować opóźnieniem, niezgodnością z Umową lub z Umową o dofinansowanie lub zagrożeniem osiągnięcia efektu rzeczowego, oraz o kolizjach i niezgodnościach w dokumentacji lub zakresach;</w:t>
       </w:r>
     </w:p>
     <w:p>
@@ -1134,6 +1014,7 @@
         <w:jc w:val="both"/>
       </w:pPr>
       <w:r>
+        <w:lastRenderedPageBreak/>
         <w:t>h) oznakowania Stacji ładowania zgodnie z § 10 ust. 1;</w:t>
       </w:r>
     </w:p>
@@ -1260,24 +1141,45 @@
         <w:jc w:val="both"/>
       </w:pPr>
       <w:r>
-        <w:t>e) wystąpienia, jako podmiot eksploatujący, do UDT o badania techniczne stacji oraz współdziałania z Wykonawcą przy tych badaniach.</w:t>
-      </w:r>
-    </w:p>
-    <w:p>
-      <w:pPr>
-        <w:spacing w:after="100" w:line="268" w:lineRule="auto"/>
-        <w:ind w:left="420" w:hanging="420"/>
-        <w:jc w:val="both"/>
-      </w:pPr>
-      <w:r>
-        <w:lastRenderedPageBreak/>
+        <w:t xml:space="preserve">e) </w:t>
+      </w:r>
+      <w:proofErr w:type="gramStart"/>
+      <w:r>
+        <w:t>wystąpienia,</w:t>
+      </w:r>
+      <w:proofErr w:type="gramEnd"/>
+      <w:r>
+        <w:t xml:space="preserve"> jako podmiot eksploatujący, do UDT o badania techniczne stacji oraz współdziałania z Wykonawcą przy tych badaniach.</w:t>
+      </w:r>
+    </w:p>
+    <w:p>
+      <w:pPr>
+        <w:spacing w:after="100" w:line="268" w:lineRule="auto"/>
+        <w:ind w:left="420" w:hanging="420"/>
+        <w:jc w:val="both"/>
+      </w:pPr>
+      <w:r>
         <w:t xml:space="preserve">2. Zamawiający wyznacza osobę do kontaktów i koordynacji realizacji Umowy </w:t>
       </w:r>
       <w:r>
         <w:rPr>
           <w:highlight w:val="yellow"/>
         </w:rPr>
-        <w:t>[Piotr Ziąbrowski, tel. 606 150 956]</w:t>
+        <w:t xml:space="preserve">[Piotr </w:t>
+      </w:r>
+      <w:proofErr w:type="spellStart"/>
+      <w:r>
+        <w:rPr>
+          <w:highlight w:val="yellow"/>
+        </w:rPr>
+        <w:t>Ziąbrowski</w:t>
+      </w:r>
+      <w:proofErr w:type="spellEnd"/>
+      <w:r>
+        <w:rPr>
+          <w:highlight w:val="yellow"/>
+        </w:rPr>
+        <w:t>, tel. 606 150 956]</w:t>
       </w:r>
       <w:r>
         <w:t xml:space="preserve">. Wykonawca wyznacza Koordynatora Wykonawcy: </w:t>
@@ -1322,7 +1224,39 @@
           <w:b/>
           <w:bCs/>
         </w:rPr>
-        <w:t>[[……]] dni kalendarzowych od dnia zawarcia Umowy</w:t>
+        <w:t xml:space="preserve">[</w:t>
+      </w:r>
+      <w:del w:id="5039" w:author="Ewa Retajczyk" w:date="2026-10-20T15:01:49Z">
+        <w:r>
+          <w:rPr>
+            <w:b/>
+            <w:bCs/>
+          </w:rPr>
+          <w:delText xml:space="preserve">[</w:delText>
+        </w:r>
+      </w:del>
+      <w:r>
+        <w:rPr>
+          <w:b/>
+          <w:bCs/>
+        </w:rPr>
+        <w:t xml:space="preserve">……</w:t>
+      </w:r>
+      <w:del w:id="5040" w:author="Ewa Retajczyk" w:date="2026-10-20T15:01:53Z">
+        <w:r>
+          <w:rPr>
+            <w:b/>
+            <w:bCs/>
+          </w:rPr>
+          <w:delText xml:space="preserve">]</w:delText>
+        </w:r>
+      </w:del>
+      <w:r>
+        <w:rPr>
+          <w:b/>
+          <w:bCs/>
+        </w:rPr>
+        <w:t xml:space="preserve">] dni kalendarzowych od dnia zawarcia Umowy</w:t>
       </w:r>
       <w:r>
         <w:t xml:space="preserve">, zgodnym z Ofertą, nie później niż do dnia </w:t>
@@ -1332,7 +1266,7 @@
           <w:b/>
           <w:bCs/>
         </w:rPr>
-        <w:t>30.11.2026 r.</w:t>
+        <w:t xml:space="preserve">30.11.2026 r.</w:t>
       </w:r>
     </w:p>
     <w:p>
@@ -1362,140 +1296,159 @@
         <w:jc w:val="both"/>
       </w:pPr>
       <w:r>
-        <w:t xml:space="preserve">3. Strony przyjmują, że termin zakończenia całej Inwestycji wynika z Umowy o dofinansowanie (31.12.2026 r.)</w:t>
-      </w:r>
-      <w:ins w:id="5042" w:author="Ewa Retajczyk" w:date="2026-10-20T14:14:21Z">
-        <w:r>
-          <w:t xml:space="preserve">,</w:t>
+        <w:t xml:space="preserve">3. Strony przyjmują, że termin zakończenia całej Inwestycji wynika z Umowy o dofinansowanie (31.12.2026 r.), a datą zakończenia realizacji Inwestycji jest – zgodnie z Umową o dofinansowanie – data ostatniego protokołu UDT dopuszczającego Stację ładowania do eksploatacji. Wykonawca zapewnia swój udział w </w:t>
+      </w:r>
+      <w:r>
+        <w:lastRenderedPageBreak/>
+        <w:t xml:space="preserve">badaniach UDT i usuwanie usterek w terminie umożliwiającym uzyskanie dopuszczenia wszystkich Stacji ładowania do eksploatacji </w:t>
+      </w:r>
+      <w:proofErr w:type="gramStart"/>
+      <w:r>
+        <w:t>nie później</w:t>
+      </w:r>
+      <w:proofErr w:type="gramEnd"/>
+      <w:r>
+        <w:t xml:space="preserve"> niż do dnia 31.12.2026 r. (albo do terminu wynikającego z aneksu do Umowy o dofinansowanie). </w:t>
+      </w:r>
+    </w:p>
+    <w:p>
+      <w:pPr>
+        <w:spacing w:after="100" w:line="268" w:lineRule="auto"/>
+        <w:ind w:left="420" w:hanging="420"/>
+        <w:jc w:val="both"/>
+      </w:pPr>
+      <w:r>
+        <w:t xml:space="preserve">4. Terminy, o których mowa w ust. 1 i 2, ulegają przedłużeniu o czas trwania przeszkód, za które Wykonawca nie odpowiada, w szczególności: opóźnienia w gotowości fundamentów, stanowisk lub zasilania (Zamówienia nr 2 i nr 3), działań operatora sieci dystrybucyjnej, organów administracji lub UDT, oraz siły wyższej – pod warunkiem, że Wykonawca powiadomił o przeszkodzie niezwłocznie, nie później niż w ciągu 3 dni od jej wystąpienia, i udokumentował jej wpływ na termin. </w:t>
+      </w:r>
+      <w:del w:id="5041" w:author="Ewa Retajczyk" w:date="2026-10-20T15:02:05Z">
+        <w:r>
+          <w:delText xml:space="preserve">Zmiana</w:delText>
+        </w:r>
+      </w:del>
+      <w:ins w:id="5042" w:author="Ewa Retajczyk" w:date="2026-10-20T15:02:10Z">
+        <w:r>
+          <w:t xml:space="preserve">Przedłużenie</w:t>
         </w:r>
       </w:ins>
       <w:r>
+        <w:t xml:space="preserve"> terminu </w:t>
+      </w:r>
+      <w:del w:id="5043" w:author="Ewa Retajczyk" w:date="2026-10-20T15:02:25Z">
+        <w:r>
+          <w:delText xml:space="preserve">następuje</w:delText>
+        </w:r>
+      </w:del>
+      <w:ins w:id="5044" w:author="Ewa Retajczyk" w:date="2026-10-20T15:02:43Z">
+        <w:r>
+          <w:t xml:space="preserve">Strony</w:t>
+        </w:r>
+      </w:ins>
+      <w:r>
         <w:t xml:space="preserve"> </w:t>
       </w:r>
-      <w:del w:id="5043" w:author="Ewa Retajczyk" w:date="2026-10-20T14:14:37Z">
-        <w:r>
-          <w:delText xml:space="preserve">oraz</w:delText>
+      <w:del w:id="5045" w:author="Ewa Retajczyk" w:date="2026-10-20T15:03:30Z">
+        <w:r>
+          <w:delText xml:space="preserve">wówczas</w:delText>
         </w:r>
       </w:del>
-      <w:ins w:id="5044" w:author="Ewa Retajczyk" w:date="2026-10-20T14:14:53Z">
-        <w:r>
-          <w:t xml:space="preserve">a</w:t>
+      <w:ins w:id="5046" w:author="Ewa Retajczyk" w:date="2026-10-20T15:03:32Z">
+        <w:r>
+          <w:t xml:space="preserve">potwierdzają</w:t>
         </w:r>
       </w:ins>
       <w:r>
         <w:t xml:space="preserve"> </w:t>
       </w:r>
-      <w:del w:id="5045" w:author="Ewa Retajczyk" w:date="2026-10-20T14:15:25Z">
-        <w:r>
-          <w:delText xml:space="preserve">że</w:delText>
+      <w:del w:id="5047" w:author="Ewa Retajczyk" w:date="2026-10-20T15:03:32Z">
+        <w:r>
+          <w:delText xml:space="preserve">w</w:delText>
         </w:r>
       </w:del>
-      <w:ins w:id="5046" w:author="Ewa Retajczyk" w:date="2026-10-20T14:15:38Z">
-        <w:r>
-          <w:t xml:space="preserve">datą</w:t>
+      <w:ins w:id="5048" w:author="Ewa Retajczyk" w:date="2026-10-20T15:03:42Z">
+        <w:r>
+          <w:t xml:space="preserve">aneksem</w:t>
         </w:r>
       </w:ins>
       <w:r>
         <w:t xml:space="preserve"> </w:t>
       </w:r>
-      <w:del w:id="5047" w:author="Ewa Retajczyk" w:date="2026-10-20T14:15:52Z">
-        <w:r>
-          <w:delText xml:space="preserve">badania</w:delText>
+      <w:del w:id="5049" w:author="Ewa Retajczyk" w:date="2026-10-20T15:03:52Z">
+        <w:r>
+          <w:delText xml:space="preserve">formie</w:delText>
         </w:r>
       </w:del>
-      <w:ins w:id="5048" w:author="Ewa Retajczyk" w:date="2026-10-20T14:16:36Z">
-        <w:r>
-          <w:t xml:space="preserve">zakończenia realizacji Inwestycji jest – zgodnie z Umową o dofinansowanie – data ostatniego protokołu</w:t>
+      <w:ins w:id="5050" w:author="Ewa Retajczyk" w:date="2026-10-20T15:04:19Z">
+        <w:r>
+          <w:t xml:space="preserve">do</w:t>
         </w:r>
       </w:ins>
       <w:r>
-        <w:t xml:space="preserve"> UDT </w:t>
-      </w:r>
-      <w:del w:id="5049" w:author="Ewa Retajczyk" w:date="2026-10-20T14:16:43Z">
-        <w:r>
-          <w:delText xml:space="preserve">i</w:delText>
+        <w:t xml:space="preserve"> </w:t>
+      </w:r>
+      <w:del w:id="5051" w:author="Ewa Retajczyk" w:date="2026-10-20T15:04:31Z">
+        <w:r>
+          <w:delText xml:space="preserve">pisemnej</w:delText>
         </w:r>
       </w:del>
-      <w:ins w:id="5050" w:author="Ewa Retajczyk" w:date="2026-10-20T14:16:58Z">
-        <w:r>
-          <w:t xml:space="preserve">dopuszczającego</w:t>
+      <w:ins w:id="5052" w:author="Ewa Retajczyk" w:date="2026-10-20T15:04:31Z">
+        <w:r>
+          <w:t xml:space="preserve">Umowy</w:t>
         </w:r>
       </w:ins>
       <w:r>
+        <w:t xml:space="preserve"> (</w:t>
+      </w:r>
+      <w:del w:id="5053" w:author="Ewa Retajczyk" w:date="2026-10-20T15:04:33Z">
+        <w:r>
+          <w:delText xml:space="preserve">potwierdzenie</w:delText>
+        </w:r>
+      </w:del>
+      <w:ins w:id="5054" w:author="Ewa Retajczyk" w:date="2026-10-20T15:05:02Z">
+        <w:r>
+          <w:t xml:space="preserve">§</w:t>
+        </w:r>
+      </w:ins>
+      <w:r>
         <w:t xml:space="preserve"> </w:t>
       </w:r>
-      <w:del w:id="5051" w:author="Ewa Retajczyk" w:date="2026-10-20T14:17:06Z">
-        <w:r>
-          <w:delText xml:space="preserve">uzyskanie dopuszczenia Stacji</w:delText>
+      <w:del w:id="5055" w:author="Ewa Retajczyk" w:date="2026-10-20T15:05:17Z">
+        <w:r>
+          <w:delText xml:space="preserve">e-mailowe</w:delText>
         </w:r>
       </w:del>
-      <w:ins w:id="5052" w:author="Ewa Retajczyk" w:date="2026-10-20T14:17:20Z">
-        <w:r>
-          <w:t xml:space="preserve">Stację</w:t>
+      <w:ins w:id="5056" w:author="Ewa Retajczyk" w:date="2026-10-20T15:05:25Z">
+        <w:r>
+          <w:t xml:space="preserve">15</w:t>
         </w:r>
       </w:ins>
       <w:r>
-        <w:t xml:space="preserve"> ładowania do eksploatacji</w:t>
-      </w:r>
-      <w:del w:id="5053" w:author="Ewa Retajczyk" w:date="2026-10-20T14:17:58Z">
-        <w:r>
-          <w:delText xml:space="preserve"> mogą nastąpić w terminie do 60 dni od zakończenia realizacji Inwestycji</w:delText>
+        <w:t xml:space="preserve"> </w:t>
+      </w:r>
+      <w:del w:id="5057" w:author="Ewa Retajczyk" w:date="2026-10-20T15:06:10Z">
+        <w:r>
+          <w:delText xml:space="preserve">jest</w:delText>
         </w:r>
       </w:del>
-      <w:r>
-        <w:t xml:space="preserve">. </w:t>
-      </w:r>
-      <w:r>
-        <w:t xml:space="preserve">Wykonawca zapewnia swój udział w badaniach UDT i usuwanie usterek </w:t>
-      </w:r>
-      <w:del w:id="5054" w:author="Ewa Retajczyk" w:date="2026-10-20T14:18:07Z">
-        <w:r>
-          <w:delText xml:space="preserve">również </w:delText>
+      <w:ins w:id="5058" w:author="Ewa Retajczyk" w:date="2026-10-20T15:06:41Z">
+        <w:r>
+          <w:t xml:space="preserve">ust.</w:t>
+        </w:r>
+      </w:ins>
+      <w:r>
+        <w:t xml:space="preserve"> </w:t>
+      </w:r>
+      <w:del w:id="5059" w:author="Ewa Retajczyk" w:date="2026-10-20T15:06:57Z">
+        <w:r>
+          <w:delText xml:space="preserve">wystarczające</w:delText>
         </w:r>
       </w:del>
-      <w:r>
-        <w:t xml:space="preserve">w </w:t>
-      </w:r>
-      <w:del w:id="5055" w:author="Ewa Retajczyk" w:date="2026-10-20T14:18:14Z">
-        <w:r>
-          <w:delText xml:space="preserve">tym</w:delText>
-        </w:r>
-      </w:del>
-      <w:ins w:id="5056" w:author="Ewa Retajczyk" w:date="2026-10-20T14:18:28Z">
-        <w:r>
-          <w:t xml:space="preserve">terminie</w:t>
+      <w:ins w:id="5060" w:author="Ewa Retajczyk" w:date="2026-10-20T15:07:00Z">
+        <w:r>
+          <w:t xml:space="preserve">2 lit. b</w:t>
         </w:r>
       </w:ins>
       <w:r>
-        <w:t xml:space="preserve"> </w:t>
-      </w:r>
-      <w:del w:id="5057" w:author="Ewa Retajczyk" w:date="2026-10-20T14:18:57Z">
-        <w:r>
-          <w:delText xml:space="preserve">okresie</w:delText>
-        </w:r>
-      </w:del>
-      <w:ins w:id="5058" w:author="Ewa Retajczyk" w:date="2026-10-20T14:19:23Z">
-        <w:r>
-          <w:t xml:space="preserve">umożliwiającym uzyskanie dopuszczenia wszystkich Stacji ładowania do eksploatacji nie później niż do dnia 31</w:t>
-        </w:r>
-      </w:ins>
-      <w:r>
-        <w:t xml:space="preserve">.</w:t>
-      </w:r>
-      <w:ins w:id="5059" w:author="Ewa Retajczyk" w:date="2026-10-20T14:19:33Z">
-        <w:r>
-          <w:t xml:space="preserve">12.2026 r. (albo do terminu wynikającego z aneksu do Umowy o dofinansowanie). Termin 60 dni od zakończenia realizacji Inwestycji dotyczy przedłożenia dokumentów rozliczeniowych do NFOŚiGW i nie przedłuża terminu badań UDT.</w:t>
-        </w:r>
-      </w:ins>
-    </w:p>
-    <w:p>
-      <w:pPr>
-        <w:spacing w:after="100" w:line="268" w:lineRule="auto"/>
-        <w:ind w:left="420" w:hanging="420"/>
-        <w:jc w:val="both"/>
-      </w:pPr>
-      <w:r>
-        <w:t>4. Terminy, o których mowa w ust. 1 i 2, ulegają przedłużeniu o czas trwania przeszkód, za które Wykonawca nie odpowiada, w szczególności: opóźnienia w gotowości fundamentów, stanowisk lub zasilania (Zamówienia nr 2 i nr 3), działań operatora sieci dystrybucyjnej, organów administracji lub UDT, oraz siły wyższej – pod warunkiem, że Wykonawca powiadomił o przeszkodzie niezwłocznie, nie później niż w ciągu 3 dni od jej wystąpienia, i udokumentował jej wpływ na termin. Zmiana terminu następuje wówczas w formie pisemnej (potwierdzenie e-mailowe jest wystarczające).</w:t>
+        <w:t xml:space="preserve">).</w:t>
       </w:r>
     </w:p>
     <w:p>
@@ -1566,7 +1519,39 @@
           <w:b/>
           <w:bCs/>
         </w:rPr>
-        <w:t>[[……]] zł netto</w:t>
+        <w:t xml:space="preserve">[</w:t>
+      </w:r>
+      <w:del w:id="5061" w:author="Ewa Retajczyk" w:date="2026-10-20T15:07:19Z">
+        <w:r>
+          <w:rPr>
+            <w:b/>
+            <w:bCs/>
+          </w:rPr>
+          <w:delText xml:space="preserve">[</w:delText>
+        </w:r>
+      </w:del>
+      <w:r>
+        <w:rPr>
+          <w:b/>
+          <w:bCs/>
+        </w:rPr>
+        <w:t xml:space="preserve">……</w:t>
+      </w:r>
+      <w:del w:id="5062" w:author="Ewa Retajczyk" w:date="2026-10-20T15:07:25Z">
+        <w:r>
+          <w:rPr>
+            <w:b/>
+            <w:bCs/>
+          </w:rPr>
+          <w:delText xml:space="preserve">]</w:delText>
+        </w:r>
+      </w:del>
+      <w:r>
+        <w:rPr>
+          <w:b/>
+          <w:bCs/>
+        </w:rPr>
+        <w:t xml:space="preserve">] zł netto</w:t>
       </w:r>
       <w:r>
         <w:t xml:space="preserve"> (słownie: </w:t>
@@ -1575,13 +1560,13 @@
         <w:rPr>
           <w:highlight w:val="yellow"/>
         </w:rPr>
-        <w:t>[……]</w:t>
-      </w:r>
-      <w:r>
-        <w:t>), powiększone o podatek VAT</w:t>
-      </w:r>
-      <w:r>
-        <w:t>,</w:t>
+        <w:t xml:space="preserve">[……]</w:t>
+      </w:r>
+      <w:r>
+        <w:t xml:space="preserve">), powiększone o podatek VAT</w:t>
+      </w:r>
+      <w:r>
+        <w:t xml:space="preserve">,</w:t>
       </w:r>
       <w:r>
         <w:t xml:space="preserve"> tj. </w:t>
@@ -1591,16 +1576,48 @@
           <w:b/>
           <w:bCs/>
         </w:rPr>
-        <w:t>[[……]] zł brutto</w:t>
+        <w:t xml:space="preserve">[</w:t>
+      </w:r>
+      <w:del w:id="5063" w:author="Ewa Retajczyk" w:date="2026-10-20T15:07:52Z">
+        <w:r>
+          <w:rPr>
+            <w:b/>
+            <w:bCs/>
+          </w:rPr>
+          <w:delText xml:space="preserve">[</w:delText>
+        </w:r>
+      </w:del>
+      <w:r>
+        <w:rPr>
+          <w:b/>
+          <w:bCs/>
+        </w:rPr>
+        <w:t xml:space="preserve">……</w:t>
+      </w:r>
+      <w:del w:id="5064" w:author="Ewa Retajczyk" w:date="2026-10-20T15:08:21Z">
+        <w:r>
+          <w:rPr>
+            <w:b/>
+            <w:bCs/>
+          </w:rPr>
+          <w:delText xml:space="preserve">]</w:delText>
+        </w:r>
+      </w:del>
+      <w:r>
+        <w:rPr>
+          <w:b/>
+          <w:bCs/>
+        </w:rPr>
+        <w:t xml:space="preserve">] zł brutto</w:t>
       </w:r>
       <w:r>
         <w:t xml:space="preserve">, zgodnie z Ofertą w Załączniku nr </w:t>
       </w:r>
       <w:r>
-        <w:t>1</w:t>
-      </w:r>
-      <w:r>
-        <w:t>.</w:t>
+        <w:t xml:space="preserve">1</w:t>
+      </w:r>
+      <w:r>
+        <w:t xml:space="preserve">.</w:t>
       </w:r>
     </w:p>
     <w:p>
@@ -1666,11 +1683,19 @@
       <w:r>
         <w:t xml:space="preserve"> dni od doręczenia faktury zaliczkowej, </w:t>
       </w:r>
-      <w:r>
-        <w:rPr>
-          <w:highlight w:val="yellow"/>
-        </w:rPr>
-        <w:t>nie wcześniej niż po złożeniu przez Wykonawcę zabezpieczenia zwrotu zaliczki, o którym mowa w ust. 5;</w:t>
+      <w:proofErr w:type="gramStart"/>
+      <w:r>
+        <w:rPr>
+          <w:highlight w:val="yellow"/>
+        </w:rPr>
+        <w:t>nie wcześniej</w:t>
+      </w:r>
+      <w:proofErr w:type="gramEnd"/>
+      <w:r>
+        <w:rPr>
+          <w:highlight w:val="yellow"/>
+        </w:rPr>
+        <w:t xml:space="preserve"> niż po złożeniu przez Wykonawcę zabezpieczenia zwrotu zaliczki, o którym mowa w ust. 5;</w:t>
       </w:r>
     </w:p>
     <w:p>
@@ -1687,7 +1712,7 @@
           <w:b/>
           <w:bCs/>
         </w:rPr>
-        <w:t xml:space="preserve">pozostała część wartości pozycji 1</w:t>
+        <w:t>pozostała część wartości pozycji 1</w:t>
       </w:r>
       <w:r>
         <w:t xml:space="preserve"> (Stacje ładowania) – w terminie </w:t>
@@ -1696,31 +1721,10 @@
         <w:rPr>
           <w:highlight w:val="yellow"/>
         </w:rPr>
-        <w:t xml:space="preserve">[14]</w:t>
-      </w:r>
-      <w:r>
-        <w:t xml:space="preserve"> dni od </w:t>
-      </w:r>
-      <w:del w:id="5060" w:author="Ewa Retajczyk" w:date="2026-10-20T14:20:17Z">
-        <w:r>
-          <w:delText xml:space="preserve">doręczenia</w:delText>
-        </w:r>
-      </w:del>
-      <w:ins w:id="5061" w:author="Ewa Retajczyk" w:date="2026-10-20T14:21:00Z">
-        <w:r>
-          <w:t xml:space="preserve">dnia dostawy, na podstawie</w:t>
-        </w:r>
-      </w:ins>
-      <w:r>
-        <w:t xml:space="preserve"> faktury</w:t>
-      </w:r>
-      <w:ins w:id="5062" w:author="Ewa Retajczyk" w:date="2026-10-20T14:21:26Z">
-        <w:r>
-          <w:t xml:space="preserve"> VAT</w:t>
-        </w:r>
-      </w:ins>
-      <w:r>
-        <w:t xml:space="preserve"> wystawionej po podpisaniu protokołu odbioru dostawy;</w:t>
+        <w:t>[14]</w:t>
+      </w:r>
+      <w:r>
+        <w:t xml:space="preserve"> dni od dnia dostawy, na podstawie faktury VAT wystawionej po podpisaniu protokołu odbioru dostawy;</w:t>
       </w:r>
     </w:p>
     <w:p>
@@ -1767,15 +1771,7 @@
           <w:bCs/>
           <w:highlight w:val="yellow"/>
         </w:rPr>
-        <w:t xml:space="preserve">3</w:t>
-      </w:r>
-      <w:r>
-        <w:rPr>
-          <w:b/>
-          <w:bCs/>
-          <w:highlight w:val="yellow"/>
-        </w:rPr>
-        <w:t xml:space="preserve">%</w:t>
+        <w:t>3%</w:t>
       </w:r>
       <w:r>
         <w:rPr>
@@ -1791,29 +1787,10 @@
         <w:rPr>
           <w:highlight w:val="yellow"/>
         </w:rPr>
-        <w:t xml:space="preserve">[14]</w:t>
-      </w:r>
-      <w:r>
-        <w:t xml:space="preserve"> dni od podpisania protokołu odbioru końcowego (§ 8 ust. </w:t>
-      </w:r>
-      <w:del w:id="5063" w:author="Ewa Retajczyk" w:date="2026-10-20T14:21:54Z">
-        <w:r>
-          <w:delText xml:space="preserve">7</w:delText>
-        </w:r>
-      </w:del>
-      <w:ins w:id="5064" w:author="Ewa Retajczyk" w:date="2026-10-20T14:21:58Z">
-        <w:r>
-          <w:t xml:space="preserve">5</w:t>
-        </w:r>
-      </w:ins>
-      <w:r>
-        <w:t xml:space="preserve">)</w:t>
-      </w:r>
-      <w:r>
-        <w:t xml:space="preserve">. </w:t>
-      </w:r>
-      <w:r>
-        <w:t xml:space="preserve">Kwota ta jest potrącana z faktur, o których mowa w lit. b–c, i stanowi zabezpieczenie należytego wykonania Umowy; Zamawiający nie wymaga dodatkowego zabezpieczenia.</w:t>
+        <w:t>[14]</w:t>
+      </w:r>
+      <w:r>
+        <w:t xml:space="preserve"> dni od podpisania protokołu odbioru końcowego (§ 8 ust. 5). Kwota ta jest potrącana z faktur, o których mowa w lit. b–c, i stanowi zabezpieczenie należytego wykonania Umowy; Zamawiający nie wymaga dodatkowego zabezpieczenia.</w:t>
       </w:r>
     </w:p>
     <w:p>
@@ -1825,11 +1802,16 @@
       <w:r>
         <w:t xml:space="preserve">4. Wykonawca wystawia faktury w złotych polskich, w podziale na pozycje wskazane w Załączniku nr </w:t>
       </w:r>
+      <w:proofErr w:type="gramStart"/>
       <w:r>
         <w:t>1</w:t>
       </w:r>
       <w:r>
-        <w:t xml:space="preserve">, i doręcza je Zamawiającemu na adres e-mail </w:t>
+        <w:t>,</w:t>
+      </w:r>
+      <w:proofErr w:type="gramEnd"/>
+      <w:r>
+        <w:t xml:space="preserve"> i doręcza je Zamawiającemu na adres e-mail </w:t>
       </w:r>
       <w:r>
         <w:rPr>
@@ -1844,7 +1826,14 @@
         <w:rPr>
           <w:highlight w:val="yellow"/>
         </w:rPr>
-        <w:t>[nr rachunku z wykazu podatników VAT]</w:t>
+        <w:t xml:space="preserve">[nr rachunku z wykazu </w:t>
+      </w:r>
+      <w:r>
+        <w:rPr>
+          <w:highlight w:val="yellow"/>
+        </w:rPr>
+        <w:lastRenderedPageBreak/>
+        <w:t>podatników VAT]</w:t>
       </w:r>
       <w:r>
         <w:t xml:space="preserve"> z zastosowaniem mechanizmu podzielonej płatności, jeżeli przepisy tego wymagają. Dniem zapłaty jest dzień obciążenia rachunku Zamawiającego.</w:t>
@@ -1931,7 +1920,7 @@
         <w:rPr>
           <w:highlight w:val="yellow"/>
         </w:rPr>
-        <w:t xml:space="preserve">3 dni robocze</w:t>
+        <w:t>3 dni robocze</w:t>
       </w:r>
       <w:r>
         <w:t xml:space="preserve"> wcześniej. Zamawiający dokonuje w ciągu </w:t>
@@ -1940,74 +1929,89 @@
         <w:rPr>
           <w:highlight w:val="yellow"/>
         </w:rPr>
-        <w:t xml:space="preserve">3 dni roboczych</w:t>
-      </w:r>
-      <w:r>
-        <w:t xml:space="preserve"> odbioru ilościowo-jakościowego (kompletność, numery seryjne, stan, dokumentacja, w tym dokumenty z </w:t>
-      </w:r>
-      <w:r>
-        <w:t xml:space="preserve">Załącznika nr </w:t>
-      </w:r>
-      <w:del w:id="5065" w:author="Ewa Retajczyk" w:date="2026-10-20T14:22:55Z">
-        <w:r>
-          <w:delText xml:space="preserve">5</w:delText>
-        </w:r>
-      </w:del>
-      <w:ins w:id="5066" w:author="Ewa Retajczyk" w:date="2026-10-20T14:22:58Z">
-        <w:r>
-          <w:t xml:space="preserve">3</w:t>
+        <w:t>3 dni roboczych</w:t>
+      </w:r>
+      <w:r>
+        <w:t xml:space="preserve"> odbioru ilościowo-jakościowego (kompletność, numery seryjne, stan, dokumentacja, w tym dokumenty z Załącznika nr 3). Z odbioru sporządza się protokół odbioru dostawy (Załącznik nr 2).</w:t>
+      </w:r>
+    </w:p>
+    <w:p>
+      <w:pPr>
+        <w:spacing w:after="100" w:line="268" w:lineRule="auto"/>
+        <w:ind w:left="420" w:hanging="420"/>
+        <w:jc w:val="both"/>
+      </w:pPr>
+      <w:r>
+        <w:t xml:space="preserve">2. Odbiór </w:t>
+      </w:r>
+      <w:r>
+        <w:t>stacji</w:t>
+      </w:r>
+      <w:r>
+        <w:t xml:space="preserve">: po zakończeniu montażu, konfiguracji i uruchomienia Wykonawca zgłasza gotowość do odbioru. Odbiór obejmuje m.in.: kompletność dostawy, numery seryjne, dokumentację, testy bezpieczeństwa, wyłączenia awaryjnego, ładowania każdego punktu, komunikacji i OCPP, zdalnego monitoringu, systemu zarządzania, płatności, prezentacji ceny, przekazywania danych, funkcjonalności przewodów rezerwowych (jeśli zaoferowano), pracy równoczesnej punktów, współpracy z systemem ograniczania mocy AC, Systemu monitorowania, udział w teście wspólnym. Wykonawca przedstawia wyniki testów. Zamawiający dokonuje odbioru w ciągu </w:t>
+      </w:r>
+      <w:r>
+        <w:rPr>
+          <w:highlight w:val="yellow"/>
+        </w:rPr>
+        <w:t>5 dni roboczych</w:t>
+      </w:r>
+      <w:r>
+        <w:t xml:space="preserve"> od zgłoszenia i sporządza protokół odbioru technologii (Załącznik nr </w:t>
+      </w:r>
+      <w:r>
+        <w:t>2</w:t>
+      </w:r>
+      <w:r>
+        <w:t>).</w:t>
+      </w:r>
+    </w:p>
+    <w:p>
+      <w:pPr>
+        <w:spacing w:after="100" w:line="268" w:lineRule="auto"/>
+        <w:ind w:left="420" w:hanging="420"/>
+        <w:jc w:val="both"/>
+      </w:pPr>
+      <w:r>
+        <w:t>3. W przypadku wad istotnych (uniemożliwiających użytkowanie, badania UDT lub osiągnięcie efektu rzeczowego) Zamawiający odmawia odbioru i wyznacza termin usunięcia wad; przy wadach nieistotnych odbiór następuje z wyznaczeniem terminu ich usunięcia. Wykonawca usuwa wady na własny koszt i zgłasza gotowość do ponownego odbioru. Wykonawca nie jest uprawniony do jednostronnego podpisania protokołu.</w:t>
+      </w:r>
+    </w:p>
+    <w:p>
+      <w:pPr>
+        <w:spacing w:after="100" w:line="268" w:lineRule="auto"/>
+        <w:ind w:left="420" w:hanging="420"/>
+        <w:jc w:val="both"/>
+      </w:pPr>
+      <w:r>
+        <w:t>4. Wykonawca zapewnia udział w badaniach UDT dla każdej ze Stacji ładowania odrębnie i usuwa usterki stwierdzone w tych badaniach dotyczące jego zakresu na własny koszt.</w:t>
+      </w:r>
+    </w:p>
+    <w:p>
+      <w:pPr>
+        <w:spacing w:after="100" w:line="268" w:lineRule="auto"/>
+        <w:ind w:left="420" w:hanging="420"/>
+        <w:jc w:val="both"/>
+      </w:pPr>
+      <w:r>
+        <w:t xml:space="preserve">5. Odbiór końcowy następuje po zakończeniu testów wspólnych, usunięciu wad i przekazaniu kompletu dokumentów z Załącznika nr 3</w:t>
+      </w:r>
+      <w:ins w:id="5065" w:author="Ewa Retajczyk" w:date="2026-10-20T15:08:32Z">
+        <w:r>
+          <w:t xml:space="preserve"> (z wyłączeniem poz. 14)</w:t>
         </w:r>
       </w:ins>
       <w:r>
-        <w:rPr>
-          <w:rStyle w:val="Odwoaniedokomentarza"/>
-          <w:sz w:val="22"/>
-          <w:szCs w:val="22"/>
-        </w:rPr>
-        <w:commentReference w:id="0"/>
-      </w:r>
-      <w:r>
-        <w:t xml:space="preserve">). Z odbioru sporządza się protokół odbioru dostawy (Załącznik nr </w:t>
-      </w:r>
-      <w:del w:id="5067" w:author="Ewa Retajczyk" w:date="2026-10-20T14:23:05Z">
-        <w:r>
-          <w:delText xml:space="preserve">4</w:delText>
-        </w:r>
-      </w:del>
-      <w:ins w:id="5068" w:author="Ewa Retajczyk" w:date="2026-10-20T14:23:11Z">
-        <w:r>
-          <w:t xml:space="preserve">2</w:t>
-        </w:r>
-      </w:ins>
-      <w:r>
-        <w:t xml:space="preserve">).</w:t>
-      </w:r>
-      <w:commentRangeStart w:id="0"/>
-      <w:commentRangeEnd w:id="0"/>
-    </w:p>
-    <w:p>
-      <w:pPr>
-        <w:spacing w:after="100" w:line="268" w:lineRule="auto"/>
-        <w:ind w:left="420" w:hanging="420"/>
-        <w:jc w:val="both"/>
-      </w:pPr>
-      <w:r>
-        <w:t xml:space="preserve">2. Odbiór </w:t>
-      </w:r>
-      <w:r>
-        <w:t>stacji</w:t>
-      </w:r>
-      <w:r>
-        <w:t xml:space="preserve">: po zakończeniu montażu, konfiguracji i uruchomienia Wykonawca zgłasza gotowość do odbioru. Odbiór obejmuje m.in.: kompletność dostawy, numery seryjne, dokumentację, testy bezpieczeństwa, wyłączenia awaryjnego, ładowania każdego punktu, komunikacji i OCPP, zdalnego monitoringu, systemu zarządzania, płatności, prezentacji ceny, przekazywania danych, funkcjonalności przewodów rezerwowych (jeśli zaoferowano), pracy równoczesnej punktów, współpracy z systemem ograniczania mocy AC, Systemu monitorowania, udział w teście wspólnym. Wykonawca przedstawia wyniki testów. Zamawiający dokonuje odbioru w ciągu </w:t>
-      </w:r>
-      <w:r>
-        <w:rPr>
-          <w:highlight w:val="yellow"/>
-        </w:rPr>
-        <w:t>5 dni roboczych</w:t>
-      </w:r>
-      <w:r>
-        <w:t xml:space="preserve"> od zgłoszenia i sporządza protokół odbioru technologii (Załącznik nr 4).</w:t>
+        <w:t xml:space="preserve">. Zamawiający sporządza protokół odbioru końcowego (Załącznik nr 2), który stanowi potwierdzenie realizacji Przedmiotu Umowy.</w:t>
+      </w:r>
+    </w:p>
+    <w:p>
+      <w:pPr>
+        <w:spacing w:after="100" w:line="268" w:lineRule="auto"/>
+        <w:ind w:left="420" w:hanging="420"/>
+        <w:jc w:val="both"/>
+      </w:pPr>
+      <w:r>
+        <w:t>6. Podpisanie protokołu odbioru nie zwalnia Wykonawcy z odpowiedzialności z tytułu gwarancji i rękojmi.</w:t>
       </w:r>
     </w:p>
     <w:p>
@@ -2018,72 +2022,6 @@
       </w:pPr>
       <w:r>
         <w:lastRenderedPageBreak/>
-        <w:t>3. W przypadku wad istotnych (uniemożliwiających użytkowanie, badania UDT lub osiągnięcie efektu rzeczowego) Zamawiający odmawia odbioru i wyznacza termin usunięcia wad; przy wadach nieistotnych odbiór następuje z wyznaczeniem terminu ich usunięcia. Wykonawca usuwa wady na własny koszt i zgłasza gotowość do ponownego odbioru. Wykonawca nie jest uprawniony do jednostronnego podpisania protokołu.</w:t>
-      </w:r>
-    </w:p>
-    <w:p>
-      <w:pPr>
-        <w:spacing w:after="100" w:line="268" w:lineRule="auto"/>
-        <w:ind w:left="420" w:hanging="420"/>
-        <w:jc w:val="both"/>
-      </w:pPr>
-      <w:r>
-        <w:t>4. Wykonawca zapewnia udział w badaniach UDT dla każdej ze Stacji ładowania odrębnie i usuwa usterki stwierdzone w tych badaniach dotyczące jego zakresu na własny koszt.</w:t>
-      </w:r>
-    </w:p>
-    <w:p>
-      <w:pPr>
-        <w:spacing w:after="100" w:line="268" w:lineRule="auto"/>
-        <w:ind w:left="420" w:hanging="420"/>
-        <w:jc w:val="both"/>
-      </w:pPr>
-      <w:r>
-        <w:t xml:space="preserve">5. Odbiór końcowy następuje po zakończeniu testów wspólnych, usunięciu wad i przekazaniu kompletu dokumentów z Załącznika nr </w:t>
-      </w:r>
-      <w:del w:id="5069" w:author="Ewa Retajczyk" w:date="2026-10-20T14:23:15Z">
-        <w:r>
-          <w:delText xml:space="preserve">5</w:delText>
-        </w:r>
-      </w:del>
-      <w:ins w:id="5070" w:author="Ewa Retajczyk" w:date="2026-10-20T14:23:25Z">
-        <w:r>
-          <w:t xml:space="preserve">3</w:t>
-        </w:r>
-      </w:ins>
-      <w:r>
-        <w:t xml:space="preserve">. Zamawiający sporządza protokół odbioru końcowego (Załącznik nr </w:t>
-      </w:r>
-      <w:del w:id="5071" w:author="Ewa Retajczyk" w:date="2026-10-20T14:23:33Z">
-        <w:r>
-          <w:delText xml:space="preserve">4</w:delText>
-        </w:r>
-      </w:del>
-      <w:ins w:id="5072" w:author="Ewa Retajczyk" w:date="2026-10-20T14:23:46Z">
-        <w:r>
-          <w:t xml:space="preserve">2</w:t>
-        </w:r>
-      </w:ins>
-      <w:r>
-        <w:t xml:space="preserve">), który stanowi potwierdzenie realizacji Przedmiotu Umowy.</w:t>
-      </w:r>
-    </w:p>
-    <w:p>
-      <w:pPr>
-        <w:spacing w:after="100" w:line="268" w:lineRule="auto"/>
-        <w:ind w:left="420" w:hanging="420"/>
-        <w:jc w:val="both"/>
-      </w:pPr>
-      <w:r>
-        <w:t>6. Podpisanie protokołu odbioru nie zwalnia Wykonawcy z odpowiedzialności z tytułu gwarancji i rękojmi.</w:t>
-      </w:r>
-    </w:p>
-    <w:p>
-      <w:pPr>
-        <w:spacing w:after="100" w:line="268" w:lineRule="auto"/>
-        <w:ind w:left="420" w:hanging="420"/>
-        <w:jc w:val="both"/>
-      </w:pPr>
-      <w:r>
         <w:t>7. Z chwilą podpisania protokołu odbioru końcowego ryzyko utraty lub uszkodzenia urządzeń przechodzi na Zamawiającego, z zastrzeżeniem § 11.</w:t>
       </w:r>
     </w:p>
@@ -2110,20 +2048,7 @@
         <w:jc w:val="both"/>
       </w:pPr>
       <w:r>
-        <w:t xml:space="preserve">1. Wykonawca przekaże dokumentację w zakresie i terminach wymienionych w Załączniku nr </w:t>
-      </w:r>
-      <w:del w:id="5073" w:author="Ewa Retajczyk" w:date="2026-10-20T14:25:05Z">
-        <w:r>
-          <w:delText xml:space="preserve">5</w:delText>
-        </w:r>
-      </w:del>
-      <w:ins w:id="5074" w:author="Ewa Retajczyk" w:date="2026-10-20T14:25:33Z">
-        <w:r>
-          <w:t xml:space="preserve">3</w:t>
-        </w:r>
-      </w:ins>
-      <w:r>
-        <w:t xml:space="preserve">, w języku polskim, w tym dokumentację techniczną (3 komplety + wersja elektroniczna) stanowiącą część Dokumentacji Powykonawczej, wymaganej przez UDT do badania technicznego (wstępnego) ogólnodostępnej stacji ładowania.</w:t>
+        <w:t>1. Wykonawca przekaże dokumentację w zakresie i terminach wymienionych w Załączniku nr 3, w języku polskim, w tym dokumentację techniczną (3 komplety + wersja elektroniczna) stanowiącą część Dokumentacji Powykonawczej, wymaganej przez UDT do badania technicznego (wstępnego) ogólnodostępnej stacji ładowania.</w:t>
       </w:r>
     </w:p>
     <w:p>
@@ -2232,53 +2157,37 @@
         <w:t>Prawa autorskie.</w:t>
       </w:r>
       <w:r>
-        <w:t xml:space="preserve"> Wykonawca przenosi na Zamawiającego, z chwilą ich powstania, autorskie prawa majątkowe do utworów powstałych w wykonaniu Umowy (w szczególności dokumentacji, schematów, konfiguracji i opracowań wykonanych na zamówienie) na wszystkich polach eksploatacji niezbędnych do korzystania z nich przez Zamawiającego, w tym utrwalania, zwielokrotniania, wprowadzania do pamięci komputera i sieci, modyfikowania i sporządzania opracowań, bez dodatkowego wynagrodzenia. </w:t>
-      </w:r>
+        <w:t xml:space="preserve"> Wykonawca przenosi na Zamawiającego, z chwilą ich powstania, autorskie prawa majątkowe do utworów powstałych w wykonaniu Umowy (w szczególności dokumentacji, schematów, konfiguracji i opracowań wykonanych na zamówienie) na wszystkich polach eksploatacji niezbędnych do korzystania z nich przez Zamawiającego, w tym utrwalania, zwielokrotniania, wprowadzania do pamięci komputera i sieci, modyfikowania i sporządzania opracowań, bez dodatkowego wynagrodzenia. Wykonawca zapewnia, że prawa te nie będą obciążone prawami osób trzecich, a osoby uprawnione z osobistych praw autorskich nie będą ich wykonywać wobec Zamawiającego i jego następców prawnych. W odniesieniu do oprogramowania standardowego Wykonawca udziela Zamawiającemu niewyłącznej licencji na okres co najmniej okresu gwarancji, a w razie wymogów programu – trwałości inwestycji (5 lat), z prawem do aktualizacji; zapewnia również możliwość zmiany platformy operatorskiej bez wymiany urządzeń.</w:t>
+      </w:r>
+    </w:p>
+    <w:p>
+      <w:pPr>
+        <w:spacing w:after="100" w:line="268" w:lineRule="auto"/>
+        <w:ind w:left="420" w:hanging="420"/>
+        <w:jc w:val="both"/>
+      </w:pPr>
+      <w:r>
+        <w:t xml:space="preserve">4. </w:t>
+      </w:r>
+      <w:r>
+        <w:rPr>
+          <w:b/>
+          <w:bCs/>
+        </w:rPr>
+        <w:t>Dokumenty rozliczeniowe.</w:t>
+      </w:r>
+      <w:r>
+        <w:t xml:space="preserve"> Wykonawca dostarczy dokumenty niezbędne do rozliczenia dotacji i potwierdzenia efektu rzeczowego (w tym dokumenty z Załącznika nr 3 oraz zdjęcia tabliczek znamionowych i dokumenty UDT dla każdej ze Stacji ładowania odrębnie) w terminie 14 dni od zakończenia realizacji Inwestycji, a dokumenty UDT niezwłocznie po uzyskaniu dopuszczenia do eksploatacji, tak aby Zamawiający mógł złożyć dokumenty do NFOŚiGW w terminach określonych w Umowie o dofinansowanie.</w:t>
+      </w:r>
+    </w:p>
+    <w:p>
+      <w:pPr>
+        <w:spacing w:after="100" w:line="268" w:lineRule="auto"/>
+        <w:ind w:left="420" w:hanging="420"/>
+        <w:jc w:val="both"/>
+      </w:pPr>
       <w:r>
         <w:lastRenderedPageBreak/>
-        <w:t>Wykonawca zapewnia, że prawa te nie będą obciążone prawami osób trzecich, a osoby uprawnione z osobistych praw autorskich nie będą ich wykonywać wobec Zamawiającego i jego następców prawnych. W odniesieniu do oprogramowania standardowego Wykonawca udziela Zamawiającemu niewyłącznej licencji na okres co najmniej okresu gwarancji, a w razie wymogów programu – trwałości inwestycji (5 lat), z prawem do aktualizacji; zapewnia również możliwość zmiany platformy operatorskiej bez wymiany urządzeń.</w:t>
-      </w:r>
-    </w:p>
-    <w:p>
-      <w:pPr>
-        <w:spacing w:after="100" w:line="268" w:lineRule="auto"/>
-        <w:ind w:left="420" w:hanging="420"/>
-        <w:jc w:val="both"/>
-      </w:pPr>
-      <w:r>
-        <w:t xml:space="preserve">4. </w:t>
-      </w:r>
-      <w:r>
-        <w:rPr>
-          <w:b/>
-          <w:bCs/>
-        </w:rPr>
-        <w:t xml:space="preserve">Dokumenty rozliczeniowe.</w:t>
-      </w:r>
-      <w:r>
-        <w:t xml:space="preserve"> Wykonawca dostarczy dokumenty niezbędne do rozliczenia dotacji i potwierdzenia efektu rzeczowego (w tym dokumenty z Załącznika nr </w:t>
-      </w:r>
-      <w:del w:id="5075" w:author="Ewa Retajczyk" w:date="2026-10-20T14:25:53Z">
-        <w:r>
-          <w:delText xml:space="preserve">5</w:delText>
-        </w:r>
-      </w:del>
-      <w:ins w:id="5076" w:author="Ewa Retajczyk" w:date="2026-10-20T14:26:02Z">
-        <w:r>
-          <w:t xml:space="preserve">3</w:t>
-        </w:r>
-      </w:ins>
-      <w:r>
-        <w:t xml:space="preserve"> oraz zdjęcia tabliczek znamionowych i dokumenty UDT dla każdej ze Stacji ładowania odrębnie) w terminie 14 dni od zakończenia realizacji Inwestycji, a dokumenty UDT niezwłocznie po uzyskaniu dopuszczenia do eksploatacji, tak aby Zamawiający mógł złożyć dokumenty do NFOŚiGW w terminach określonych w Umowie o dofinansowanie.</w:t>
-      </w:r>
-    </w:p>
-    <w:p>
-      <w:pPr>
-        <w:spacing w:after="100" w:line="268" w:lineRule="auto"/>
-        <w:ind w:left="420" w:hanging="420"/>
-        <w:jc w:val="both"/>
-      </w:pPr>
-      <w:r>
         <w:t xml:space="preserve">5. </w:t>
       </w:r>
       <w:r>
@@ -2385,10 +2294,42 @@
           <w:b/>
           <w:bCs/>
         </w:rPr>
-        <w:t>[[co najmniej 60]] miesięcy</w:t>
-      </w:r>
-      <w:r>
-        <w:t>, liczony od dnia podpisania protokołu UDT dopuszczającego do eksploatacji ostatniej Stacji ładowania. Okres gwarancji jest zgodny z Ofertą i nie może być krótszy niż 60 miesięcy.</w:t>
+        <w:t xml:space="preserve">[</w:t>
+      </w:r>
+      <w:del w:id="5066" w:author="Ewa Retajczyk" w:date="2026-10-20T15:08:38Z">
+        <w:r>
+          <w:rPr>
+            <w:b/>
+            <w:bCs/>
+          </w:rPr>
+          <w:delText xml:space="preserve">[co najmniej </w:delText>
+        </w:r>
+      </w:del>
+      <w:r>
+        <w:rPr>
+          <w:b/>
+          <w:bCs/>
+        </w:rPr>
+        <w:t xml:space="preserve">60</w:t>
+      </w:r>
+      <w:del w:id="5067" w:author="Ewa Retajczyk" w:date="2026-10-20T15:08:41Z">
+        <w:r>
+          <w:rPr>
+            <w:b/>
+            <w:bCs/>
+          </w:rPr>
+          <w:delText xml:space="preserve">]</w:delText>
+        </w:r>
+      </w:del>
+      <w:r>
+        <w:rPr>
+          <w:b/>
+          <w:bCs/>
+        </w:rPr>
+        <w:t xml:space="preserve">] miesięcy</w:t>
+      </w:r>
+      <w:r>
+        <w:t xml:space="preserve">, liczony od dnia podpisania protokołu UDT dopuszczającego do eksploatacji ostatniej Stacji ładowania. Okres gwarancji jest zgodny z Ofertą i nie może być krótszy niż 60 miesięcy.</w:t>
       </w:r>
     </w:p>
     <w:p>
@@ -2408,101 +2349,555 @@
         <w:jc w:val="both"/>
       </w:pPr>
       <w:r>
-        <w:t xml:space="preserve">3. Wykonawca zapewnia serwis gwarancyjny na zasadach z Oferty, w tym: czas reakcji zdalnej </w:t>
-      </w:r>
-      <w:r>
-        <w:rPr>
-          <w:highlight w:val="yellow"/>
-        </w:rPr>
-        <w:t>[…]</w:t>
-      </w:r>
-      <w:r>
-        <w:t xml:space="preserve"> godz., czas reakcji serwisowej na miejscu </w:t>
-      </w:r>
-      <w:r>
-        <w:rPr>
-          <w:highlight w:val="yellow"/>
-        </w:rPr>
-        <w:t>[…]</w:t>
-      </w:r>
-      <w:r>
-        <w:t xml:space="preserve"> godz., maksymalny czas usunięcia awarii </w:t>
-      </w:r>
-      <w:r>
-        <w:rPr>
-          <w:highlight w:val="yellow"/>
-        </w:rPr>
-        <w:t>[…]</w:t>
-      </w:r>
-      <w:r>
-        <w:t xml:space="preserve"> godz./dni, dostępność części zamiennych przez okres co najmniej </w:t>
-      </w:r>
-      <w:r>
-        <w:rPr>
-          <w:highlight w:val="yellow"/>
-        </w:rPr>
-        <w:t>[…]</w:t>
-      </w:r>
-      <w:r>
-        <w:t xml:space="preserve"> lat, przeglądy okresowe zgodnie z zaleceniami producenta, aktualizacje oprogramowania i warunki utrzymania systemu po zakończeniu gwarancji. W razie niezgodności z Ofertą stosuje się wartości korzystniejsze dla Zamawiającego.</w:t>
-      </w:r>
-    </w:p>
-    <w:p>
-      <w:pPr>
-        <w:spacing w:after="100" w:line="268" w:lineRule="auto"/>
-        <w:ind w:left="420" w:hanging="420"/>
-        <w:jc w:val="both"/>
-      </w:pPr>
+        <w:t xml:space="preserve">3. Wykonawca zapewnia serwis gwarancyjny </w:t>
+      </w:r>
+      <w:del w:id="5068" w:author="Ewa Retajczyk" w:date="2026-10-20T15:08:59Z">
+        <w:r>
+          <w:delText xml:space="preserve">na zasadach z Oferty, </w:delText>
+        </w:r>
+      </w:del>
+      <w:r>
+        <w:t xml:space="preserve">w </w:t>
+      </w:r>
+      <w:del w:id="5069" w:author="Ewa Retajczyk" w:date="2026-10-20T15:09:15Z">
+        <w:r>
+          <w:delText xml:space="preserve">tym</w:delText>
+        </w:r>
+      </w:del>
+      <w:ins w:id="5070" w:author="Ewa Retajczyk" w:date="2026-10-20T15:09:24Z">
+        <w:r>
+          <w:t xml:space="preserve">następujących parametrach</w:t>
+        </w:r>
+      </w:ins>
+      <w:r>
+        <w:t xml:space="preserve">: czas reakcji zdalnej </w:t>
+      </w:r>
+      <w:ins w:id="5071" w:author="Ewa Retajczyk" w:date="2026-10-20T15:09:25Z">
+        <w:r>
+          <w:t xml:space="preserve">– do </w:t>
+        </w:r>
+      </w:ins>
+      <w:r>
+        <w:rPr>
+          <w:highlight w:val="yellow"/>
+        </w:rPr>
+        <w:t xml:space="preserve">[</w:t>
+      </w:r>
+      <w:del w:id="5072" w:author="Ewa Retajczyk" w:date="2026-10-20T15:09:42Z">
+        <w:r>
+          <w:rPr>
+            <w:highlight w:val="yellow"/>
+          </w:rPr>
+          <w:delText xml:space="preserve">…</w:delText>
+        </w:r>
+      </w:del>
+      <w:ins w:id="5073" w:author="Ewa Retajczyk" w:date="2026-10-20T15:10:45Z">
+        <w:r>
+          <w:rPr>
+            <w:highlight w:val="yellow"/>
+          </w:rPr>
+          <w:t xml:space="preserve">8</w:t>
+        </w:r>
+      </w:ins>
+      <w:r>
+        <w:rPr>
+          <w:highlight w:val="yellow"/>
+        </w:rPr>
+        <w:t xml:space="preserve">]</w:t>
+      </w:r>
+      <w:r>
+        <w:t xml:space="preserve"> godz.</w:t>
+      </w:r>
+      <w:del w:id="5074" w:author="Ewa Retajczyk" w:date="2026-10-20T15:10:58Z">
+        <w:r>
+          <w:delText xml:space="preserve">,</w:delText>
+        </w:r>
+      </w:del>
+      <w:ins w:id="5075" w:author="Ewa Retajczyk" w:date="2026-10-20T15:11:10Z">
+        <w:r>
+          <w:t xml:space="preserve"> w dni robocze od zgłoszenia;</w:t>
+        </w:r>
+      </w:ins>
+      <w:r>
+        <w:t xml:space="preserve"> czas reakcji serwisowej na miejscu </w:t>
+      </w:r>
+      <w:ins w:id="5076" w:author="Ewa Retajczyk" w:date="2026-10-20T15:11:34Z">
+        <w:r>
+          <w:t xml:space="preserve">– do </w:t>
+        </w:r>
+      </w:ins>
+      <w:r>
+        <w:rPr>
+          <w:highlight w:val="yellow"/>
+        </w:rPr>
+        <w:t xml:space="preserve">[</w:t>
+      </w:r>
+      <w:del w:id="5077" w:author="Ewa Retajczyk" w:date="2026-10-20T15:11:43Z">
+        <w:r>
+          <w:rPr>
+            <w:highlight w:val="yellow"/>
+          </w:rPr>
+          <w:delText xml:space="preserve">…</w:delText>
+        </w:r>
+      </w:del>
+      <w:ins w:id="5078" w:author="Ewa Retajczyk" w:date="2026-10-20T15:11:54Z">
+        <w:r>
+          <w:rPr>
+            <w:highlight w:val="yellow"/>
+          </w:rPr>
+          <w:t xml:space="preserve">48</w:t>
+        </w:r>
+      </w:ins>
+      <w:r>
+        <w:rPr>
+          <w:highlight w:val="yellow"/>
+        </w:rPr>
+        <w:t xml:space="preserve">]</w:t>
+      </w:r>
+      <w:r>
+        <w:t xml:space="preserve"> godz.</w:t>
+      </w:r>
+      <w:del w:id="5079" w:author="Ewa Retajczyk" w:date="2026-10-20T15:12:27Z">
+        <w:r>
+          <w:delText xml:space="preserve">,</w:delText>
+        </w:r>
+      </w:del>
+      <w:ins w:id="5080" w:author="Ewa Retajczyk" w:date="2026-10-20T15:12:32Z">
+        <w:r>
+          <w:t xml:space="preserve"> od zgłoszenia;</w:t>
+        </w:r>
+      </w:ins>
+      <w:r>
+        <w:t xml:space="preserve"> maksymalny czas usunięcia awarii </w:t>
+      </w:r>
+      <w:ins w:id="5081" w:author="Ewa Retajczyk" w:date="2026-10-20T15:12:44Z">
+        <w:r>
+          <w:t xml:space="preserve">– do </w:t>
+        </w:r>
+      </w:ins>
+      <w:r>
+        <w:rPr>
+          <w:highlight w:val="yellow"/>
+        </w:rPr>
+        <w:t xml:space="preserve">[</w:t>
+      </w:r>
+      <w:del w:id="5082" w:author="Ewa Retajczyk" w:date="2026-10-20T15:12:49Z">
+        <w:r>
+          <w:rPr>
+            <w:highlight w:val="yellow"/>
+          </w:rPr>
+          <w:delText xml:space="preserve">…</w:delText>
+        </w:r>
+      </w:del>
+      <w:ins w:id="5083" w:author="Ewa Retajczyk" w:date="2026-10-20T15:13:00Z">
+        <w:r>
+          <w:rPr>
+            <w:highlight w:val="yellow"/>
+          </w:rPr>
+          <w:t xml:space="preserve">5]</w:t>
+        </w:r>
+        <w:r>
+          <w:rPr/>
+          <w:t xml:space="preserve"> dni roboczych od zgłoszenia, a w przypadku awarii uniemożliwiającej działanie punktu ładowania – do </w:t>
+        </w:r>
+        <w:r>
+          <w:rPr>
+            <w:highlight w:val="yellow"/>
+          </w:rPr>
+          <w:t xml:space="preserve">[72</w:t>
+        </w:r>
+      </w:ins>
+      <w:r>
+        <w:rPr>
+          <w:highlight w:val="yellow"/>
+        </w:rPr>
+        <w:t xml:space="preserve">]</w:t>
+      </w:r>
+      <w:r>
+        <w:t xml:space="preserve"> godz.</w:t>
+      </w:r>
+      <w:del w:id="5084" w:author="Ewa Retajczyk" w:date="2026-10-20T15:13:28Z">
+        <w:r>
+          <w:delText xml:space="preserve">/dni,</w:delText>
+        </w:r>
+      </w:del>
+      <w:ins w:id="5085" w:author="Ewa Retajczyk" w:date="2026-10-20T15:13:35Z">
+        <w:r>
+          <w:t xml:space="preserve">;</w:t>
+        </w:r>
+      </w:ins>
+      <w:r>
+        <w:t xml:space="preserve"> dostępność części zamiennych przez okres co najmniej </w:t>
+      </w:r>
+      <w:r>
+        <w:rPr>
+          <w:highlight w:val="yellow"/>
+        </w:rPr>
+        <w:t xml:space="preserve">[</w:t>
+      </w:r>
+      <w:del w:id="5086" w:author="Ewa Retajczyk" w:date="2026-10-20T15:13:41Z">
+        <w:r>
+          <w:rPr>
+            <w:highlight w:val="yellow"/>
+          </w:rPr>
+          <w:delText xml:space="preserve">…</w:delText>
+        </w:r>
+      </w:del>
+      <w:ins w:id="5087" w:author="Ewa Retajczyk" w:date="2026-10-20T15:13:51Z">
+        <w:r>
+          <w:rPr>
+            <w:highlight w:val="yellow"/>
+          </w:rPr>
+          <w:t xml:space="preserve">10</w:t>
+        </w:r>
+      </w:ins>
+      <w:r>
+        <w:rPr>
+          <w:highlight w:val="yellow"/>
+        </w:rPr>
+        <w:t xml:space="preserve">]</w:t>
+      </w:r>
+      <w:r>
+        <w:t xml:space="preserve"> lat</w:t>
+      </w:r>
+      <w:del w:id="5088" w:author="Ewa Retajczyk" w:date="2026-10-20T15:14:13Z">
+        <w:r>
+          <w:delText xml:space="preserve">,</w:delText>
+        </w:r>
+      </w:del>
+      <w:ins w:id="5089" w:author="Ewa Retajczyk" w:date="2026-10-20T15:14:32Z">
+        <w:r>
+          <w:t xml:space="preserve"> od dnia podpisania protokołu UDT dopuszczającego do eksploatacji ostatnią Stację ładowania;</w:t>
+        </w:r>
+      </w:ins>
+      <w:r>
+        <w:t xml:space="preserve"> przeglądy okresowe zgodnie z zaleceniami producenta, </w:t>
+      </w:r>
+      <w:ins w:id="5090" w:author="Ewa Retajczyk" w:date="2026-10-20T15:14:40Z">
+        <w:r>
+          <w:t xml:space="preserve">nie rzadziej niż </w:t>
+        </w:r>
+        <w:r>
+          <w:rPr>
+            <w:highlight w:val="yellow"/>
+          </w:rPr>
+          <w:t xml:space="preserve">[raz w roku]</w:t>
+        </w:r>
+        <w:r>
+          <w:t xml:space="preserve">, w ramach wynagrodzenia; nieodpłatne </w:t>
+        </w:r>
+      </w:ins>
+      <w:r>
+        <w:t xml:space="preserve">aktualizacje oprogramowania </w:t>
+      </w:r>
+      <w:del w:id="5091" w:author="Ewa Retajczyk" w:date="2026-10-20T15:15:13Z">
+        <w:r>
+          <w:delText xml:space="preserve">i</w:delText>
+        </w:r>
+      </w:del>
+      <w:ins w:id="5092" w:author="Ewa Retajczyk" w:date="2026-10-20T15:15:45Z">
+        <w:r>
+          <w:t xml:space="preserve">w</w:t>
+        </w:r>
+      </w:ins>
+      <w:r>
+        <w:t xml:space="preserve"> </w:t>
+      </w:r>
+      <w:del w:id="5093" w:author="Ewa Retajczyk" w:date="2026-10-20T15:16:04Z">
+        <w:r>
+          <w:delText xml:space="preserve">warunki</w:delText>
+        </w:r>
+      </w:del>
+      <w:ins w:id="5094" w:author="Ewa Retajczyk" w:date="2026-10-20T15:16:25Z">
+        <w:r>
+          <w:t xml:space="preserve">okresie</w:t>
+        </w:r>
+      </w:ins>
+      <w:r>
+        <w:t xml:space="preserve"> </w:t>
+      </w:r>
+      <w:del w:id="5095" w:author="Ewa Retajczyk" w:date="2026-10-20T15:16:28Z">
+        <w:r>
+          <w:delText xml:space="preserve">utrzymania</w:delText>
+        </w:r>
+      </w:del>
+      <w:ins w:id="5096" w:author="Ewa Retajczyk" w:date="2026-10-20T15:17:11Z">
+        <w:r>
+          <w:t xml:space="preserve">gwarancji.</w:t>
+        </w:r>
+      </w:ins>
+      <w:r>
+        <w:t xml:space="preserve"> </w:t>
+      </w:r>
+      <w:del w:id="5097" w:author="Ewa Retajczyk" w:date="2026-10-20T15:17:13Z">
+        <w:r>
+          <w:delText xml:space="preserve">systemu po</w:delText>
+        </w:r>
+      </w:del>
+      <w:ins w:id="5098" w:author="Ewa Retajczyk" w:date="2026-10-20T15:17:18Z">
+        <w:r>
+          <w:t xml:space="preserve">Po</w:t>
+        </w:r>
+      </w:ins>
+      <w:r>
+        <w:t xml:space="preserve"> zakończeniu gwarancji</w:t>
+      </w:r>
+      <w:del w:id="5099" w:author="Ewa Retajczyk" w:date="2026-10-20T15:17:23Z">
+        <w:r>
+          <w:delText xml:space="preserve">.</w:delText>
+        </w:r>
+      </w:del>
+      <w:r>
+        <w:t xml:space="preserve"> </w:t>
+      </w:r>
+      <w:del w:id="5100" w:author="Ewa Retajczyk" w:date="2026-10-20T15:17:26Z">
+        <w:r>
+          <w:delText xml:space="preserve">W</w:delText>
+        </w:r>
+      </w:del>
+      <w:ins w:id="5101" w:author="Ewa Retajczyk" w:date="2026-10-20T15:17:34Z">
+        <w:r>
+          <w:t xml:space="preserve">Wykonawca</w:t>
+        </w:r>
+      </w:ins>
+      <w:r>
+        <w:t xml:space="preserve"> </w:t>
+      </w:r>
+      <w:del w:id="5102" w:author="Ewa Retajczyk" w:date="2026-10-20T15:17:40Z">
+        <w:r>
+          <w:delText xml:space="preserve">razie</w:delText>
+        </w:r>
+      </w:del>
+      <w:ins w:id="5103" w:author="Ewa Retajczyk" w:date="2026-10-20T15:17:49Z">
+        <w:r>
+          <w:t xml:space="preserve">przez</w:t>
+        </w:r>
+      </w:ins>
+      <w:r>
+        <w:t xml:space="preserve"> </w:t>
+      </w:r>
+      <w:del w:id="5104" w:author="Ewa Retajczyk" w:date="2026-10-20T15:18:49Z">
+        <w:r>
+          <w:delText xml:space="preserve">niezgodności</w:delText>
+        </w:r>
+      </w:del>
+      <w:ins w:id="5105" w:author="Ewa Retajczyk" w:date="2026-10-20T15:19:10Z">
+        <w:r>
+          <w:t xml:space="preserve">okres</w:t>
+        </w:r>
+      </w:ins>
+      <w:r>
+        <w:t xml:space="preserve"> </w:t>
+      </w:r>
+      <w:del w:id="5106" w:author="Ewa Retajczyk" w:date="2026-10-20T15:19:24Z">
+        <w:r>
+          <w:delText xml:space="preserve">z</w:delText>
+        </w:r>
+      </w:del>
+      <w:ins w:id="5107" w:author="Ewa Retajczyk" w:date="2026-10-20T15:19:31Z">
+        <w:r>
+          <w:t xml:space="preserve">co</w:t>
+        </w:r>
+      </w:ins>
+      <w:r>
+        <w:t xml:space="preserve"> </w:t>
+      </w:r>
+      <w:del w:id="5108" w:author="Ewa Retajczyk" w:date="2026-10-20T15:19:55Z">
+        <w:r>
+          <w:delText xml:space="preserve">Ofertą</w:delText>
+        </w:r>
+      </w:del>
+      <w:ins w:id="5109" w:author="Ewa Retajczyk" w:date="2026-10-20T15:20:02Z">
+        <w:r>
+          <w:t xml:space="preserve">najmniej</w:t>
+        </w:r>
+      </w:ins>
+      <w:r>
+        <w:t xml:space="preserve"> </w:t>
+      </w:r>
+      <w:del w:id="5110" w:author="Ewa Retajczyk" w:date="2026-10-20T15:20:03Z">
+        <w:r>
+          <w:delText xml:space="preserve">stosuje</w:delText>
+        </w:r>
+      </w:del>
+      <w:ins w:id="5111" w:author="Ewa Retajczyk" w:date="2026-10-20T15:20:24Z">
+        <w:r>
+          <w:rPr>
+            <w:highlight w:val="yellow"/>
+          </w:rPr>
+          <w:t xml:space="preserve">[5]</w:t>
+        </w:r>
+      </w:ins>
+      <w:r>
+        <w:t xml:space="preserve"> </w:t>
+      </w:r>
+      <w:del w:id="5112" w:author="Ewa Retajczyk" w:date="2026-10-20T15:20:51Z">
+        <w:r>
+          <w:delText xml:space="preserve">się</w:delText>
+        </w:r>
+      </w:del>
+      <w:ins w:id="5113" w:author="Ewa Retajczyk" w:date="2026-10-20T15:20:58Z">
+        <w:r>
+          <w:t xml:space="preserve">lat</w:t>
+        </w:r>
+      </w:ins>
+      <w:r>
+        <w:t xml:space="preserve"> </w:t>
+      </w:r>
+      <w:del w:id="5114" w:author="Ewa Retajczyk" w:date="2026-10-20T15:21:02Z">
+        <w:r>
+          <w:delText xml:space="preserve">wartości</w:delText>
+        </w:r>
+      </w:del>
+      <w:ins w:id="5115" w:author="Ewa Retajczyk" w:date="2026-10-20T15:21:53Z">
+        <w:r>
+          <w:t xml:space="preserve">zapewni</w:t>
+        </w:r>
+      </w:ins>
+      <w:r>
+        <w:t xml:space="preserve"> </w:t>
+      </w:r>
+      <w:del w:id="5116" w:author="Ewa Retajczyk" w:date="2026-10-20T15:22:42Z">
+        <w:r>
+          <w:delText xml:space="preserve">korzystniejsze</w:delText>
+        </w:r>
+      </w:del>
+      <w:ins w:id="5117" w:author="Ewa Retajczyk" w:date="2026-10-20T15:22:56Z">
+        <w:r>
+          <w:t xml:space="preserve">na</w:t>
+        </w:r>
+      </w:ins>
+      <w:r>
+        <w:t xml:space="preserve"> </w:t>
+      </w:r>
+      <w:del w:id="5118" w:author="Ewa Retajczyk" w:date="2026-10-20T15:23:02Z">
+        <w:r>
+          <w:delText xml:space="preserve">dla</w:delText>
+        </w:r>
+      </w:del>
+      <w:ins w:id="5119" w:author="Ewa Retajczyk" w:date="2026-10-20T15:23:49Z">
+        <w:r>
+          <w:t xml:space="preserve">żądanie</w:t>
+        </w:r>
+      </w:ins>
+      <w:r>
+        <w:t xml:space="preserve"> Zamawiającego</w:t>
+      </w:r>
+      <w:ins w:id="5120" w:author="Ewa Retajczyk" w:date="2026-10-20T15:24:29Z">
+        <w:r>
+          <w:t xml:space="preserve"> dostępność serwisu, części zamiennych i licencji na warunkach rynkowych</w:t>
+        </w:r>
+      </w:ins>
+      <w:r>
+        <w:t xml:space="preserve">.</w:t>
+      </w:r>
+    </w:p>
+    <w:p>
+      <w:pPr>
+        <w:spacing w:after="100" w:line="268" w:lineRule="auto"/>
+        <w:ind w:left="420" w:hanging="420"/>
+        <w:jc w:val="both"/>
+      </w:pPr>
+      <w:r>
+        <w:t xml:space="preserve">4. Zgłoszenia wad Zamawiający przekazuje e-mailem na adres </w:t>
+      </w:r>
+      <w:r>
+        <w:rPr>
+          <w:highlight w:val="yellow"/>
+        </w:rPr>
+        <w:t xml:space="preserve">[…]</w:t>
+      </w:r>
+      <w:r>
+        <w:t xml:space="preserve"> lub telefonicznie (</w:t>
+      </w:r>
+      <w:r>
+        <w:rPr>
+          <w:highlight w:val="yellow"/>
+        </w:rPr>
+        <w:t xml:space="preserve">[…]</w:t>
+      </w:r>
+      <w:r>
+        <w:t xml:space="preserve">). Wykonawca usuwa wady nieodpłatnie w terminach wskazanych w ust. 3; w przypadku awarii uniemożliwiającej działanie punktu ładowania usuwa ją w terminie </w:t>
+      </w:r>
+      <w:del w:id="5121" w:author="Ewa Retajczyk" w:date="2026-10-20T15:24:34Z">
+        <w:r>
+          <w:rPr>
+            <w:highlight w:val="yellow"/>
+          </w:rPr>
+          <w:delText xml:space="preserve">[…</w:delText>
+        </w:r>
+      </w:del>
+      <w:ins w:id="5122" w:author="Ewa Retajczyk" w:date="2026-10-20T15:24:39Z">
+        <w:r>
+          <w:t xml:space="preserve">określonym</w:t>
+        </w:r>
+      </w:ins>
+      <w:r>
+        <w:rPr>
+          <w:highlight w:val="yellow"/>
+        </w:rPr>
+        <w:t xml:space="preserve"> </w:t>
+      </w:r>
+      <w:del w:id="5123" w:author="Ewa Retajczyk" w:date="2026-10-20T15:24:48Z">
+        <w:r>
+          <w:rPr>
+            <w:highlight w:val="yellow"/>
+          </w:rPr>
+          <w:delText xml:space="preserve">godz</w:delText>
+        </w:r>
+      </w:del>
+      <w:ins w:id="5124" w:author="Ewa Retajczyk" w:date="2026-10-20T15:25:11Z">
+        <w:r>
+          <w:rPr/>
+          <w:t xml:space="preserve">w ust</w:t>
+        </w:r>
+      </w:ins>
+      <w:r>
+        <w:rPr>
+          <w:highlight w:val="yellow"/>
+        </w:rPr>
+        <w:t xml:space="preserve">.</w:t>
+      </w:r>
+      <w:del w:id="5125" w:author="Ewa Retajczyk" w:date="2026-10-20T15:25:45Z">
+        <w:r>
+          <w:rPr>
+            <w:highlight w:val="yellow"/>
+          </w:rPr>
+          <w:delText xml:space="preserve">]</w:delText>
+        </w:r>
+      </w:del>
+      <w:ins w:id="5126" w:author="Ewa Retajczyk" w:date="2026-10-20T15:25:55Z">
+        <w:r>
+          <w:rPr/>
+          <w:t xml:space="preserve"> 3</w:t>
+        </w:r>
+      </w:ins>
+      <w:r>
+        <w:t xml:space="preserve">, a gdy to niemożliwe – zapewnia rozwiązanie zastępcze. Koszty transportu, demontażu, montażu i testów ponosi Wykonawca.</w:t>
+      </w:r>
+    </w:p>
+    <w:p>
+      <w:pPr>
+        <w:spacing w:after="100" w:line="268" w:lineRule="auto"/>
+        <w:ind w:left="420" w:hanging="420"/>
+        <w:jc w:val="both"/>
+      </w:pPr>
+      <w:r>
+        <w:t>5. Okres gwarancji dla elementu, który był przedmiotem naprawy, ulega przedłużeniu o czas, w którym element nie mógł być używany. W razie trzykrotnej naprawy tej samej wady Wykonawca wymieni element na nowy, wolny od wad.</w:t>
+      </w:r>
+    </w:p>
+    <w:p>
+      <w:pPr>
+        <w:spacing w:after="100" w:line="268" w:lineRule="auto"/>
+        <w:ind w:left="420" w:hanging="420"/>
+        <w:jc w:val="both"/>
+      </w:pPr>
+      <w:r>
+        <w:t xml:space="preserve">6. Wykonawca nie odpowiada za wady powstałe wyłącznie wskutek niewłaściwej eksploatacji niezgodnej z instrukcją, uszkodzeń mechanicznych spowodowanych przez Zamawiającego lub osoby trzecie, ingerencji w urządzenia bez zgody Wykonawcy, siły wyższej lub błędów w dokumentacji i zakresie </w:t>
+      </w:r>
       <w:r>
         <w:lastRenderedPageBreak/>
-        <w:t xml:space="preserve">4. Zgłoszenia wad Zamawiający przekazuje e-mailem na adres </w:t>
-      </w:r>
-      <w:r>
-        <w:rPr>
-          <w:highlight w:val="yellow"/>
-        </w:rPr>
-        <w:t>[…]</w:t>
-      </w:r>
-      <w:r>
-        <w:t xml:space="preserve"> lub telefonicznie (</w:t>
-      </w:r>
-      <w:r>
-        <w:rPr>
-          <w:highlight w:val="yellow"/>
-        </w:rPr>
-        <w:t>[…]</w:t>
-      </w:r>
-      <w:r>
-        <w:t xml:space="preserve">). Wykonawca usuwa wady nieodpłatnie w terminach wskazanych w ust. 3; w przypadku awarii uniemożliwiającej działanie punktu ładowania usuwa ją w terminie </w:t>
-      </w:r>
-      <w:r>
-        <w:rPr>
-          <w:highlight w:val="yellow"/>
-        </w:rPr>
-        <w:t>[… godz.]</w:t>
-      </w:r>
-      <w:r>
-        <w:t>, a gdy to niemożliwe – zapewnia rozwiązanie zastępcze. Koszty transportu, demontażu, montażu i testów ponosi Wykonawca.</w:t>
-      </w:r>
-    </w:p>
-    <w:p>
-      <w:pPr>
-        <w:spacing w:after="100" w:line="268" w:lineRule="auto"/>
-        <w:ind w:left="420" w:hanging="420"/>
-        <w:jc w:val="both"/>
-      </w:pPr>
-      <w:r>
-        <w:t>5. Okres gwarancji dla elementu, który był przedmiotem naprawy, ulega przedłużeniu o czas, w którym element nie mógł być używany. W razie trzykrotnej naprawy tej samej wady Wykonawca wymieni element na nowy, wolny od wad.</w:t>
-      </w:r>
-    </w:p>
-    <w:p>
-      <w:pPr>
-        <w:spacing w:after="100" w:line="268" w:lineRule="auto"/>
-        <w:ind w:left="420" w:hanging="420"/>
-        <w:jc w:val="both"/>
-      </w:pPr>
-      <w:r>
-        <w:t>6. Wykonawca nie odpowiada za wady powstałe wyłącznie wskutek niewłaściwej eksploatacji niezgodnej z instrukcją, uszkodzeń mechanicznych spowodowanych przez Zamawiającego lub osoby trzecie, ingerencji w urządzenia bez zgody Wykonawcy, siły wyższej lub błędów w dokumentacji i zakresie wykonanym przez wykonawców Zamówień nr 2 i nr 3 (o ile zostały one zgłoszone przez Wykonawcę w trybie § 4 ust. 1 lit. e).</w:t>
+        <w:t>wykonanym przez wykonawców Zamówień nr 2 i nr 3 (o ile zostały one zgłoszone przez Wykonawcę w trybie § 4 ust. 1 lit. e).</w:t>
       </w:r>
     </w:p>
     <w:p>
@@ -2547,10 +2942,21 @@
         <w:rPr>
           <w:highlight w:val="yellow"/>
         </w:rPr>
-        <w:t>[0,2]</w:t>
-      </w:r>
-      <w:r>
-        <w:t>% wynagrodzenia brutto za każdy dzień zwłoki;</w:t>
+        <w:t>[0,</w:t>
+      </w:r>
+      <w:proofErr w:type="gramStart"/>
+      <w:r>
+        <w:rPr>
+          <w:highlight w:val="yellow"/>
+        </w:rPr>
+        <w:t>2]</w:t>
+      </w:r>
+      <w:r>
+        <w:t>%</w:t>
+      </w:r>
+      <w:proofErr w:type="gramEnd"/>
+      <w:r>
+        <w:t xml:space="preserve"> wynagrodzenia brutto za każdy dzień zwłoki;</w:t>
       </w:r>
     </w:p>
     <w:p>
@@ -2566,10 +2972,21 @@
         <w:rPr>
           <w:highlight w:val="yellow"/>
         </w:rPr>
-        <w:t>[0,2]</w:t>
-      </w:r>
-      <w:r>
-        <w:t>% wynagrodzenia brutto za każdy dzień zwłoki;</w:t>
+        <w:t>[0,</w:t>
+      </w:r>
+      <w:proofErr w:type="gramStart"/>
+      <w:r>
+        <w:rPr>
+          <w:highlight w:val="yellow"/>
+        </w:rPr>
+        <w:t>2]</w:t>
+      </w:r>
+      <w:r>
+        <w:t>%</w:t>
+      </w:r>
+      <w:proofErr w:type="gramEnd"/>
+      <w:r>
+        <w:t xml:space="preserve"> wynagrodzenia brutto za każdy dzień zwłoki;</w:t>
       </w:r>
     </w:p>
     <w:p>
@@ -2585,10 +3002,21 @@
         <w:rPr>
           <w:highlight w:val="yellow"/>
         </w:rPr>
-        <w:t>[0,1]</w:t>
-      </w:r>
-      <w:r>
-        <w:t>% wynagrodzenia brutto za każdy dzień zwłoki;</w:t>
+        <w:t>[0,</w:t>
+      </w:r>
+      <w:proofErr w:type="gramStart"/>
+      <w:r>
+        <w:rPr>
+          <w:highlight w:val="yellow"/>
+        </w:rPr>
+        <w:t>1]</w:t>
+      </w:r>
+      <w:r>
+        <w:t>%</w:t>
+      </w:r>
+      <w:proofErr w:type="gramEnd"/>
+      <w:r>
+        <w:t xml:space="preserve"> wynagrodzenia brutto za każdy dzień zwłoki;</w:t>
       </w:r>
     </w:p>
     <w:p>
@@ -2598,29 +3026,27 @@
         <w:jc w:val="both"/>
       </w:pPr>
       <w:r>
-        <w:t xml:space="preserve">d) za zwłokę w przekazaniu danych interfejsowych, harmonogramu lub dokumentów z Załącznika nr </w:t>
-      </w:r>
-      <w:del w:id="5077" w:author="Ewa Retajczyk" w:date="2026-10-20T14:26:33Z">
-        <w:r>
-          <w:delText xml:space="preserve">5</w:delText>
-        </w:r>
-      </w:del>
-      <w:ins w:id="5078" w:author="Ewa Retajczyk" w:date="2026-10-20T14:26:43Z">
-        <w:r>
-          <w:t xml:space="preserve">3</w:t>
-        </w:r>
-      </w:ins>
-      <w:r>
-        <w:t xml:space="preserve"> – </w:t>
-      </w:r>
-      <w:r>
-        <w:rPr>
-          <w:highlight w:val="yellow"/>
-        </w:rPr>
-        <w:t xml:space="preserve">[0,05]</w:t>
-      </w:r>
-      <w:r>
-        <w:t xml:space="preserve">% wynagrodzenia brutto za każdy dzień zwłoki;</w:t>
+        <w:t xml:space="preserve">d) za zwłokę w przekazaniu danych interfejsowych, harmonogramu lub dokumentów z Załącznika nr 3 – </w:t>
+      </w:r>
+      <w:r>
+        <w:rPr>
+          <w:highlight w:val="yellow"/>
+        </w:rPr>
+        <w:t>[0,</w:t>
+      </w:r>
+      <w:proofErr w:type="gramStart"/>
+      <w:r>
+        <w:rPr>
+          <w:highlight w:val="yellow"/>
+        </w:rPr>
+        <w:t>05]</w:t>
+      </w:r>
+      <w:r>
+        <w:t>%</w:t>
+      </w:r>
+      <w:proofErr w:type="gramEnd"/>
+      <w:r>
+        <w:t xml:space="preserve"> wynagrodzenia brutto za każdy dzień zwłoki;</w:t>
       </w:r>
     </w:p>
     <w:p>
@@ -2636,10 +3062,21 @@
         <w:rPr>
           <w:highlight w:val="yellow"/>
         </w:rPr>
-        <w:t>[15]</w:t>
-      </w:r>
-      <w:r>
-        <w:t>% wynagrodzenia brutto;</w:t>
+        <w:t>[</w:t>
+      </w:r>
+      <w:proofErr w:type="gramStart"/>
+      <w:r>
+        <w:rPr>
+          <w:highlight w:val="yellow"/>
+        </w:rPr>
+        <w:t>15]</w:t>
+      </w:r>
+      <w:r>
+        <w:t>%</w:t>
+      </w:r>
+      <w:proofErr w:type="gramEnd"/>
+      <w:r>
+        <w:t xml:space="preserve"> wynagrodzenia brutto;</w:t>
       </w:r>
     </w:p>
     <w:p>
@@ -2674,10 +3111,21 @@
         <w:rPr>
           <w:highlight w:val="yellow"/>
         </w:rPr>
-        <w:t>[30]</w:t>
-      </w:r>
-      <w:r>
-        <w:t>% wynagrodzenia brutto. Kary z różnych tytułów mogą się kumulować w ramach tego limitu.</w:t>
+        <w:t>[</w:t>
+      </w:r>
+      <w:proofErr w:type="gramStart"/>
+      <w:r>
+        <w:rPr>
+          <w:highlight w:val="yellow"/>
+        </w:rPr>
+        <w:t>30]</w:t>
+      </w:r>
+      <w:r>
+        <w:t>%</w:t>
+      </w:r>
+      <w:proofErr w:type="gramEnd"/>
+      <w:r>
+        <w:t xml:space="preserve"> wynagrodzenia brutto. Kary z różnych tytułów mogą się kumulować w ramach tego limitu.</w:t>
       </w:r>
     </w:p>
     <w:p>
@@ -2723,7 +3171,15 @@
         <w:jc w:val="both"/>
       </w:pPr>
       <w:r>
-        <w:t>1. Zamawiający może odstąpić od Umowy w terminie 30 dni od powzięcia wiadomości o podstawie odstąpienia, w szczególności jeżeli:</w:t>
+        <w:t xml:space="preserve">1. Zamawiający może odstąpić od Umowy w terminie 30 dni od powzięcia wiadomości o podstawie odstąpienia, w </w:t>
+      </w:r>
+      <w:proofErr w:type="gramStart"/>
+      <w:r>
+        <w:t>szczególności</w:t>
+      </w:r>
+      <w:proofErr w:type="gramEnd"/>
+      <w:r>
+        <w:t xml:space="preserve"> jeżeli:</w:t>
       </w:r>
     </w:p>
     <w:p>
@@ -2752,7 +3208,6 @@
         <w:jc w:val="both"/>
       </w:pPr>
       <w:r>
-        <w:lastRenderedPageBreak/>
         <w:t>b) Wykonawca wykonuje Umowę w sposób niezgodny z Umową lub Umową o dofinansowanie i nie usuwa naruszeń w terminie wyznaczonym przez Zamawiającego, nie krótszym niż 5 dni;</w:t>
       </w:r>
     </w:p>
@@ -2793,6 +3248,7 @@
         <w:jc w:val="both"/>
       </w:pPr>
       <w:r>
+        <w:lastRenderedPageBreak/>
         <w:t>2. Wykonawca może odstąpić od Umowy, jeżeli Zamawiający pomimo pisemnego wezwania i wyznaczenia dodatkowego terminu 14 dni nie zapłaci wymagalnego wynagrodzenia, albo uniemożliwia wykonanie Umowy i nie usuwa przeszkód w dodatkowym terminie 14 dni.</w:t>
       </w:r>
     </w:p>
@@ -2839,7 +3295,15 @@
         <w:jc w:val="both"/>
       </w:pPr>
       <w:r>
-        <w:t>1. Strona dotknięta działaniem siły wyższej (zdarzenia zewnętrznego, nieprzewidywalnego i niemożliwego do zapobieżenia mimo dochowania należytej staranności, np. wojna, klęska żywiołowa, epidemia z ograniczeniami ustawowymi) jest zobowiązana niezwłocznie, nie później niż w ciągu 3 dni, poinformować drugą Stronę na piśmie, wskazując przewidywany czas trwania przeszkody oraz jej wpływ na wykonanie Umowy.</w:t>
+        <w:t xml:space="preserve">1. Strona dotknięta działaniem siły wyższej (zdarzenia zewnętrznego, nieprzewidywalnego i niemożliwego do zapobieżenia mimo dochowania należytej staranności, np. wojna, klęska żywiołowa, epidemia z ograniczeniami ustawowymi) jest zobowiązana niezwłocznie, </w:t>
+      </w:r>
+      <w:proofErr w:type="gramStart"/>
+      <w:r>
+        <w:t>nie później</w:t>
+      </w:r>
+      <w:proofErr w:type="gramEnd"/>
+      <w:r>
+        <w:t xml:space="preserve"> niż w ciągu 3 dni, poinformować drugą Stronę na piśmie, wskazując przewidywany czas trwania przeszkody oraz jej wpływ na wykonanie Umowy.</w:t>
       </w:r>
     </w:p>
     <w:p>
@@ -2935,8 +3399,15 @@
         <w:jc w:val="both"/>
       </w:pPr>
       <w:r>
-        <w:lastRenderedPageBreak/>
-        <w:t>c) zmiany oferowanych urządzeń na urządzenia o parametrach nie gorszych (w szczególności w razie wycofania modelu z produkcji), bez zwiększenia wynagrodzenia, za uprzednią pisemną zgodą Zamawiającego, przy zachowaniu warunku z pkt 12 ppkt 2 Zapytania ofertowego;</w:t>
+        <w:t xml:space="preserve">c) zmiany oferowanych urządzeń na urządzenia o parametrach nie gorszych (w szczególności w razie wycofania modelu z produkcji), bez zwiększenia wynagrodzenia, za uprzednią pisemną zgodą Zamawiającego, przy zachowaniu warunku z pkt 12 </w:t>
+      </w:r>
+      <w:proofErr w:type="spellStart"/>
+      <w:r>
+        <w:t>ppkt</w:t>
+      </w:r>
+      <w:proofErr w:type="spellEnd"/>
+      <w:r>
+        <w:t xml:space="preserve"> 2 Zapytania ofertowego;</w:t>
       </w:r>
     </w:p>
     <w:p>
@@ -2982,6 +3453,7 @@
           <w:sz w:val="23"/>
           <w:szCs w:val="23"/>
         </w:rPr>
+        <w:lastRenderedPageBreak/>
         <w:t>§ 16. Poufność i dane osobowe</w:t>
       </w:r>
     </w:p>
@@ -3002,7 +3474,20 @@
         <w:jc w:val="both"/>
       </w:pPr>
       <w:r>
-        <w:t>2. W zakresie danych osobowych osób wskazanych do realizacji Umowy Strony działają jako odrębni administratorzy w rozumieniu RODO i wzajemnie udostępniają sobie dane reprezentantów, pracowników i współpracowników w zakresie niezbędnym do wykonania Umowy. Każda ze Stron wykona obowiązek informacyjny wobec swoich osób; informacja Zamawiającego stanowi Załącznik nr 6.</w:t>
+        <w:t xml:space="preserve">2. W zakresie danych osobowych osób wskazanych do realizacji Umowy Strony działają jako odrębni administratorzy w rozumieniu RODO i wzajemnie udostępniają sobie dane reprezentantów, pracowników i współpracowników w zakresie niezbędnym do wykonania Umowy. Każda ze Stron wykona obowiązek informacyjny wobec swoich osób; informacja Zamawiającego stanowi Załącznik nr </w:t>
+      </w:r>
+      <w:del w:id="5127" w:author="Ewa Retajczyk" w:date="2026-10-20T15:26:08Z">
+        <w:r>
+          <w:delText xml:space="preserve">6</w:delText>
+        </w:r>
+      </w:del>
+      <w:ins w:id="5128" w:author="Ewa Retajczyk" w:date="2026-10-20T15:26:15Z">
+        <w:r>
+          <w:t xml:space="preserve">4</w:t>
+        </w:r>
+      </w:ins>
+      <w:r>
+        <w:t xml:space="preserve">.</w:t>
       </w:r>
     </w:p>
     <w:p>
@@ -3163,7 +3648,6 @@
                 <w:sz w:val="20"/>
                 <w:szCs w:val="20"/>
               </w:rPr>
-              <w:lastRenderedPageBreak/>
               <w:t>Wykonawca</w:t>
             </w:r>
           </w:p>
@@ -3197,7 +3681,6 @@
                 <w:sz w:val="20"/>
                 <w:szCs w:val="20"/>
               </w:rPr>
-              <w:lastRenderedPageBreak/>
               <w:t>Zamawiający</w:t>
             </w:r>
           </w:p>
@@ -3214,7 +3697,6 @@
           <w:b/>
           <w:bCs/>
         </w:rPr>
-        <w:lastRenderedPageBreak/>
         <w:t>Załączniki:</w:t>
       </w:r>
     </w:p>
@@ -3223,43 +3705,76 @@
         <w:pStyle w:val="Akapitzlist"/>
         <w:numPr>
           <w:ilvl w:val="0"/>
-          <w:numId w:val="2"/>
+          <w:numId w:val="3"/>
         </w:numPr>
         <w:spacing w:after="40" w:line="268" w:lineRule="auto"/>
         <w:jc w:val="both"/>
       </w:pPr>
       <w:r>
-        <w:t>Oferta Wykonawcy (Formularz ofertowy i Specyfikacja).</w:t>
-      </w:r>
-    </w:p>
-    <w:p>
-      <w:pPr>
+        <w:t xml:space="preserve">Oferta Wykonawcy (Formularz ofertowy</w:t>
+      </w:r>
+      <w:ins w:id="5129" w:author="Ewa Retajczyk" w:date="2026-10-20T15:26:15Z">
+        <w:r>
+          <w:t xml:space="preserve">, Specyfikacja, oświadczenia</w:t>
+        </w:r>
+      </w:ins>
+      <w:r>
+        <w:t xml:space="preserve"> i </w:t>
+      </w:r>
+      <w:del w:id="5130" w:author="Ewa Retajczyk" w:date="2026-10-20T15:26:30Z">
+        <w:r>
+          <w:delText xml:space="preserve">Specyfikacja</w:delText>
+        </w:r>
+      </w:del>
+      <w:ins w:id="5131" w:author="Ewa Retajczyk" w:date="2026-10-20T15:26:31Z">
+        <w:r>
+          <w:t xml:space="preserve">pozostałe dokumenty złożone w ofercie</w:t>
+        </w:r>
+      </w:ins>
+      <w:r>
+        <w:t xml:space="preserve">).</w:t>
+      </w:r>
+    </w:p>
+    <w:p>
+      <w:pPr>
+        <w:pStyle w:val="Akapitzlist"/>
+        <w:numPr>
+          <w:ilvl w:val="0"/>
+          <w:numId w:val="3"/>
+        </w:numPr>
         <w:spacing w:after="40" w:line="268" w:lineRule="auto"/>
-        <w:ind w:left="420" w:hanging="420"/>
-        <w:jc w:val="both"/>
-      </w:pPr>
-      <w:r>
-        <w:t>2. Wzór protokołu odbioru,</w:t>
-      </w:r>
-    </w:p>
-    <w:p>
-      <w:pPr>
+        <w:jc w:val="both"/>
+      </w:pPr>
+      <w:r>
+        <w:t>Wzór protokołu odbioru,</w:t>
+      </w:r>
+    </w:p>
+    <w:p>
+      <w:pPr>
+        <w:pStyle w:val="Akapitzlist"/>
+        <w:numPr>
+          <w:ilvl w:val="0"/>
+          <w:numId w:val="3"/>
+        </w:numPr>
         <w:spacing w:after="40" w:line="268" w:lineRule="auto"/>
-        <w:ind w:left="420" w:hanging="420"/>
-        <w:jc w:val="both"/>
-      </w:pPr>
-      <w:r>
-        <w:t>3. Wykaz dokumentów przekazywanych przez Wykonawcę,</w:t>
-      </w:r>
-    </w:p>
-    <w:p>
-      <w:pPr>
+        <w:jc w:val="both"/>
+      </w:pPr>
+      <w:r>
+        <w:t>Wykaz dokumentów przekazywanych przez Wykonawcę,</w:t>
+      </w:r>
+    </w:p>
+    <w:p>
+      <w:pPr>
+        <w:pStyle w:val="Akapitzlist"/>
+        <w:numPr>
+          <w:ilvl w:val="0"/>
+          <w:numId w:val="3"/>
+        </w:numPr>
         <w:spacing w:after="40" w:line="268" w:lineRule="auto"/>
-        <w:ind w:left="420" w:hanging="420"/>
-        <w:jc w:val="both"/>
-      </w:pPr>
-      <w:r>
-        <w:t>4. Informacja o przetwarzaniu danych osobowych,</w:t>
+        <w:jc w:val="both"/>
+      </w:pPr>
+      <w:r>
+        <w:t>Informacja o przetwarzaniu danych osobowych,</w:t>
       </w:r>
     </w:p>
     <w:p>
@@ -3267,63 +3782,6 @@
         <w:spacing w:after="40" w:line="268" w:lineRule="auto"/>
         <w:jc w:val="both"/>
       </w:pPr>
-    </w:p>
-    <w:p>
-      <w:pPr>
-        <w:pageBreakBefore/>
-        <w:spacing w:after="100" w:line="268" w:lineRule="auto"/>
-        <w:jc w:val="right"/>
-        <w:rPr>
-          <w:ins w:id="5089" w:author="Ewa Retajczyk" w:date="2026-10-20T14:26:44Z"/>
-        </w:rPr>
-      </w:pPr>
-      <w:ins w:id="5090" w:author="Ewa Retajczyk" w:date="2026-10-20T14:27:12Z">
-        <w:r>
-          <w:rPr>
-            <w:b/>
-            <w:bCs/>
-            <w:i/>
-            <w:iCs/>
-            <w:sz w:val="20"/>
-            <w:szCs w:val="20"/>
-          </w:rPr>
-          <w:t xml:space="preserve">Załącznik nr 1 do Umowy nr [__/2026]</w:t>
-        </w:r>
-      </w:ins>
-    </w:p>
-    <w:p>
-      <w:pPr>
-        <w:spacing w:before="120" w:after="160" w:line="268" w:lineRule="auto"/>
-        <w:jc w:val="center"/>
-        <w:rPr>
-          <w:ins w:id="5091" w:author="Ewa Retajczyk" w:date="2026-10-20T14:27:48Z"/>
-        </w:rPr>
-      </w:pPr>
-      <w:ins w:id="5092" w:author="Ewa Retajczyk" w:date="2026-10-20T14:27:57Z">
-        <w:r>
-          <w:rPr>
-            <w:b/>
-            <w:bCs/>
-            <w:sz w:val="25"/>
-            <w:szCs w:val="25"/>
-          </w:rPr>
-          <w:t xml:space="preserve">Oferta Wykonawcy</w:t>
-        </w:r>
-      </w:ins>
-    </w:p>
-    <w:p>
-      <w:pPr>
-        <w:spacing w:after="100" w:line="268" w:lineRule="auto"/>
-        <w:jc w:val="both"/>
-        <w:rPr>
-          <w:ins w:id="5093" w:author="Ewa Retajczyk" w:date="2026-10-20T14:28:03Z"/>
-        </w:rPr>
-      </w:pPr>
-      <w:ins w:id="5094" w:author="Ewa Retajczyk" w:date="2026-10-20T14:29:10Z">
-        <w:r>
-          <w:t xml:space="preserve">Oferta Wykonawcy z dnia […… 2026 r.] w postępowaniu – Zapytanie ofertowe – Zamówienie nr 1, obejmująca: Formularz ofertowy (załącznik nr 1 do Zapytania ofertowego), Specyfikację (załącznik nr 2), Oświadczenie Wykonawcy (załącznik nr 3), Oświadczenie o braku powiązań (załącznik nr 4), dokumenty potwierdzające warunki udziału oraz pozostałe dokumenty złożone wraz z ofertą – do dołączenia w dniu zawarcia Umowy.</w:t>
-        </w:r>
-      </w:ins>
     </w:p>
     <w:p>
       <w:pPr>
@@ -3340,34 +3798,40 @@
           <w:sz w:val="20"/>
           <w:szCs w:val="20"/>
         </w:rPr>
-        <w:t xml:space="preserve">Załącznik nr </w:t>
-      </w:r>
-      <w:del w:id="5079" w:author="Ewa Retajczyk" w:date="2026-10-20T14:30:17Z">
-        <w:r>
-          <w:rPr>
-            <w:b/>
-            <w:bCs/>
-            <w:i/>
-            <w:iCs/>
-            <w:sz w:val="20"/>
-            <w:szCs w:val="20"/>
-          </w:rPr>
-          <w:delText xml:space="preserve">4</w:delText>
-        </w:r>
-      </w:del>
-      <w:ins w:id="5080" w:author="Ewa Retajczyk" w:date="2026-10-20T14:30:34Z">
-        <w:r>
-          <w:rPr>
-            <w:b/>
-            <w:bCs/>
-            <w:i/>
-            <w:iCs/>
-            <w:sz w:val="20"/>
-            <w:szCs w:val="20"/>
-          </w:rPr>
-          <w:t xml:space="preserve">2</w:t>
-        </w:r>
-      </w:ins>
+        <w:lastRenderedPageBreak/>
+        <w:t>Załącznik nr 1 do Umowy nr [__/2026]</w:t>
+      </w:r>
+    </w:p>
+    <w:p>
+      <w:pPr>
+        <w:spacing w:before="120" w:after="160" w:line="268" w:lineRule="auto"/>
+        <w:jc w:val="center"/>
+      </w:pPr>
+      <w:r>
+        <w:rPr>
+          <w:b/>
+          <w:bCs/>
+          <w:sz w:val="25"/>
+          <w:szCs w:val="25"/>
+        </w:rPr>
+        <w:t>Oferta Wykonawcy</w:t>
+      </w:r>
+    </w:p>
+    <w:p>
+      <w:pPr>
+        <w:spacing w:after="100" w:line="268" w:lineRule="auto"/>
+        <w:jc w:val="both"/>
+      </w:pPr>
+      <w:r>
+        <w:t>Oferta Wykonawcy z dnia […… 2026 r.] w postępowaniu – Zapytanie ofertowe – Zamówienie nr 1, obejmująca: Formularz ofertowy (załącznik nr 1 do Zapytania ofertowego), Specyfikację (załącznik nr 2), Oświadczenie Wykonawcy (załącznik nr 3), Oświadczenie o braku powiązań (załącznik nr 4), dokumenty potwierdzające warunki udziału oraz pozostałe dokumenty złożone wraz z ofertą – do dołączenia w dniu zawarcia Umowy.</w:t>
+      </w:r>
+    </w:p>
+    <w:p>
+      <w:pPr>
+        <w:pageBreakBefore/>
+        <w:spacing w:after="100" w:line="268" w:lineRule="auto"/>
+        <w:jc w:val="right"/>
+      </w:pPr>
       <w:r>
         <w:rPr>
           <w:b/>
@@ -3377,7 +3841,8 @@
           <w:sz w:val="20"/>
           <w:szCs w:val="20"/>
         </w:rPr>
-        <w:t xml:space="preserve"> do Umowy nr </w:t>
+        <w:lastRenderedPageBreak/>
+        <w:t xml:space="preserve">Załącznik nr 2 do Umowy nr </w:t>
       </w:r>
       <w:r>
         <w:rPr>
@@ -3387,7 +3852,7 @@
           <w:szCs w:val="20"/>
           <w:highlight w:val="yellow"/>
         </w:rPr>
-        <w:t xml:space="preserve">[__/2026]</w:t>
+        <w:t>[__/2026]</w:t>
       </w:r>
     </w:p>
     <w:p>
@@ -3418,7 +3883,23 @@
         <w:t>PROTOKÓŁ ODBIORU</w:t>
       </w:r>
       <w:r>
-        <w:t xml:space="preserve"> ☐ DOSTAWY  ☐ TECHNOLOGII (MONTAŻU, URUCHOMIENIA I TESTÓW)  ☐ KOŃCOWEGO</w:t>
+        <w:t xml:space="preserve"> ☐ </w:t>
+      </w:r>
+      <w:proofErr w:type="gramStart"/>
+      <w:r>
+        <w:t>DOSTAWY  ☐</w:t>
+      </w:r>
+      <w:proofErr w:type="gramEnd"/>
+      <w:r>
+        <w:t xml:space="preserve"> TECHNOLOGII (MONTAŻU, URUCHOMIENIA I </w:t>
+      </w:r>
+      <w:proofErr w:type="gramStart"/>
+      <w:r>
+        <w:t>TESTÓW)  ☐</w:t>
+      </w:r>
+      <w:proofErr w:type="gramEnd"/>
+      <w:r>
+        <w:t xml:space="preserve"> KOŃCOWEGO</w:t>
       </w:r>
     </w:p>
     <w:p>
@@ -3550,26 +4031,13 @@
         <w:jc w:val="both"/>
       </w:pPr>
       <w:r>
-        <w:t xml:space="preserve">2. Zakres sprawdzenia: ☐ kompletność i numery seryjne ☐ dokumentacja (wg Załącznika nr </w:t>
-      </w:r>
-      <w:del w:id="5085" w:author="Ewa Retajczyk" w:date="2026-10-20T14:30:43Z">
-        <w:r>
-          <w:delText xml:space="preserve">5</w:delText>
-        </w:r>
-      </w:del>
-      <w:ins w:id="5086" w:author="Ewa Retajczyk" w:date="2026-10-20T14:31:46Z">
-        <w:r>
-          <w:t xml:space="preserve">3</w:t>
-        </w:r>
-      </w:ins>
-      <w:r>
-        <w:t xml:space="preserve">) ☐ testy (bezpieczeństwo, wyłączenie awaryjne, ładowanie każdego punktu, komunikacja, OCPP, płatności, prezentacja ceny, przekazywanie danych, monitoring, praca równoczesna) ☐ dopuszczenie UDT (nr protokołu: </w:t>
-      </w:r>
-      <w:r>
-        <w:rPr>
-          <w:highlight w:val="yellow"/>
-        </w:rPr>
-        <w:t xml:space="preserve">[…]</w:t>
+        <w:t xml:space="preserve">2. Zakres sprawdzenia: ☐ kompletność i numery seryjne ☐ dokumentacja (wg Załącznika nr 3) ☐ testy (bezpieczeństwo, wyłączenie awaryjne, ładowanie każdego punktu, komunikacja, OCPP, płatności, prezentacja ceny, przekazywanie danych, monitoring, praca równoczesna) ☐ dopuszczenie UDT (nr protokołu: </w:t>
+      </w:r>
+      <w:r>
+        <w:rPr>
+          <w:highlight w:val="yellow"/>
+        </w:rPr>
+        <w:t>[…]</w:t>
       </w:r>
       <w:r>
         <w:t xml:space="preserve">) dla Stacji: </w:t>
@@ -3578,7 +4046,7 @@
         <w:rPr>
           <w:highlight w:val="yellow"/>
         </w:rPr>
-        <w:t xml:space="preserve">[…]</w:t>
+        <w:t>[…]</w:t>
       </w:r>
       <w:r>
         <w:t xml:space="preserve"> ☐ oznakowanie zgodnie z Instrukcją NFOŚiGW ☐ zdjęcia tabliczek znamionowych.</w:t>
@@ -3630,20 +4098,7 @@
         <w:jc w:val="both"/>
       </w:pPr>
       <w:r>
-        <w:t xml:space="preserve">4. Protokół odbioru końcowego stanowi podstawę płatności końcowej (</w:t>
-      </w:r>
-      <w:del w:id="5087" w:author="Ewa Retajczyk" w:date="2026-10-20T14:32:38Z">
-        <w:r>
-          <w:delText xml:space="preserve">5</w:delText>
-        </w:r>
-      </w:del>
-      <w:ins w:id="5088" w:author="Ewa Retajczyk" w:date="2026-10-20T14:32:46Z">
-        <w:r>
-          <w:t xml:space="preserve">3</w:t>
-        </w:r>
-      </w:ins>
-      <w:r>
-        <w:t xml:space="preserve">%) i potwierdzenie osiągnięcia efektu rzeczowego w zakresie Zamówienia nr 1.</w:t>
+        <w:t>4. Protokół odbioru końcowego stanowi podstawę płatności końcowej (3%) i potwierdzenie osiągnięcia efektu rzeczowego w zakresie Zamówienia nr 1.</w:t>
       </w:r>
     </w:p>
     <w:p>
@@ -3679,54 +4134,18 @@
           <w:sz w:val="20"/>
           <w:szCs w:val="20"/>
         </w:rPr>
-        <w:t xml:space="preserve">Załącznik nr </w:t>
-      </w:r>
-      <w:del w:id="5081" w:author="Ewa Retajczyk" w:date="2026-10-20T14:32:52Z">
-        <w:r>
-          <w:rPr>
-            <w:b/>
-            <w:bCs/>
-            <w:i/>
-            <w:iCs/>
-            <w:sz w:val="20"/>
-            <w:szCs w:val="20"/>
-          </w:rPr>
-          <w:delText xml:space="preserve">5</w:delText>
-        </w:r>
-      </w:del>
-      <w:ins w:id="5082" w:author="Ewa Retajczyk" w:date="2026-10-20T14:33:04Z">
-        <w:r>
-          <w:rPr>
-            <w:b/>
-            <w:bCs/>
-            <w:i/>
-            <w:iCs/>
-            <w:sz w:val="20"/>
-            <w:szCs w:val="20"/>
-          </w:rPr>
-          <w:t xml:space="preserve">3</w:t>
-        </w:r>
-      </w:ins>
-      <w:r>
-        <w:rPr>
-          <w:b/>
-          <w:bCs/>
+        <w:lastRenderedPageBreak/>
+        <w:t xml:space="preserve">Załącznik nr 3 do Umowy nr </w:t>
+      </w:r>
+      <w:r>
+        <w:rPr>
           <w:i/>
           <w:iCs/>
           <w:sz w:val="20"/>
           <w:szCs w:val="20"/>
-        </w:rPr>
-        <w:t xml:space="preserve"> do Umowy nr </w:t>
-      </w:r>
-      <w:r>
-        <w:rPr>
-          <w:i/>
-          <w:iCs/>
-          <w:sz w:val="20"/>
-          <w:szCs w:val="20"/>
-          <w:highlight w:val="yellow"/>
-        </w:rPr>
-        <w:t xml:space="preserve">[__/2026]</w:t>
+          <w:highlight w:val="yellow"/>
+        </w:rPr>
+        <w:t>[__/2026]</w:t>
       </w:r>
     </w:p>
     <w:p>
@@ -4117,7 +4536,23 @@
                 <w:sz w:val="20"/>
                 <w:szCs w:val="20"/>
               </w:rPr>
-              <w:t>Oświadczenie producenta o stanie fabrycznym i dacie produkcji (nie wcześniej niż 24 miesiące przed montażem) wraz z numerami seryjnymi</w:t>
+              <w:t>Oświadczenie producenta o stanie fabrycznym i dacie produkcji (</w:t>
+            </w:r>
+            <w:proofErr w:type="gramStart"/>
+            <w:r>
+              <w:rPr>
+                <w:sz w:val="20"/>
+                <w:szCs w:val="20"/>
+              </w:rPr>
+              <w:t>nie wcześniej</w:t>
+            </w:r>
+            <w:proofErr w:type="gramEnd"/>
+            <w:r>
+              <w:rPr>
+                <w:sz w:val="20"/>
+                <w:szCs w:val="20"/>
+              </w:rPr>
+              <w:t xml:space="preserve"> niż 24 miesiące przed montażem) wraz z numerami seryjnymi</w:t>
             </w:r>
           </w:p>
         </w:tc>
@@ -4333,8 +4768,76 @@
                 <w:sz w:val="20"/>
                 <w:szCs w:val="20"/>
               </w:rPr>
-              <w:t>w terminie przekazania danych interfejsowych</w:t>
+              <w:t xml:space="preserve">w terminie </w:t>
             </w:r>
+            <w:del w:id="5132" w:author="Ewa Retajczyk" w:date="2026-10-20T15:28:20Z">
+              <w:r>
+                <w:rPr>
+                  <w:sz w:val="20"/>
+                  <w:szCs w:val="20"/>
+                </w:rPr>
+                <w:delText xml:space="preserve">przekazania</w:delText>
+              </w:r>
+            </w:del>
+            <w:ins w:id="5133" w:author="Ewa Retajczyk" w:date="2026-10-20T15:28:25Z">
+              <w:r>
+                <w:rPr>
+                  <w:sz w:val="20"/>
+                  <w:szCs w:val="20"/>
+                </w:rPr>
+                <w:t xml:space="preserve">określonym</w:t>
+              </w:r>
+            </w:ins>
+            <w:r>
+              <w:rPr>
+                <w:sz w:val="20"/>
+                <w:szCs w:val="20"/>
+              </w:rPr>
+              <w:t xml:space="preserve"> </w:t>
+            </w:r>
+            <w:del w:id="5134" w:author="Ewa Retajczyk" w:date="2026-10-20T15:28:43Z">
+              <w:r>
+                <w:rPr>
+                  <w:sz w:val="20"/>
+                  <w:szCs w:val="20"/>
+                </w:rPr>
+                <w:delText xml:space="preserve">danych</w:delText>
+              </w:r>
+            </w:del>
+            <w:ins w:id="5135" w:author="Ewa Retajczyk" w:date="2026-10-20T15:29:17Z">
+              <w:r>
+                <w:rPr>
+                  <w:sz w:val="20"/>
+                  <w:szCs w:val="20"/>
+                </w:rPr>
+                <w:t xml:space="preserve">w</w:t>
+              </w:r>
+            </w:ins>
+            <w:r>
+              <w:rPr>
+                <w:sz w:val="20"/>
+                <w:szCs w:val="20"/>
+              </w:rPr>
+              <w:t xml:space="preserve"> </w:t>
+            </w:r>
+            <w:del w:id="5136" w:author="Ewa Retajczyk" w:date="2026-10-20T15:29:24Z">
+              <w:r>
+                <w:rPr>
+                  <w:sz w:val="20"/>
+                  <w:szCs w:val="20"/>
+                </w:rPr>
+                <w:delText xml:space="preserve">interfejsowych</w:delText>
+              </w:r>
+            </w:del>
+            <w:ins w:id="5137" w:author="Ewa Retajczyk" w:date="2026-10-20T15:29:47Z">
+              <w:r>
+                <w:rPr>
+                  <w:sz w:val="20"/>
+                  <w:szCs w:val="20"/>
+                </w:rPr>
+                <w:t xml:space="preserve">§ 4 ust. 1 lit. c Umowy</w:t>
+              </w:r>
+            </w:ins>
           </w:p>
         </w:tc>
       </w:tr>
@@ -5289,54 +5792,18 @@
           <w:sz w:val="20"/>
           <w:szCs w:val="20"/>
         </w:rPr>
-        <w:t xml:space="preserve">Załącznik nr </w:t>
-      </w:r>
-      <w:del w:id="5083" w:author="Ewa Retajczyk" w:date="2026-10-20T14:33:35Z">
-        <w:r>
-          <w:rPr>
-            <w:b/>
-            <w:bCs/>
-            <w:i/>
-            <w:iCs/>
-            <w:sz w:val="20"/>
-            <w:szCs w:val="20"/>
-          </w:rPr>
-          <w:delText xml:space="preserve">6</w:delText>
-        </w:r>
-      </w:del>
-      <w:ins w:id="5084" w:author="Ewa Retajczyk" w:date="2026-10-20T14:34:20Z">
-        <w:r>
-          <w:rPr>
-            <w:b/>
-            <w:bCs/>
-            <w:i/>
-            <w:iCs/>
-            <w:sz w:val="20"/>
-            <w:szCs w:val="20"/>
-          </w:rPr>
-          <w:t xml:space="preserve">4</w:t>
-        </w:r>
-      </w:ins>
-      <w:r>
-        <w:rPr>
-          <w:b/>
-          <w:bCs/>
+        <w:lastRenderedPageBreak/>
+        <w:t xml:space="preserve">Załącznik nr 4 do Umowy nr </w:t>
+      </w:r>
+      <w:r>
+        <w:rPr>
           <w:i/>
           <w:iCs/>
           <w:sz w:val="20"/>
           <w:szCs w:val="20"/>
-        </w:rPr>
-        <w:t xml:space="preserve"> do Umowy nr </w:t>
-      </w:r>
-      <w:r>
-        <w:rPr>
-          <w:i/>
-          <w:iCs/>
-          <w:sz w:val="20"/>
-          <w:szCs w:val="20"/>
-          <w:highlight w:val="yellow"/>
-        </w:rPr>
-        <w:t xml:space="preserve">[__/2026]</w:t>
+          <w:highlight w:val="yellow"/>
+        </w:rPr>
+        <w:t>[__/2026]</w:t>
       </w:r>
     </w:p>
     <w:p>
@@ -5548,127 +6015,13 @@
     </w:tbl>
     <w:p>
       <w:pPr>
-        <w:pageBreakBefore/>
-        <w:spacing w:after="100" w:line="268" w:lineRule="auto"/>
-        <w:jc w:val="right"/>
-        <w:rPr>
-          <w:del w:id="5099" w:author="Ewa Retajczyk" w:date="2026-10-20T14:34:33Z"/>
-        </w:rPr>
-      </w:pPr>
-      <w:del w:id="5095" w:author="Ewa Retajczyk" w:date="2026-10-20T14:34:51Z">
-        <w:r>
-          <w:rPr>
-            <w:b/>
-            <w:bCs/>
-            <w:i/>
-            <w:iCs/>
-            <w:sz w:val="20"/>
-            <w:szCs w:val="20"/>
-          </w:rPr>
-          <w:lastRenderedPageBreak/>
-          <w:delText xml:space="preserve">Załącznik nr </w:delText>
-        </w:r>
-      </w:del>
-      <w:del w:id="5096" w:author="Ewa Retajczyk" w:date="2026-10-20T14:35:00Z">
-        <w:r>
-          <w:rPr>
-            <w:b/>
-            <w:bCs/>
-            <w:i/>
-            <w:iCs/>
-            <w:sz w:val="20"/>
-            <w:szCs w:val="20"/>
-          </w:rPr>
-          <w:delText xml:space="preserve">1</w:delText>
-        </w:r>
-      </w:del>
-      <w:del w:id="5097" w:author="Ewa Retajczyk" w:date="2026-10-20T14:35:01Z">
-        <w:r>
-          <w:rPr>
-            <w:b/>
-            <w:bCs/>
-            <w:i/>
-            <w:iCs/>
-            <w:sz w:val="20"/>
-            <w:szCs w:val="20"/>
-          </w:rPr>
-          <w:delText xml:space="preserve"> do Umowy nr </w:delText>
-        </w:r>
-      </w:del>
-      <w:del w:id="5098" w:author="Ewa Retajczyk" w:date="2026-10-20T14:35:20Z">
-        <w:r>
-          <w:rPr>
-            <w:i/>
-            <w:iCs/>
-            <w:sz w:val="20"/>
-            <w:szCs w:val="20"/>
-            <w:highlight w:val="yellow"/>
-          </w:rPr>
-          <w:delText xml:space="preserve">[__/2026]</w:delText>
-        </w:r>
-      </w:del>
-    </w:p>
-    <w:p>
-      <w:pPr>
-        <w:spacing w:before="120" w:after="160" w:line="268" w:lineRule="auto"/>
-        <w:jc w:val="center"/>
-        <w:rPr>
-          <w:del w:id="5101" w:author="Ewa Retajczyk" w:date="2026-10-20T14:35:22Z"/>
-        </w:rPr>
-      </w:pPr>
-      <w:del w:id="5100" w:author="Ewa Retajczyk" w:date="2026-10-20T14:37:47Z">
-        <w:r>
-          <w:rPr>
-            <w:b/>
-            <w:bCs/>
-            <w:sz w:val="25"/>
-            <w:szCs w:val="25"/>
-          </w:rPr>
-          <w:delText xml:space="preserve">Oferta Wykonawcy</w:delText>
-        </w:r>
-      </w:del>
-    </w:p>
-    <w:p>
-      <w:pPr>
-        <w:spacing w:after="100" w:line="268" w:lineRule="auto"/>
-        <w:jc w:val="both"/>
-      </w:pPr>
-      <w:del w:id="5102" w:author="Ewa Retajczyk" w:date="2026-10-20T14:37:54Z">
-        <w:r>
-          <w:delText xml:space="preserve">Oferta Wykonawcy z dnia </w:delText>
-        </w:r>
-      </w:del>
-      <w:del w:id="5103" w:author="Ewa Retajczyk" w:date="2026-10-20T14:38:18Z">
-        <w:r>
-          <w:rPr>
-            <w:highlight w:val="yellow"/>
-          </w:rPr>
-          <w:delText xml:space="preserve">[…… 2026 r.]</w:delText>
-        </w:r>
-      </w:del>
-      <w:del w:id="5104" w:author="Ewa Retajczyk" w:date="2026-10-20T14:39:03Z">
-        <w:r>
-          <w:delText xml:space="preserve"> w postępowaniu – Zapytanie ofertowe – Zamówienie nr 1, obejmująca: Formularz ofertowy (załącznik nr 1 do Zapytania ofertowego), Specyfikację (załącznik nr 2), Oświadczenie Wykonawcy (załącznik nr 3), Oświadczenie o braku powiązań (załącznik nr 4), dokumenty potwierdzające warunki udziału oraz pozostałe dokumenty złożone wraz z ofertą – </w:delText>
-        </w:r>
-      </w:del>
-      <w:del w:id="5105" w:author="Ewa Retajczyk" w:date="2026-10-20T14:39:12Z">
-        <w:r>
-          <w:rPr>
-            <w:b/>
-            <w:bCs/>
-          </w:rPr>
-          <w:delText xml:space="preserve">do dołączenia w dniu zawarcia Umowy</w:delText>
-        </w:r>
-      </w:del>
-      <w:del w:id="5106" w:author="Ewa Retajczyk" w:date="2026-10-20T14:39:43Z">
-        <w:r>
-          <w:delText xml:space="preserve">.</w:delText>
-        </w:r>
-      </w:del>
+        <w:spacing w:after="100" w:line="268" w:lineRule="auto"/>
+        <w:jc w:val="both"/>
+      </w:pPr>
     </w:p>
     <w:sectPr>
-      <w:headerReference w:type="default" r:id="rId11"/>
-      <w:footerReference w:type="default" r:id="rId12"/>
+      <w:headerReference w:type="default" r:id="rId7"/>
+      <w:footerReference w:type="default" r:id="rId8"/>
       <w:pgSz w:w="11906" w:h="16838"/>
       <w:pgMar w:top="1134" w:right="1134" w:bottom="1134" w:left="1134" w:header="708" w:footer="708" w:gutter="0"/>
       <w:cols w:space="708"/>
@@ -5676,46 +6029,6 @@
     </w:sectPr>
   </w:body>
 </w:document>
-</file>
-
-<file path=word/comments.xml><?xml version="1.0" encoding="utf-8"?>
-<w:comments xmlns:wpc="http://schemas.microsoft.com/office/word/2010/wordprocessingCanvas" xmlns:cx="http://schemas.microsoft.com/office/drawing/2014/chartex" xmlns:cx1="http://schemas.microsoft.com/office/drawing/2015/9/8/chartex" xmlns:cx2="http://schemas.microsoft.com/office/drawing/2015/10/21/chartex" xmlns:cx3="http://schemas.microsoft.com/office/drawing/2016/5/9/chartex" xmlns:cx4="http://schemas.microsoft.com/office/drawing/2016/5/10/chartex" xmlns:cx5="http://schemas.microsoft.com/office/drawing/2016/5/11/chartex" xmlns:cx6="http://schemas.microsoft.com/office/drawing/2016/5/12/chartex" xmlns:cx7="http://schemas.microsoft.com/office/drawing/2016/5/13/chartex" xmlns:cx8="http://schemas.microsoft.com/office/drawing/2016/5/14/chartex" xmlns:mc="http://schemas.openxmlformats.org/markup-compatibility/2006" xmlns:m="http://schemas.openxmlformats.org/officeDocument/2006/math" xmlns:aink="http://schemas.microsoft.com/office/drawing/2016/ink" xmlns:am3d="http://schemas.microsoft.com/office/drawing/2017/model3d" xmlns:oel="http://schemas.microsoft.com/office/2019/extlst" xmlns:r="http://schemas.openxmlformats.org/officeDocument/2006/relationships" xmlns:wp14="http://schemas.microsoft.com/office/word/2010/wordprocessingDrawing" xmlns:wp="http://schemas.openxmlformats.org/drawingml/2006/wordprocessingDrawing" xmlns:wpg="http://schemas.microsoft.com/office/word/2010/wordprocessingGroup" xmlns:wpi="http://schemas.microsoft.com/office/word/2010/wordprocessingInk" xmlns:wps="http://schemas.microsoft.com/office/word/2010/wordprocessingShape" xmlns:o="urn:schemas-microsoft-com:office:office" xmlns:v="urn:schemas-microsoft-com:vml" xmlns:w10="urn:schemas-microsoft-com:office:word" xmlns:w="http://schemas.openxmlformats.org/wordprocessingml/2006/main" xmlns:w14="http://schemas.microsoft.com/office/word/2010/wordml" xmlns:w15="http://schemas.microsoft.com/office/word/2012/wordml" xmlns:w16cex="http://schemas.microsoft.com/office/word/2018/wordml/cex" xmlns:w16cid="http://schemas.microsoft.com/office/word/2016/wordml/cid" xmlns:w16="http://schemas.microsoft.com/office/word/2018/wordml" xmlns:w16sdtdh="http://schemas.microsoft.com/office/word/2020/wordml/sdtdatahash" xmlns:w16sdtfl="http://schemas.microsoft.com/office/word/2024/wordml/sdtformatlock" xmlns:w16se="http://schemas.microsoft.com/office/word/2015/wordml/symex" xmlns:w16du="http://schemas.microsoft.com/office/word/2023/wordml/word16du" xmlns:wne="http://schemas.microsoft.com/office/word/2006/wordml" mc:Ignorable="w14 w15 w16se w16cid w16 w16cex w16sdtdh w16sdtfl w16du wp14">
-  <w:comment w:id="0" w:author="Ewa Retajczyk" w:date="2026-10-20T18:09:00Z" w:initials="ER">
-    <w:p>
-      <w:r>
-        <w:rPr>
-          <w:rStyle w:val="Odwoaniedokomentarza"/>
-        </w:rPr>
-        <w:annotationRef/>
-      </w:r>
-      <w:r>
-        <w:rPr>
-          <w:sz w:val="20"/>
-          <w:szCs w:val="20"/>
-        </w:rPr>
-        <w:t>do zmiany numeracja</w:t>
-      </w:r>
-    </w:p>
-  </w:comment>
-</w:comments>
-</file>
-
-<file path=word/commentsExtended.xml><?xml version="1.0" encoding="utf-8"?>
-<w15:commentsEx xmlns:wpc="http://schemas.microsoft.com/office/word/2010/wordprocessingCanvas" xmlns:cx="http://schemas.microsoft.com/office/drawing/2014/chartex" xmlns:cx1="http://schemas.microsoft.com/office/drawing/2015/9/8/chartex" xmlns:cx2="http://schemas.microsoft.com/office/drawing/2015/10/21/chartex" xmlns:cx3="http://schemas.microsoft.com/office/drawing/2016/5/9/chartex" xmlns:cx4="http://schemas.microsoft.com/office/drawing/2016/5/10/chartex" xmlns:cx5="http://schemas.microsoft.com/office/drawing/2016/5/11/chartex" xmlns:cx6="http://schemas.microsoft.com/office/drawing/2016/5/12/chartex" xmlns:cx7="http://schemas.microsoft.com/office/drawing/2016/5/13/chartex" xmlns:cx8="http://schemas.microsoft.com/office/drawing/2016/5/14/chartex" xmlns:mc="http://schemas.openxmlformats.org/markup-compatibility/2006" xmlns:m="http://schemas.openxmlformats.org/officeDocument/2006/math" xmlns:aink="http://schemas.microsoft.com/office/drawing/2016/ink" xmlns:am3d="http://schemas.microsoft.com/office/drawing/2017/model3d" xmlns:oel="http://schemas.microsoft.com/office/2019/extlst" xmlns:r="http://schemas.openxmlformats.org/officeDocument/2006/relationships" xmlns:wp14="http://schemas.microsoft.com/office/word/2010/wordprocessingDrawing" xmlns:wp="http://schemas.openxmlformats.org/drawingml/2006/wordprocessingDrawing" xmlns:wpg="http://schemas.microsoft.com/office/word/2010/wordprocessingGroup" xmlns:wpi="http://schemas.microsoft.com/office/word/2010/wordprocessingInk" xmlns:wps="http://schemas.microsoft.com/office/word/2010/wordprocessingShape" xmlns:o="urn:schemas-microsoft-com:office:office" xmlns:v="urn:schemas-microsoft-com:vml" xmlns:w10="urn:schemas-microsoft-com:office:word" xmlns:w="http://schemas.openxmlformats.org/wordprocessingml/2006/main" xmlns:w14="http://schemas.microsoft.com/office/word/2010/wordml" xmlns:w15="http://schemas.microsoft.com/office/word/2012/wordml" xmlns:w16cex="http://schemas.microsoft.com/office/word/2018/wordml/cex" xmlns:w16cid="http://schemas.microsoft.com/office/word/2016/wordml/cid" xmlns:w16="http://schemas.microsoft.com/office/word/2018/wordml" xmlns:w16sdtdh="http://schemas.microsoft.com/office/word/2020/wordml/sdtdatahash" xmlns:w16sdtfl="http://schemas.microsoft.com/office/word/2024/wordml/sdtformatlock" xmlns:w16se="http://schemas.microsoft.com/office/word/2015/wordml/symex" xmlns:w16du="http://schemas.microsoft.com/office/word/2023/wordml/word16du" xmlns:wne="http://schemas.microsoft.com/office/word/2006/wordml" mc:Ignorable="w14 w15 w16se w16cid w16 w16cex w16sdtdh w16sdtfl w16du wp14">
-  <w15:commentEx w15:paraId="47092C9C" w15:done="0"/>
-</w15:commentsEx>
-</file>
-
-<file path=word/commentsExtensible.xml><?xml version="1.0" encoding="utf-8"?>
-<w16cex:commentsExtensible xmlns:wpc="http://schemas.microsoft.com/office/word/2010/wordprocessingCanvas" xmlns:cx="http://schemas.microsoft.com/office/drawing/2014/chartex" xmlns:cx1="http://schemas.microsoft.com/office/drawing/2015/9/8/chartex" xmlns:cx2="http://schemas.microsoft.com/office/drawing/2015/10/21/chartex" xmlns:cx3="http://schemas.microsoft.com/office/drawing/2016/5/9/chartex" xmlns:cx4="http://schemas.microsoft.com/office/drawing/2016/5/10/chartex" xmlns:cx5="http://schemas.microsoft.com/office/drawing/2016/5/11/chartex" xmlns:cx6="http://schemas.microsoft.com/office/drawing/2016/5/12/chartex" xmlns:cx7="http://schemas.microsoft.com/office/drawing/2016/5/13/chartex" xmlns:cx8="http://schemas.microsoft.com/office/drawing/2016/5/14/chartex" xmlns:cr="http://schemas.microsoft.com/office/comments/2020/reactions" xmlns:mc="http://schemas.openxmlformats.org/markup-compatibility/2006" xmlns:m="http://schemas.openxmlformats.org/officeDocument/2006/math" xmlns:aink="http://schemas.microsoft.com/office/drawing/2016/ink" xmlns:am3d="http://schemas.microsoft.com/office/drawing/2017/model3d" xmlns:oel="http://schemas.microsoft.com/office/2019/extlst" xmlns:r="http://schemas.openxmlformats.org/officeDocument/2006/relationships" xmlns:wp14="http://schemas.microsoft.com/office/word/2010/wordprocessingDrawing" xmlns:wp="http://schemas.openxmlformats.org/drawingml/2006/wordprocessingDrawing" xmlns:wpg="http://schemas.microsoft.com/office/word/2010/wordprocessingGroup" xmlns:wpi="http://schemas.microsoft.com/office/word/2010/wordprocessingInk" xmlns:wps="http://schemas.microsoft.com/office/word/2010/wordprocessingShape" xmlns:o="urn:schemas-microsoft-com:office:office" xmlns:v="urn:schemas-microsoft-com:vml" xmlns:w10="urn:schemas-microsoft-com:office:word" xmlns:w="http://schemas.openxmlformats.org/wordprocessingml/2006/main" xmlns:w14="http://schemas.microsoft.com/office/word/2010/wordml" xmlns:w15="http://schemas.microsoft.com/office/word/2012/wordml" xmlns:w16cex="http://schemas.microsoft.com/office/word/2018/wordml/cex" xmlns:w16cid="http://schemas.microsoft.com/office/word/2016/wordml/cid" xmlns:w16="http://schemas.microsoft.com/office/word/2018/wordml" xmlns:w16sdtdh="http://schemas.microsoft.com/office/word/2020/wordml/sdtdatahash" xmlns:w16sdtfl="http://schemas.microsoft.com/office/word/2024/wordml/sdtformatlock" xmlns:w16se="http://schemas.microsoft.com/office/word/2015/wordml/symex" xmlns:w16du="http://schemas.microsoft.com/office/word/2023/wordml/word16du" xmlns:wne="http://schemas.microsoft.com/office/word/2006/wordml" mc:Ignorable="w14 w15 w16se w16cid w16 w16cex w16sdtdh w16sdtfl cr w16du wp14">
-  <w16cex:commentExtensible w16cex:durableId="7E30BADC" w16cex:dateUtc="2026-10-20T16:09:00Z"/>
-</w16cex:commentsExtensible>
-</file>
-
-<file path=word/commentsIds.xml><?xml version="1.0" encoding="utf-8"?>
-<w16cid:commentsIds xmlns:wpc="http://schemas.microsoft.com/office/word/2010/wordprocessingCanvas" xmlns:cx="http://schemas.microsoft.com/office/drawing/2014/chartex" xmlns:cx1="http://schemas.microsoft.com/office/drawing/2015/9/8/chartex" xmlns:cx2="http://schemas.microsoft.com/office/drawing/2015/10/21/chartex" xmlns:cx3="http://schemas.microsoft.com/office/drawing/2016/5/9/chartex" xmlns:cx4="http://schemas.microsoft.com/office/drawing/2016/5/10/chartex" xmlns:cx5="http://schemas.microsoft.com/office/drawing/2016/5/11/chartex" xmlns:cx6="http://schemas.microsoft.com/office/drawing/2016/5/12/chartex" xmlns:cx7="http://schemas.microsoft.com/office/drawing/2016/5/13/chartex" xmlns:cx8="http://schemas.microsoft.com/office/drawing/2016/5/14/chartex" xmlns:mc="http://schemas.openxmlformats.org/markup-compatibility/2006" xmlns:m="http://schemas.openxmlformats.org/officeDocument/2006/math" xmlns:aink="http://schemas.microsoft.com/office/drawing/2016/ink" xmlns:am3d="http://schemas.microsoft.com/office/drawing/2017/model3d" xmlns:oel="http://schemas.microsoft.com/office/2019/extlst" xmlns:r="http://schemas.openxmlformats.org/officeDocument/2006/relationships" xmlns:wp14="http://schemas.microsoft.com/office/word/2010/wordprocessingDrawing" xmlns:wp="http://schemas.openxmlformats.org/drawingml/2006/wordprocessingDrawing" xmlns:wpg="http://schemas.microsoft.com/office/word/2010/wordprocessingGroup" xmlns:wpi="http://schemas.microsoft.com/office/word/2010/wordprocessingInk" xmlns:wps="http://schemas.microsoft.com/office/word/2010/wordprocessingShape" xmlns:o="urn:schemas-microsoft-com:office:office" xmlns:v="urn:schemas-microsoft-com:vml" xmlns:w10="urn:schemas-microsoft-com:office:word" xmlns:w="http://schemas.openxmlformats.org/wordprocessingml/2006/main" xmlns:w14="http://schemas.microsoft.com/office/word/2010/wordml" xmlns:w15="http://schemas.microsoft.com/office/word/2012/wordml" xmlns:w16cex="http://schemas.microsoft.com/office/word/2018/wordml/cex" xmlns:w16cid="http://schemas.microsoft.com/office/word/2016/wordml/cid" xmlns:w16="http://schemas.microsoft.com/office/word/2018/wordml" xmlns:w16sdtdh="http://schemas.microsoft.com/office/word/2020/wordml/sdtdatahash" xmlns:w16sdtfl="http://schemas.microsoft.com/office/word/2024/wordml/sdtformatlock" xmlns:w16se="http://schemas.microsoft.com/office/word/2015/wordml/symex" xmlns:w16du="http://schemas.microsoft.com/office/word/2023/wordml/word16du" xmlns:wne="http://schemas.microsoft.com/office/word/2006/wordml" mc:Ignorable="w14 w15 w16se w16cid w16 w16cex w16sdtdh w16sdtfl w16du wp14">
-  <w16cid:commentId w16cid:paraId="47092C9C" w16cid:durableId="7E30BADC"/>
-</w16cid:commentsIds>
 </file>
 
 <file path=word/endnotes.xml><?xml version="1.0" encoding="utf-8"?>
@@ -6084,6 +6397,92 @@
       </w:pPr>
     </w:lvl>
   </w:abstractNum>
+  <w:abstractNum w:abstractNumId="2" w15:restartNumberingAfterBreak="0">
+    <w:nsid w:val="593800F1"/>
+    <w:multiLevelType w:val="hybridMultilevel"/>
+    <w:tmpl w:val="874C0D72"/>
+    <w:lvl w:ilvl="0" w:tplc="0415000F">
+      <w:start w:val="1"/>
+      <w:numFmt w:val="decimal"/>
+      <w:lvlText w:val="%1."/>
+      <w:lvlJc w:val="left"/>
+      <w:pPr>
+        <w:ind w:left="720" w:hanging="360"/>
+      </w:pPr>
+    </w:lvl>
+    <w:lvl w:ilvl="1" w:tplc="04150019" w:tentative="1">
+      <w:start w:val="1"/>
+      <w:numFmt w:val="lowerLetter"/>
+      <w:lvlText w:val="%2."/>
+      <w:lvlJc w:val="left"/>
+      <w:pPr>
+        <w:ind w:left="1440" w:hanging="360"/>
+      </w:pPr>
+    </w:lvl>
+    <w:lvl w:ilvl="2" w:tplc="0415001B" w:tentative="1">
+      <w:start w:val="1"/>
+      <w:numFmt w:val="lowerRoman"/>
+      <w:lvlText w:val="%3."/>
+      <w:lvlJc w:val="right"/>
+      <w:pPr>
+        <w:ind w:left="2160" w:hanging="180"/>
+      </w:pPr>
+    </w:lvl>
+    <w:lvl w:ilvl="3" w:tplc="0415000F" w:tentative="1">
+      <w:start w:val="1"/>
+      <w:numFmt w:val="decimal"/>
+      <w:lvlText w:val="%4."/>
+      <w:lvlJc w:val="left"/>
+      <w:pPr>
+        <w:ind w:left="2880" w:hanging="360"/>
+      </w:pPr>
+    </w:lvl>
+    <w:lvl w:ilvl="4" w:tplc="04150019" w:tentative="1">
+      <w:start w:val="1"/>
+      <w:numFmt w:val="lowerLetter"/>
+      <w:lvlText w:val="%5."/>
+      <w:lvlJc w:val="left"/>
+      <w:pPr>
+        <w:ind w:left="3600" w:hanging="360"/>
+      </w:pPr>
+    </w:lvl>
+    <w:lvl w:ilvl="5" w:tplc="0415001B" w:tentative="1">
+      <w:start w:val="1"/>
+      <w:numFmt w:val="lowerRoman"/>
+      <w:lvlText w:val="%6."/>
+      <w:lvlJc w:val="right"/>
+      <w:pPr>
+        <w:ind w:left="4320" w:hanging="180"/>
+      </w:pPr>
+    </w:lvl>
+    <w:lvl w:ilvl="6" w:tplc="0415000F" w:tentative="1">
+      <w:start w:val="1"/>
+      <w:numFmt w:val="decimal"/>
+      <w:lvlText w:val="%7."/>
+      <w:lvlJc w:val="left"/>
+      <w:pPr>
+        <w:ind w:left="5040" w:hanging="360"/>
+      </w:pPr>
+    </w:lvl>
+    <w:lvl w:ilvl="7" w:tplc="04150019" w:tentative="1">
+      <w:start w:val="1"/>
+      <w:numFmt w:val="lowerLetter"/>
+      <w:lvlText w:val="%8."/>
+      <w:lvlJc w:val="left"/>
+      <w:pPr>
+        <w:ind w:left="5760" w:hanging="360"/>
+      </w:pPr>
+    </w:lvl>
+    <w:lvl w:ilvl="8" w:tplc="0415001B" w:tentative="1">
+      <w:start w:val="1"/>
+      <w:numFmt w:val="lowerRoman"/>
+      <w:lvlText w:val="%9."/>
+      <w:lvlJc w:val="right"/>
+      <w:pPr>
+        <w:ind w:left="6480" w:hanging="180"/>
+      </w:pPr>
+    </w:lvl>
+  </w:abstractNum>
   <w:num w:numId="1" w16cid:durableId="924798587">
     <w:abstractNumId w:val="0"/>
     <w:lvlOverride w:ilvl="0">
@@ -6093,15 +6492,10 @@
   <w:num w:numId="2" w16cid:durableId="1511260504">
     <w:abstractNumId w:val="1"/>
   </w:num>
+  <w:num w:numId="3" w16cid:durableId="1175535842">
+    <w:abstractNumId w:val="2"/>
+  </w:num>
 </w:numbering>
-</file>
-
-<file path=word/people.xml><?xml version="1.0" encoding="utf-8"?>
-<w15:people xmlns:wpc="http://schemas.microsoft.com/office/word/2010/wordprocessingCanvas" xmlns:cx="http://schemas.microsoft.com/office/drawing/2014/chartex" xmlns:cx1="http://schemas.microsoft.com/office/drawing/2015/9/8/chartex" xmlns:cx2="http://schemas.microsoft.com/office/drawing/2015/10/21/chartex" xmlns:cx3="http://schemas.microsoft.com/office/drawing/2016/5/9/chartex" xmlns:cx4="http://schemas.microsoft.com/office/drawing/2016/5/10/chartex" xmlns:cx5="http://schemas.microsoft.com/office/drawing/2016/5/11/chartex" xmlns:cx6="http://schemas.microsoft.com/office/drawing/2016/5/12/chartex" xmlns:cx7="http://schemas.microsoft.com/office/drawing/2016/5/13/chartex" xmlns:cx8="http://schemas.microsoft.com/office/drawing/2016/5/14/chartex" xmlns:mc="http://schemas.openxmlformats.org/markup-compatibility/2006" xmlns:m="http://schemas.openxmlformats.org/officeDocument/2006/math" xmlns:aink="http://schemas.microsoft.com/office/drawing/2016/ink" xmlns:am3d="http://schemas.microsoft.com/office/drawing/2017/model3d" xmlns:oel="http://schemas.microsoft.com/office/2019/extlst" xmlns:r="http://schemas.openxmlformats.org/officeDocument/2006/relationships" xmlns:wp14="http://schemas.microsoft.com/office/word/2010/wordprocessingDrawing" xmlns:wp="http://schemas.openxmlformats.org/drawingml/2006/wordprocessingDrawing" xmlns:wpg="http://schemas.microsoft.com/office/word/2010/wordprocessingGroup" xmlns:wpi="http://schemas.microsoft.com/office/word/2010/wordprocessingInk" xmlns:wps="http://schemas.microsoft.com/office/word/2010/wordprocessingShape" xmlns:o="urn:schemas-microsoft-com:office:office" xmlns:v="urn:schemas-microsoft-com:vml" xmlns:w10="urn:schemas-microsoft-com:office:word" xmlns:w="http://schemas.openxmlformats.org/wordprocessingml/2006/main" xmlns:w14="http://schemas.microsoft.com/office/word/2010/wordml" xmlns:w15="http://schemas.microsoft.com/office/word/2012/wordml" xmlns:w16cex="http://schemas.microsoft.com/office/word/2018/wordml/cex" xmlns:w16cid="http://schemas.microsoft.com/office/word/2016/wordml/cid" xmlns:w16="http://schemas.microsoft.com/office/word/2018/wordml" xmlns:w16sdtdh="http://schemas.microsoft.com/office/word/2020/wordml/sdtdatahash" xmlns:w16sdtfl="http://schemas.microsoft.com/office/word/2024/wordml/sdtformatlock" xmlns:w16se="http://schemas.microsoft.com/office/word/2015/wordml/symex" xmlns:w16du="http://schemas.microsoft.com/office/word/2023/wordml/word16du" xmlns:wne="http://schemas.microsoft.com/office/word/2006/wordml" mc:Ignorable="w14 w15 w16se w16cid w16 w16cex w16sdtdh w16sdtfl w16du wp14">
-  <w15:person w15:author="Ewa Retajczyk">
-    <w15:presenceInfo w15:providerId="Windows Live" w15:userId="2a851bb2ddc22126"/>
-  </w15:person>
-</w15:people>
 </file>
 
 <file path=word/styles.xml><?xml version="1.0" encoding="utf-8"?>
@@ -6809,6 +7203,13 @@
       <w:szCs w:val="20"/>
     </w:rPr>
   </w:style>
+  <w:style w:type="paragraph" w:styleId="Poprawka">
+    <w:name w:val="Revision"/>
+    <w:hidden/>
+    <w:uiPriority w:val="99"/>
+    <w:semiHidden/>
+    <w:rsid w:val="00DF2BA0"/>
+  </w:style>
 </w:styles>
 </file>
 

</xml_diff>